<commit_message>
Phase 3 report: two rounds of mentor review applied
Separates three claims by level: implementation, model, evaluation.
Decomposes loss into pruning cost and deletion cost, which reverses the
story on ChartQA where pruning costs twice what the deletion does.
Adds code provenance (commit 9682db0, file, class, line numbers), defines
the threshold as the interpolated half-baseline crossing, and scopes
claims that previously generalised from two models or one benchmark.
</commit_message>
<xml_diff>
--- a/BTP-Reproduction/phase3-mechanism/report/BTP_Phase3_Report.docx
+++ b/BTP-Reproduction/phase3-mechanism/report/BTP_Phase3_Report.docx
@@ -33,7 +33,7 @@
           <w:sz w:val="23"/>
           <w:szCs w:val="23"/>
         </w:rPr>
-        <w:t xml:space="preserve">A measured threshold in vision language models, and what visual token pruning gets wrong</w:t>
+        <w:t xml:space="preserve">A measured visual token access threshold in two vision language models, and what it means for pruning</w:t>
       </w:r>
     </w:p>
     <w:p>
@@ -144,7 +144,7 @@
           <w:sz w:val="24"/>
           <w:szCs w:val="24"/>
         </w:rPr>
-        <w:t xml:space="preserve">We set out to explain why that code destroys the model's ability to read text inside an image. The answer turned out to rest on a quantity nobody measures.</w:t>
+        <w:t xml:space="preserve">We set out to explain why that code destroys the model's ability to read text inside an image. The answer turned out to rest on a quantity that we did not find measured in the literature we reviewed for this report.</w:t>
       </w:r>
     </w:p>
     <w:p>
@@ -207,7 +207,7 @@
                 <w:sz w:val="26"/>
                 <w:szCs w:val="26"/>
               </w:rPr>
-              <w:t xml:space="preserve">Three findings</w:t>
+              <w:t xml:space="preserve">Three findings, at three levels</w:t>
             </w:r>
           </w:p>
           <w:p>
@@ -221,7 +221,7 @@
                 <w:sz w:val="22"/>
                 <w:szCs w:val="22"/>
               </w:rPr>
-              <w:t xml:space="preserve">1. There is a threshold. Both models we tested keep consulting image tokens until roughly three quarters of the way through the decoder, then release them abruptly. Delete the tokens before that depth and text reading collapses; delete them after and it costs nothing. The threshold is sharp and differs by architecture: 75 per cent of the way through InternVL2-2B, 84 per cent through Qwen2.5-VL.</w:t>
+              <w:t xml:space="preserve">1. A model-level finding. There is a threshold. In both models we tested, performance stays sensitive to visual tokens until roughly three quarters of the way through the decoder, and then abruptly stops being so. In the TextVQA setting we tested, deleting all remaining image tokens before that depth caused a sharp collapse, while deletion after it had a much smaller effect. The threshold is sharp and differs by architecture: InternVL2-2B needs the image through 75 per cent of its decoder, Qwen2.5-VL through 80 per cent.</w:t>
             </w:r>
           </w:p>
           <w:p>
@@ -235,7 +235,7 @@
                 <w:sz w:val="22"/>
                 <w:szCs w:val="22"/>
               </w:rPr>
-              <w:t xml:space="preserve">2. The released code sits one layer on the wrong side of it. BTP deletes at layer 23 of Qwen's 28. Layer 23 retains 27 per cent of baseline reading accuracy; layer 24 retains 75 per cent. One layer is worth 47.7 points.</w:t>
+              <w:t xml:space="preserve">2. An implementation-level finding. The released code sits one layer on the wrong side of it. BTP allows Qwen 22 layers of access against a threshold of 22.5. Twenty-two layers retains 27 per cent of baseline reading accuracy; twenty-three retains 75 per cent. One layer is worth 47.7 points.</w:t>
             </w:r>
           </w:p>
           <w:p>
@@ -249,7 +249,21 @@
                 <w:sz w:val="22"/>
                 <w:szCs w:val="22"/>
               </w:rPr>
-              <w:t xml:space="preserve">3. Nobody would notice. With the fault present, the code still scores 96.1 per cent of baseline on the paper's own benchmark suite, inside the 96 to 98 per cent it claims. None of those six benchmarks asks the model to read.</w:t>
+              <w:t xml:space="preserve">3. An evaluation-level finding. With the fault present, the code still scores 96.1 per cent of baseline across five of the six benchmarks the paper reports, inside the 96 to 98 per cent it claims. Not one of those six asks the model to read text from an image.</w:t>
+            </w:r>
+          </w:p>
+          <w:p>
+            <w:pPr>
+              <w:spacing w:after="55" w:line="258"/>
+              <w:jc w:val="both"/>
+            </w:pPr>
+            <w:r>
+              <w:rPr>
+                <w:rFonts w:ascii="Times New Roman" w:cs="Times New Roman" w:eastAsia="Times New Roman" w:hAnsi="Times New Roman"/>
+                <w:sz w:val="22"/>
+                <w:szCs w:val="22"/>
+              </w:rPr>
+              <w:t xml:space="preserve">The two effects are separable and we keep them apart throughout. On TextVQA and DocVQA the deletion accounts for most of the loss. On ChartQA it does not: there the pruning itself costs twice what the deletion does, so the fault is not the main story on every benchmark.</w:t>
             </w:r>
           </w:p>
         </w:tc>
@@ -351,7 +365,7 @@
       <w:r>
         <w:drawing>
           <wp:inline distT="0" distB="0" distL="0" distR="0">
-            <wp:extent cx="4095750" cy="2266950"/>
+            <wp:extent cx="3714750" cy="2057400"/>
             <wp:effectExtent t="0" r="0" b="0" l="0"/>
             <wp:docPr id="1" name="" descr="" title=""/>
             <wp:cNvGraphicFramePr>
@@ -376,7 +390,7 @@
                   <pic:spPr bwMode="auto">
                     <a:xfrm>
                       <a:off x="0" y="0"/>
-                      <a:ext cx="4095750" cy="2266950"/>
+                      <a:ext cx="3714750" cy="2057400"/>
                     </a:xfrm>
                     <a:prstGeom prst="rect">
                       <a:avLst/>
@@ -434,7 +448,7 @@
           <w:sz w:val="24"/>
           <w:szCs w:val="24"/>
         </w:rPr>
-        <w:t xml:space="preserve">We listed the candidate causes first and built a test capable of killing each, so that no explanation survived merely because nobody had checked it. Four experiments returned negative before the real cause appeared.</w:t>
+        <w:t xml:space="preserve">We listed the candidate causes first and built a test capable of killing each. Four returned negative before the real cause appeared.</w:t>
       </w:r>
     </w:p>
     <w:tbl>
@@ -452,9 +466,9 @@
         <w:tblLayout w:type="fixed"/>
       </w:tblPr>
       <w:tblGrid>
-        <w:gridCol w:w="3736"/>
-        <w:gridCol w:w="3736"/>
-        <w:gridCol w:w="1744"/>
+        <w:gridCol w:w="3985"/>
+        <w:gridCol w:w="3612"/>
+        <w:gridCol w:w="1619"/>
       </w:tblGrid>
       <w:tr>
         <w:trPr>
@@ -463,7 +477,7 @@
         </w:trPr>
         <w:tc>
           <w:tcPr>
-            <w:tcW w:type="dxa" w:w="3736"/>
+            <w:tcW w:type="dxa" w:w="3985"/>
             <w:tcBorders>
               <w:top w:val="single" w:color="000000" w:sz="6"/>
               <w:left w:val="single" w:color="000000" w:sz="6"/>
@@ -493,13 +507,13 @@
                 <w:sz w:val="21"/>
                 <w:szCs w:val="21"/>
               </w:rPr>
-              <w:t xml:space="preserve">What we tested</w:t>
-            </w:r>
-          </w:p>
-        </w:tc>
-        <w:tc>
-          <w:tcPr>
-            <w:tcW w:type="dxa" w:w="3736"/>
+              <w:t xml:space="preserve">Hypothesis tested</w:t>
+            </w:r>
+          </w:p>
+        </w:tc>
+        <w:tc>
+          <w:tcPr>
+            <w:tcW w:type="dxa" w:w="3612"/>
             <w:tcBorders>
               <w:top w:val="single" w:color="000000" w:sz="6"/>
               <w:left w:val="single" w:color="000000" w:sz="6"/>
@@ -529,13 +543,13 @@
                 <w:sz w:val="21"/>
                 <w:szCs w:val="21"/>
               </w:rPr>
-              <w:t xml:space="preserve">What we found</w:t>
-            </w:r>
-          </w:p>
-        </w:tc>
-        <w:tc>
-          <w:tcPr>
-            <w:tcW w:type="dxa" w:w="1744"/>
+              <w:t xml:space="preserve">Observation</w:t>
+            </w:r>
+          </w:p>
+        </w:tc>
+        <w:tc>
+          <w:tcPr>
+            <w:tcW w:type="dxa" w:w="1619"/>
             <w:tcBorders>
               <w:top w:val="single" w:color="000000" w:sz="6"/>
               <w:left w:val="single" w:color="000000" w:sz="6"/>
@@ -565,7 +579,7 @@
                 <w:sz w:val="21"/>
                 <w:szCs w:val="21"/>
               </w:rPr>
-              <w:t xml:space="preserve">Verdict</w:t>
+              <w:t xml:space="preserve">Interpretation</w:t>
             </w:r>
           </w:p>
         </w:tc>
@@ -576,7 +590,7 @@
         </w:trPr>
         <w:tc>
           <w:tcPr>
-            <w:tcW w:type="dxa" w:w="3736"/>
+            <w:tcW w:type="dxa" w:w="3985"/>
             <w:tcBorders>
               <w:top w:val="single" w:color="000000" w:sz="6"/>
               <w:left w:val="single" w:color="000000" w:sz="6"/>
@@ -603,46 +617,46 @@
                 <w:sz w:val="21"/>
                 <w:szCs w:val="21"/>
               </w:rPr>
-              <w:t xml:space="preserve">Is the selection rule at fault? Ablated it at a fixed budget: BTP, diversity only, attention only, random</w:t>
-            </w:r>
-          </w:p>
-        </w:tc>
-        <w:tc>
-          <w:tcPr>
-            <w:tcW w:type="dxa" w:w="3736"/>
-            <w:tcBorders>
-              <w:top w:val="single" w:color="000000" w:sz="6"/>
-              <w:left w:val="single" w:color="000000" w:sz="6"/>
-              <w:bottom w:val="single" w:color="000000" w:sz="6"/>
-              <w:right w:val="single" w:color="000000" w:sz="6"/>
-            </w:tcBorders>
-            <w:tcMar>
-              <w:top w:type="dxa" w:w="70"/>
-              <w:left w:type="dxa" w:w="100"/>
-              <w:bottom w:type="dxa" w:w="70"/>
-              <w:right w:type="dxa" w:w="100"/>
-            </w:tcMar>
-            <w:vAlign w:val="center"/>
-          </w:tcPr>
-          <w:p>
-            <w:pPr>
-              <w:spacing w:after="0" w:line="240"/>
-              <w:jc w:val="center"/>
-            </w:pPr>
-            <w:r>
-              <w:rPr>
-                <w:rFonts w:ascii="Times New Roman" w:cs="Times New Roman" w:eastAsia="Times New Roman" w:hAnsi="Times New Roman"/>
-                <w:color w:val="000000"/>
-                <w:sz w:val="21"/>
-                <w:szCs w:val="21"/>
-              </w:rPr>
-              <w:t xml:space="preserve">All four scored 17.3 to 19.4, inside the error bars. Random did as well as BTP</w:t>
-            </w:r>
-          </w:p>
-        </w:tc>
-        <w:tc>
-          <w:tcPr>
-            <w:tcW w:type="dxa" w:w="1744"/>
+              <w:t xml:space="preserve">Selection rule, ablated at a fixed budget: BTP, diversity, attention, random</w:t>
+            </w:r>
+          </w:p>
+        </w:tc>
+        <w:tc>
+          <w:tcPr>
+            <w:tcW w:type="dxa" w:w="3612"/>
+            <w:tcBorders>
+              <w:top w:val="single" w:color="000000" w:sz="6"/>
+              <w:left w:val="single" w:color="000000" w:sz="6"/>
+              <w:bottom w:val="single" w:color="000000" w:sz="6"/>
+              <w:right w:val="single" w:color="000000" w:sz="6"/>
+            </w:tcBorders>
+            <w:tcMar>
+              <w:top w:type="dxa" w:w="70"/>
+              <w:left w:type="dxa" w:w="100"/>
+              <w:bottom w:type="dxa" w:w="70"/>
+              <w:right w:type="dxa" w:w="100"/>
+            </w:tcMar>
+            <w:vAlign w:val="center"/>
+          </w:tcPr>
+          <w:p>
+            <w:pPr>
+              <w:spacing w:after="0" w:line="240"/>
+              <w:jc w:val="center"/>
+            </w:pPr>
+            <w:r>
+              <w:rPr>
+                <w:rFonts w:ascii="Times New Roman" w:cs="Times New Roman" w:eastAsia="Times New Roman" w:hAnsi="Times New Roman"/>
+                <w:color w:val="000000"/>
+                <w:sz w:val="21"/>
+                <w:szCs w:val="21"/>
+              </w:rPr>
+              <w:t xml:space="preserve">All four 17.3 to 19.4, inside the error bars</w:t>
+            </w:r>
+          </w:p>
+        </w:tc>
+        <w:tc>
+          <w:tcPr>
+            <w:tcW w:type="dxa" w:w="1619"/>
             <w:tcBorders>
               <w:top w:val="single" w:color="000000" w:sz="6"/>
               <w:left w:val="single" w:color="000000" w:sz="6"/>
@@ -680,7 +694,7 @@
         </w:trPr>
         <w:tc>
           <w:tcPr>
-            <w:tcW w:type="dxa" w:w="3736"/>
+            <w:tcW w:type="dxa" w:w="3985"/>
             <w:tcBorders>
               <w:top w:val="single" w:color="000000" w:sz="6"/>
               <w:left w:val="single" w:color="000000" w:sz="6"/>
@@ -707,73 +721,73 @@
                 <w:sz w:val="21"/>
                 <w:szCs w:val="21"/>
               </w:rPr>
-              <w:t xml:space="preserve">Are text patches near-duplicates in feature space, as we had assumed?</w:t>
-            </w:r>
-          </w:p>
-        </w:tc>
-        <w:tc>
-          <w:tcPr>
-            <w:tcW w:type="dxa" w:w="3736"/>
-            <w:tcBorders>
-              <w:top w:val="single" w:color="000000" w:sz="6"/>
-              <w:left w:val="single" w:color="000000" w:sz="6"/>
-              <w:bottom w:val="single" w:color="000000" w:sz="6"/>
-              <w:right w:val="single" w:color="000000" w:sz="6"/>
-            </w:tcBorders>
-            <w:tcMar>
-              <w:top w:type="dxa" w:w="70"/>
-              <w:left w:type="dxa" w:w="100"/>
-              <w:bottom w:type="dxa" w:w="70"/>
-              <w:right w:type="dxa" w:w="100"/>
-            </w:tcMar>
-            <w:vAlign w:val="center"/>
-          </w:tcPr>
-          <w:p>
-            <w:pPr>
-              <w:spacing w:after="0" w:line="240"/>
-              <w:jc w:val="center"/>
-            </w:pPr>
-            <w:r>
-              <w:rPr>
-                <w:rFonts w:ascii="Times New Roman" w:cs="Times New Roman" w:eastAsia="Times New Roman" w:hAnsi="Times New Roman"/>
-                <w:color w:val="000000"/>
-                <w:sz w:val="21"/>
-                <w:szCs w:val="21"/>
-              </w:rPr>
-              <w:t xml:space="preserve">Text-to-text similarity 0.379, background-to-background 0.438. Text is the more varied region</w:t>
-            </w:r>
-          </w:p>
-        </w:tc>
-        <w:tc>
-          <w:tcPr>
-            <w:tcW w:type="dxa" w:w="1744"/>
-            <w:tcBorders>
-              <w:top w:val="single" w:color="000000" w:sz="6"/>
-              <w:left w:val="single" w:color="000000" w:sz="6"/>
-              <w:bottom w:val="single" w:color="000000" w:sz="6"/>
-              <w:right w:val="single" w:color="000000" w:sz="6"/>
-            </w:tcBorders>
-            <w:tcMar>
-              <w:top w:type="dxa" w:w="70"/>
-              <w:left w:type="dxa" w:w="100"/>
-              <w:bottom w:type="dxa" w:w="70"/>
-              <w:right w:type="dxa" w:w="100"/>
-            </w:tcMar>
-            <w:vAlign w:val="center"/>
-          </w:tcPr>
-          <w:p>
-            <w:pPr>
-              <w:spacing w:after="0" w:line="240"/>
-              <w:jc w:val="center"/>
-            </w:pPr>
-            <w:r>
-              <w:rPr>
-                <w:rFonts w:ascii="Times New Roman" w:cs="Times New Roman" w:eastAsia="Times New Roman" w:hAnsi="Times New Roman"/>
-                <w:color w:val="000000"/>
-                <w:sz w:val="21"/>
-                <w:szCs w:val="21"/>
-              </w:rPr>
-              <w:t xml:space="preserve">Our own premise was wrong</w:t>
+              <w:t xml:space="preserve">Are text patches near-duplicates in feature space?</w:t>
+            </w:r>
+          </w:p>
+        </w:tc>
+        <w:tc>
+          <w:tcPr>
+            <w:tcW w:type="dxa" w:w="3612"/>
+            <w:tcBorders>
+              <w:top w:val="single" w:color="000000" w:sz="6"/>
+              <w:left w:val="single" w:color="000000" w:sz="6"/>
+              <w:bottom w:val="single" w:color="000000" w:sz="6"/>
+              <w:right w:val="single" w:color="000000" w:sz="6"/>
+            </w:tcBorders>
+            <w:tcMar>
+              <w:top w:type="dxa" w:w="70"/>
+              <w:left w:type="dxa" w:w="100"/>
+              <w:bottom w:type="dxa" w:w="70"/>
+              <w:right w:type="dxa" w:w="100"/>
+            </w:tcMar>
+            <w:vAlign w:val="center"/>
+          </w:tcPr>
+          <w:p>
+            <w:pPr>
+              <w:spacing w:after="0" w:line="240"/>
+              <w:jc w:val="center"/>
+            </w:pPr>
+            <w:r>
+              <w:rPr>
+                <w:rFonts w:ascii="Times New Roman" w:cs="Times New Roman" w:eastAsia="Times New Roman" w:hAnsi="Times New Roman"/>
+                <w:color w:val="000000"/>
+                <w:sz w:val="21"/>
+                <w:szCs w:val="21"/>
+              </w:rPr>
+              <w:t xml:space="preserve">Text-text 0.379, background-background 0.438</w:t>
+            </w:r>
+          </w:p>
+        </w:tc>
+        <w:tc>
+          <w:tcPr>
+            <w:tcW w:type="dxa" w:w="1619"/>
+            <w:tcBorders>
+              <w:top w:val="single" w:color="000000" w:sz="6"/>
+              <w:left w:val="single" w:color="000000" w:sz="6"/>
+              <w:bottom w:val="single" w:color="000000" w:sz="6"/>
+              <w:right w:val="single" w:color="000000" w:sz="6"/>
+            </w:tcBorders>
+            <w:tcMar>
+              <w:top w:type="dxa" w:w="70"/>
+              <w:left w:type="dxa" w:w="100"/>
+              <w:bottom w:type="dxa" w:w="70"/>
+              <w:right w:type="dxa" w:w="100"/>
+            </w:tcMar>
+            <w:vAlign w:val="center"/>
+          </w:tcPr>
+          <w:p>
+            <w:pPr>
+              <w:spacing w:after="0" w:line="240"/>
+              <w:jc w:val="center"/>
+            </w:pPr>
+            <w:r>
+              <w:rPr>
+                <w:rFonts w:ascii="Times New Roman" w:cs="Times New Roman" w:eastAsia="Times New Roman" w:hAnsi="Times New Roman"/>
+                <w:color w:val="000000"/>
+                <w:sz w:val="21"/>
+                <w:szCs w:val="21"/>
+              </w:rPr>
+              <w:t xml:space="preserve">Our premise was wrong</w:t>
             </w:r>
           </w:p>
         </w:tc>
@@ -784,7 +798,7 @@
         </w:trPr>
         <w:tc>
           <w:tcPr>
-            <w:tcW w:type="dxa" w:w="3736"/>
+            <w:tcW w:type="dxa" w:w="3985"/>
             <w:tcBorders>
               <w:top w:val="single" w:color="000000" w:sz="6"/>
               <w:left w:val="single" w:color="000000" w:sz="6"/>
@@ -811,46 +825,46 @@
                 <w:sz w:val="21"/>
                 <w:szCs w:val="21"/>
               </w:rPr>
-              <w:t xml:space="preserve">Is it a matter of how many tokens are removed?</w:t>
-            </w:r>
-          </w:p>
-        </w:tc>
-        <w:tc>
-          <w:tcPr>
-            <w:tcW w:type="dxa" w:w="3736"/>
-            <w:tcBorders>
-              <w:top w:val="single" w:color="000000" w:sz="6"/>
-              <w:left w:val="single" w:color="000000" w:sz="6"/>
-              <w:bottom w:val="single" w:color="000000" w:sz="6"/>
-              <w:right w:val="single" w:color="000000" w:sz="6"/>
-            </w:tcBorders>
-            <w:tcMar>
-              <w:top w:type="dxa" w:w="70"/>
-              <w:left w:type="dxa" w:w="100"/>
-              <w:bottom w:type="dxa" w:w="70"/>
-              <w:right w:type="dxa" w:w="100"/>
-            </w:tcMar>
-            <w:vAlign w:val="center"/>
-          </w:tcPr>
-          <w:p>
-            <w:pPr>
-              <w:spacing w:after="0" w:line="240"/>
-              <w:jc w:val="center"/>
-            </w:pPr>
-            <w:r>
-              <w:rPr>
-                <w:rFonts w:ascii="Times New Roman" w:cs="Times New Roman" w:eastAsia="Times New Roman" w:hAnsi="Times New Roman"/>
-                <w:color w:val="000000"/>
-                <w:sz w:val="21"/>
-                <w:szCs w:val="21"/>
-              </w:rPr>
-              <w:t xml:space="preserve">Removing 10 per cent already gave the full collapse; removing 77 per cent more changed nothing</w:t>
-            </w:r>
-          </w:p>
-        </w:tc>
-        <w:tc>
-          <w:tcPr>
-            <w:tcW w:type="dxa" w:w="1744"/>
+              <w:t xml:space="preserve">Does the amount pruned matter? Swept retention from 100 to 12.5 per cent</w:t>
+            </w:r>
+          </w:p>
+        </w:tc>
+        <w:tc>
+          <w:tcPr>
+            <w:tcW w:type="dxa" w:w="3612"/>
+            <w:tcBorders>
+              <w:top w:val="single" w:color="000000" w:sz="6"/>
+              <w:left w:val="single" w:color="000000" w:sz="6"/>
+              <w:bottom w:val="single" w:color="000000" w:sz="6"/>
+              <w:right w:val="single" w:color="000000" w:sz="6"/>
+            </w:tcBorders>
+            <w:tcMar>
+              <w:top w:type="dxa" w:w="70"/>
+              <w:left w:type="dxa" w:w="100"/>
+              <w:bottom w:type="dxa" w:w="70"/>
+              <w:right w:type="dxa" w:w="100"/>
+            </w:tcMar>
+            <w:vAlign w:val="center"/>
+          </w:tcPr>
+          <w:p>
+            <w:pPr>
+              <w:spacing w:after="0" w:line="240"/>
+              <w:jc w:val="center"/>
+            </w:pPr>
+            <w:r>
+              <w:rPr>
+                <w:rFonts w:ascii="Times New Roman" w:cs="Times New Roman" w:eastAsia="Times New Roman" w:hAnsi="Times New Roman"/>
+                <w:color w:val="000000"/>
+                <w:sz w:val="21"/>
+                <w:szCs w:val="21"/>
+              </w:rPr>
+              <w:t xml:space="preserve">Retaining 90 per cent already gave the full drop, 86.2 to 23.3. Retaining 12.5 per cent gave 23.3, the same</w:t>
+            </w:r>
+          </w:p>
+        </w:tc>
+        <w:tc>
+          <w:tcPr>
+            <w:tcW w:type="dxa" w:w="1619"/>
             <w:tcBorders>
               <w:top w:val="single" w:color="000000" w:sz="6"/>
               <w:left w:val="single" w:color="000000" w:sz="6"/>
@@ -888,7 +902,7 @@
         </w:trPr>
         <w:tc>
           <w:tcPr>
-            <w:tcW w:type="dxa" w:w="3736"/>
+            <w:tcW w:type="dxa" w:w="3985"/>
             <w:tcBorders>
               <w:top w:val="single" w:color="000000" w:sz="6"/>
               <w:left w:val="single" w:color="000000" w:sz="6"/>
@@ -915,46 +929,46 @@
                 <w:sz w:val="21"/>
                 <w:szCs w:val="21"/>
               </w:rPr>
-              <w:t xml:space="preserve">Would forcing every text token to survive help? Used ground-truth OCR as an oracle</w:t>
-            </w:r>
-          </w:p>
-        </w:tc>
-        <w:tc>
-          <w:tcPr>
-            <w:tcW w:type="dxa" w:w="3736"/>
-            <w:tcBorders>
-              <w:top w:val="single" w:color="000000" w:sz="6"/>
-              <w:left w:val="single" w:color="000000" w:sz="6"/>
-              <w:bottom w:val="single" w:color="000000" w:sz="6"/>
-              <w:right w:val="single" w:color="000000" w:sz="6"/>
-            </w:tcBorders>
-            <w:tcMar>
-              <w:top w:type="dxa" w:w="70"/>
-              <w:left w:type="dxa" w:w="100"/>
-              <w:bottom w:type="dxa" w:w="70"/>
-              <w:right w:type="dxa" w:w="100"/>
-            </w:tcMar>
-            <w:vAlign w:val="center"/>
-          </w:tcPr>
-          <w:p>
-            <w:pPr>
-              <w:spacing w:after="0" w:line="240"/>
-              <w:jc w:val="center"/>
-            </w:pPr>
-            <w:r>
-              <w:rPr>
-                <w:rFonts w:ascii="Times New Roman" w:cs="Times New Roman" w:eastAsia="Times New Roman" w:hAnsi="Times New Roman"/>
-                <w:color w:val="000000"/>
-                <w:sz w:val="21"/>
-                <w:szCs w:val="21"/>
-              </w:rPr>
-              <w:t xml:space="preserve">0.197 for the oracle against 0.197 for the control</w:t>
-            </w:r>
-          </w:p>
-        </w:tc>
-        <w:tc>
-          <w:tcPr>
-            <w:tcW w:type="dxa" w:w="1744"/>
+              <w:t xml:space="preserve">Force every text token to survive, using ground-truth OCR</w:t>
+            </w:r>
+          </w:p>
+        </w:tc>
+        <w:tc>
+          <w:tcPr>
+            <w:tcW w:type="dxa" w:w="3612"/>
+            <w:tcBorders>
+              <w:top w:val="single" w:color="000000" w:sz="6"/>
+              <w:left w:val="single" w:color="000000" w:sz="6"/>
+              <w:bottom w:val="single" w:color="000000" w:sz="6"/>
+              <w:right w:val="single" w:color="000000" w:sz="6"/>
+            </w:tcBorders>
+            <w:tcMar>
+              <w:top w:type="dxa" w:w="70"/>
+              <w:left w:type="dxa" w:w="100"/>
+              <w:bottom w:type="dxa" w:w="70"/>
+              <w:right w:type="dxa" w:w="100"/>
+            </w:tcMar>
+            <w:vAlign w:val="center"/>
+          </w:tcPr>
+          <w:p>
+            <w:pPr>
+              <w:spacing w:after="0" w:line="240"/>
+              <w:jc w:val="center"/>
+            </w:pPr>
+            <w:r>
+              <w:rPr>
+                <w:rFonts w:ascii="Times New Roman" w:cs="Times New Roman" w:eastAsia="Times New Roman" w:hAnsi="Times New Roman"/>
+                <w:color w:val="000000"/>
+                <w:sz w:val="21"/>
+                <w:szCs w:val="21"/>
+              </w:rPr>
+              <w:t xml:space="preserve">0.197 oracle against 0.197 control</w:t>
+            </w:r>
+          </w:p>
+        </w:tc>
+        <w:tc>
+          <w:tcPr>
+            <w:tcW w:type="dxa" w:w="1619"/>
             <w:tcBorders>
               <w:top w:val="single" w:color="000000" w:sz="6"/>
               <w:left w:val="single" w:color="000000" w:sz="6"/>
@@ -1018,7 +1032,218 @@
     </w:p>
     <w:p>
       <w:pPr>
+        <w:spacing w:after="110" w:line="248"/>
+        <w:jc w:val="both"/>
+      </w:pPr>
+      <w:r>
+        <w:rPr>
+          <w:rFonts w:ascii="Times New Roman" w:cs="Times New Roman" w:eastAsia="Times New Roman" w:hAnsi="Times New Roman"/>
+          <w:i/>
+          <w:iCs/>
+          <w:sz w:val="24"/>
+          <w:szCs w:val="24"/>
+        </w:rPr>
+        <w:t xml:space="preserve">All four were measuring the same floor. Each changed something upstream of the deletion and then scored an answer produced downstream of it, where no image token survives.</w:t>
+      </w:r>
+    </w:p>
+    <w:p>
+      <w:pPr>
+        <w:pStyle w:val="Heading1"/>
+        <w:spacing w:after="110" w:before="240"/>
+      </w:pPr>
+      <w:r>
+        <w:rPr>
+          <w:rFonts w:ascii="Kalam" w:cs="Kalam" w:eastAsia="Kalam" w:hAnsi="Kalam"/>
+          <w:b/>
+          <w:bCs/>
+          <w:color w:val="1F3864"/>
+          <w:sz w:val="32"/>
+          <w:szCs w:val="32"/>
+        </w:rPr>
+        <w:t xml:space="preserve">4.  The Cause and the Causal Intervention</w:t>
+      </w:r>
+    </w:p>
+    <w:p>
+      <w:pPr>
+        <w:spacing w:after="110" w:line="248"/>
+        <w:jc w:val="both"/>
+      </w:pPr>
+      <w:r>
+        <w:rPr>
+          <w:rFonts w:ascii="Times New Roman" w:cs="Times New Roman" w:eastAsia="Times New Roman" w:hAnsi="Times New Roman"/>
+          <w:sz w:val="24"/>
+          <w:szCs w:val="24"/>
+        </w:rPr>
+        <w:t xml:space="preserve">The clue came from a control we added almost as an afterthought: a setting at 100 per cent retention, where the pruning stages keep every token and should behave exactly like no pruning at all. It scored 0.178, the same as every other budget. We verified the retention value was genuinely reaching the worker process. Something downstream of the budget was destroying the image.</w:t>
+      </w:r>
+    </w:p>
+    <w:p>
+      <w:pPr>
+        <w:spacing w:after="110" w:line="248"/>
+        <w:jc w:val="both"/>
+      </w:pPr>
+      <w:r>
+        <w:rPr>
+          <w:rFonts w:ascii="Times New Roman" w:cs="Times New Roman" w:eastAsia="Times New Roman" w:hAnsi="Times New Roman"/>
+          <w:sz w:val="24"/>
+          <w:szCs w:val="24"/>
+        </w:rPr>
+        <w:t xml:space="preserve">Searching the model file for every branch that touches the hidden-state sequence turned up one candidate.</w:t>
+      </w:r>
+    </w:p>
+    <w:p>
+      <w:pPr>
         <w:spacing w:after="30"/>
+      </w:pPr>
+      <w:r>
+        <w:rPr>
+          <w:sz w:val="2"/>
+          <w:szCs w:val="2"/>
+        </w:rPr>
+        <w:t xml:space="preserve"/>
+      </w:r>
+    </w:p>
+    <w:p>
+      <w:pPr>
+        <w:pBdr>
+          <w:left w:val="single" w:color="A3312F" w:sz="12" w:space="6"/>
+        </w:pBdr>
+        <w:shd w:fill="FCE9E7" w:val="clear"/>
+        <w:spacing w:after="0" w:line="232"/>
+      </w:pPr>
+      <w:r>
+        <w:rPr>
+          <w:rFonts w:ascii="Consolas" w:cs="Consolas" w:eastAsia="Consolas" w:hAnsi="Consolas"/>
+          <w:color w:val="1A1A1A"/>
+          <w:sz w:val="17"/>
+          <w:szCs w:val="17"/>
+        </w:rPr>
+        <w:t xml:space="preserve">elif layer_index == self.end_layer:          # self.end_layer = 23</w:t>
+      </w:r>
+    </w:p>
+    <w:p>
+      <w:pPr>
+        <w:pBdr>
+          <w:left w:val="single" w:color="A3312F" w:sz="12" w:space="6"/>
+        </w:pBdr>
+        <w:shd w:fill="FCE9E7" w:val="clear"/>
+        <w:spacing w:after="0" w:line="232"/>
+      </w:pPr>
+      <w:r>
+        <w:rPr>
+          <w:rFonts w:ascii="Consolas" w:cs="Consolas" w:eastAsia="Consolas" w:hAnsi="Consolas"/>
+          <w:color w:val="1A1A1A"/>
+          <w:sz w:val="17"/>
+          <w:szCs w:val="17"/>
+        </w:rPr>
+        <w:t xml:space="preserve">    remain_sys_index  = torch.tensor(list(range(self.img_start_idx)))</w:t>
+      </w:r>
+    </w:p>
+    <w:p>
+      <w:pPr>
+        <w:pBdr>
+          <w:left w:val="single" w:color="A3312F" w:sz="12" w:space="6"/>
+        </w:pBdr>
+        <w:shd w:fill="FCE9E7" w:val="clear"/>
+        <w:spacing w:after="0" w:line="232"/>
+      </w:pPr>
+      <w:r>
+        <w:rPr>
+          <w:rFonts w:ascii="Consolas" w:cs="Consolas" w:eastAsia="Consolas" w:hAnsi="Consolas"/>
+          <w:color w:val="1A1A1A"/>
+          <w:sz w:val="17"/>
+          <w:szCs w:val="17"/>
+        </w:rPr>
+        <w:t xml:space="preserve">    remain_text_index = torch.tensor(list(range(img_end, total_length)))</w:t>
+      </w:r>
+    </w:p>
+    <w:p>
+      <w:pPr>
+        <w:pBdr>
+          <w:left w:val="single" w:color="A3312F" w:sz="12" w:space="6"/>
+        </w:pBdr>
+        <w:shd w:fill="FCE9E7" w:val="clear"/>
+        <w:spacing w:after="0" w:line="232"/>
+      </w:pPr>
+      <w:r>
+        <w:rPr>
+          <w:rFonts w:ascii="Consolas" w:cs="Consolas" w:eastAsia="Consolas" w:hAnsi="Consolas"/>
+          <w:color w:val="1A1A1A"/>
+          <w:sz w:val="17"/>
+          <w:szCs w:val="17"/>
+        </w:rPr>
+        <w:t xml:space="preserve"> </w:t>
+      </w:r>
+    </w:p>
+    <w:p>
+      <w:pPr>
+        <w:pBdr>
+          <w:left w:val="single" w:color="A3312F" w:sz="12" w:space="6"/>
+        </w:pBdr>
+        <w:shd w:fill="FCE9E7" w:val="clear"/>
+        <w:spacing w:after="0" w:line="232"/>
+      </w:pPr>
+      <w:r>
+        <w:rPr>
+          <w:rFonts w:ascii="Consolas" w:cs="Consolas" w:eastAsia="Consolas" w:hAnsi="Consolas"/>
+          <w:color w:val="1A1A1A"/>
+          <w:sz w:val="17"/>
+          <w:szCs w:val="17"/>
+        </w:rPr>
+        <w:t xml:space="preserve">    #  there is no remain_img_index in the line below</w:t>
+      </w:r>
+    </w:p>
+    <w:p>
+      <w:pPr>
+        <w:pBdr>
+          <w:left w:val="single" w:color="A3312F" w:sz="12" w:space="6"/>
+        </w:pBdr>
+        <w:shd w:fill="FCE9E7" w:val="clear"/>
+        <w:spacing w:after="0" w:line="232"/>
+      </w:pPr>
+      <w:r>
+        <w:rPr>
+          <w:rFonts w:ascii="Consolas" w:cs="Consolas" w:eastAsia="Consolas" w:hAnsi="Consolas"/>
+          <w:color w:val="1A1A1A"/>
+          <w:sz w:val="17"/>
+          <w:szCs w:val="17"/>
+        </w:rPr>
+        <w:t xml:space="preserve">    all_remained_index = torch.cat((remain_sys_index, remain_text_index))</w:t>
+      </w:r>
+    </w:p>
+    <w:p>
+      <w:pPr>
+        <w:pBdr>
+          <w:left w:val="single" w:color="A3312F" w:sz="12" w:space="6"/>
+        </w:pBdr>
+        <w:shd w:fill="FCE9E7" w:val="clear"/>
+        <w:spacing w:after="0" w:line="232"/>
+      </w:pPr>
+      <w:r>
+        <w:rPr>
+          <w:rFonts w:ascii="Consolas" w:cs="Consolas" w:eastAsia="Consolas" w:hAnsi="Consolas"/>
+          <w:color w:val="1A1A1A"/>
+          <w:sz w:val="17"/>
+          <w:szCs w:val="17"/>
+        </w:rPr>
+        <w:t xml:space="preserve">    hidden_states = hidden_states[:, all_remained_index, :]</w:t>
+      </w:r>
+    </w:p>
+    <w:p>
+      <w:pPr>
+        <w:spacing w:after="100"/>
+      </w:pPr>
+      <w:r>
+        <w:rPr>
+          <w:sz w:val="2"/>
+          <w:szCs w:val="2"/>
+        </w:rPr>
+        <w:t xml:space="preserve"/>
+      </w:r>
+    </w:p>
+    <w:p>
+      <w:pPr>
+        <w:spacing w:after="20"/>
       </w:pPr>
       <w:r>
         <w:rPr>
@@ -1043,54 +1268,580 @@
         <w:tblLayout w:type="fixed"/>
       </w:tblPr>
       <w:tblGrid>
-        <w:gridCol w:w="9216"/>
+        <w:gridCol w:w="2880"/>
+        <w:gridCol w:w="6336"/>
       </w:tblGrid>
       <w:tr>
-        <w:tc>
-          <w:tcPr>
-            <w:tcW w:type="dxa" w:w="9216"/>
-            <w:tcBorders>
-              <w:top w:val="single" w:color="000000" w:sz="6"/>
-              <w:left w:val="single" w:color="1F3864" w:sz="18"/>
-              <w:bottom w:val="single" w:color="000000" w:sz="6"/>
-              <w:right w:val="single" w:color="000000" w:sz="6"/>
-            </w:tcBorders>
-            <w:shd w:fill="E8EEF7" w:val="clear"/>
-            <w:tcMar>
-              <w:top w:type="dxa" w:w="130"/>
-              <w:left w:type="dxa" w:w="170"/>
-              <w:bottom w:type="dxa" w:w="130"/>
-              <w:right w:type="dxa" w:w="150"/>
-            </w:tcMar>
-          </w:tcPr>
-          <w:p>
-            <w:pPr>
-              <w:spacing w:after="70"/>
-            </w:pPr>
-            <w:r>
-              <w:rPr>
-                <w:rFonts w:ascii="Kalam" w:cs="Kalam" w:eastAsia="Kalam" w:hAnsi="Kalam"/>
+        <w:trPr>
+          <w:cantSplit/>
+          <w:tblHeader/>
+        </w:trPr>
+        <w:tc>
+          <w:tcPr>
+            <w:tcW w:type="dxa" w:w="2880"/>
+            <w:tcBorders>
+              <w:top w:val="single" w:color="000000" w:sz="6"/>
+              <w:left w:val="single" w:color="000000" w:sz="6"/>
+              <w:bottom w:val="single" w:color="000000" w:sz="6"/>
+              <w:right w:val="single" w:color="000000" w:sz="6"/>
+            </w:tcBorders>
+            <w:shd w:fill="D9E1F0" w:val="clear"/>
+            <w:tcMar>
+              <w:top w:type="dxa" w:w="70"/>
+              <w:left w:type="dxa" w:w="100"/>
+              <w:bottom w:type="dxa" w:w="70"/>
+              <w:right w:type="dxa" w:w="100"/>
+            </w:tcMar>
+            <w:vAlign w:val="center"/>
+          </w:tcPr>
+          <w:p>
+            <w:pPr>
+              <w:spacing w:after="0" w:line="240"/>
+              <w:jc w:val="left"/>
+            </w:pPr>
+            <w:r>
+              <w:rPr>
+                <w:rFonts w:ascii="Times New Roman" w:cs="Times New Roman" w:eastAsia="Times New Roman" w:hAnsi="Times New Roman"/>
                 <w:b/>
                 <w:bCs/>
-                <w:color w:val="1F3864"/>
-                <w:sz w:val="26"/>
-                <w:szCs w:val="26"/>
-              </w:rPr>
-              <w:t xml:space="preserve">Why all four failed the same way</w:t>
-            </w:r>
-          </w:p>
-          <w:p>
-            <w:pPr>
-              <w:spacing w:after="55" w:line="258"/>
-              <w:jc w:val="both"/>
-            </w:pPr>
-            <w:r>
-              <w:rPr>
-                <w:rFonts w:ascii="Times New Roman" w:cs="Times New Roman" w:eastAsia="Times New Roman" w:hAnsi="Times New Roman"/>
-                <w:sz w:val="22"/>
-                <w:szCs w:val="22"/>
-              </w:rPr>
-              <w:t xml:space="preserve">Each experiment changed something before layer 23 and measured an answer produced after it. Since every image token is deleted at that layer whatever you do, all four were measuring the same floor.</w:t>
+                <w:color w:val="000000"/>
+                <w:sz w:val="21"/>
+                <w:szCs w:val="21"/>
+              </w:rPr>
+              <w:t xml:space="preserve">Where this code lives</w:t>
+            </w:r>
+          </w:p>
+        </w:tc>
+        <w:tc>
+          <w:tcPr>
+            <w:tcW w:type="dxa" w:w="6336"/>
+            <w:tcBorders>
+              <w:top w:val="single" w:color="000000" w:sz="6"/>
+              <w:left w:val="single" w:color="000000" w:sz="6"/>
+              <w:bottom w:val="single" w:color="000000" w:sz="6"/>
+              <w:right w:val="single" w:color="000000" w:sz="6"/>
+            </w:tcBorders>
+            <w:shd w:fill="D9E1F0" w:val="clear"/>
+            <w:tcMar>
+              <w:top w:type="dxa" w:w="70"/>
+              <w:left w:type="dxa" w:w="100"/>
+              <w:bottom w:type="dxa" w:w="70"/>
+              <w:right w:type="dxa" w:w="100"/>
+            </w:tcMar>
+            <w:vAlign w:val="center"/>
+          </w:tcPr>
+          <w:p>
+            <w:pPr>
+              <w:spacing w:after="0" w:line="240"/>
+              <w:jc w:val="center"/>
+            </w:pPr>
+            <w:r>
+              <w:rPr>
+                <w:rFonts w:ascii="Times New Roman" w:cs="Times New Roman" w:eastAsia="Times New Roman" w:hAnsi="Times New Roman"/>
+                <w:b/>
+                <w:bCs/>
+                <w:color w:val="000000"/>
+                <w:sz w:val="21"/>
+                <w:szCs w:val="21"/>
+              </w:rPr>
+              <w:t xml:space="preserve"/>
+            </w:r>
+          </w:p>
+        </w:tc>
+      </w:tr>
+      <w:tr>
+        <w:trPr>
+          <w:cantSplit/>
+        </w:trPr>
+        <w:tc>
+          <w:tcPr>
+            <w:tcW w:type="dxa" w:w="2880"/>
+            <w:tcBorders>
+              <w:top w:val="single" w:color="000000" w:sz="6"/>
+              <w:left w:val="single" w:color="000000" w:sz="6"/>
+              <w:bottom w:val="single" w:color="000000" w:sz="6"/>
+              <w:right w:val="single" w:color="000000" w:sz="6"/>
+            </w:tcBorders>
+            <w:tcMar>
+              <w:top w:type="dxa" w:w="70"/>
+              <w:left w:type="dxa" w:w="100"/>
+              <w:bottom w:type="dxa" w:w="70"/>
+              <w:right w:type="dxa" w:w="100"/>
+            </w:tcMar>
+            <w:vAlign w:val="center"/>
+          </w:tcPr>
+          <w:p>
+            <w:pPr>
+              <w:spacing w:after="0" w:line="240"/>
+              <w:jc w:val="left"/>
+            </w:pPr>
+            <w:r>
+              <w:rPr>
+                <w:rFonts w:ascii="Times New Roman" w:cs="Times New Roman" w:eastAsia="Times New Roman" w:hAnsi="Times New Roman"/>
+                <w:color w:val="000000"/>
+                <w:sz w:val="21"/>
+                <w:szCs w:val="21"/>
+              </w:rPr>
+              <w:t xml:space="preserve">Repository</w:t>
+            </w:r>
+          </w:p>
+        </w:tc>
+        <w:tc>
+          <w:tcPr>
+            <w:tcW w:type="dxa" w:w="6336"/>
+            <w:tcBorders>
+              <w:top w:val="single" w:color="000000" w:sz="6"/>
+              <w:left w:val="single" w:color="000000" w:sz="6"/>
+              <w:bottom w:val="single" w:color="000000" w:sz="6"/>
+              <w:right w:val="single" w:color="000000" w:sz="6"/>
+            </w:tcBorders>
+            <w:tcMar>
+              <w:top w:type="dxa" w:w="70"/>
+              <w:left w:type="dxa" w:w="100"/>
+              <w:bottom w:type="dxa" w:w="70"/>
+              <w:right w:type="dxa" w:w="100"/>
+            </w:tcMar>
+            <w:vAlign w:val="center"/>
+          </w:tcPr>
+          <w:p>
+            <w:pPr>
+              <w:spacing w:after="0" w:line="240"/>
+              <w:jc w:val="center"/>
+            </w:pPr>
+            <w:r>
+              <w:rPr>
+                <w:rFonts w:ascii="Times New Roman" w:cs="Times New Roman" w:eastAsia="Times New Roman" w:hAnsi="Times New Roman"/>
+                <w:color w:val="000000"/>
+                <w:sz w:val="21"/>
+                <w:szCs w:val="21"/>
+              </w:rPr>
+              <w:t xml:space="preserve">NeurIPS2025-Balanced-Token-Pruning, the authors' release</w:t>
+            </w:r>
+          </w:p>
+        </w:tc>
+      </w:tr>
+      <w:tr>
+        <w:trPr>
+          <w:cantSplit/>
+        </w:trPr>
+        <w:tc>
+          <w:tcPr>
+            <w:tcW w:type="dxa" w:w="2880"/>
+            <w:tcBorders>
+              <w:top w:val="single" w:color="000000" w:sz="6"/>
+              <w:left w:val="single" w:color="000000" w:sz="6"/>
+              <w:bottom w:val="single" w:color="000000" w:sz="6"/>
+              <w:right w:val="single" w:color="000000" w:sz="6"/>
+            </w:tcBorders>
+            <w:tcMar>
+              <w:top w:type="dxa" w:w="70"/>
+              <w:left w:type="dxa" w:w="100"/>
+              <w:bottom w:type="dxa" w:w="70"/>
+              <w:right w:type="dxa" w:w="100"/>
+            </w:tcMar>
+            <w:vAlign w:val="center"/>
+          </w:tcPr>
+          <w:p>
+            <w:pPr>
+              <w:spacing w:after="0" w:line="240"/>
+              <w:jc w:val="left"/>
+            </w:pPr>
+            <w:r>
+              <w:rPr>
+                <w:rFonts w:ascii="Times New Roman" w:cs="Times New Roman" w:eastAsia="Times New Roman" w:hAnsi="Times New Roman"/>
+                <w:color w:val="000000"/>
+                <w:sz w:val="21"/>
+                <w:szCs w:val="21"/>
+              </w:rPr>
+              <w:t xml:space="preserve">Commit</w:t>
+            </w:r>
+          </w:p>
+        </w:tc>
+        <w:tc>
+          <w:tcPr>
+            <w:tcW w:type="dxa" w:w="6336"/>
+            <w:tcBorders>
+              <w:top w:val="single" w:color="000000" w:sz="6"/>
+              <w:left w:val="single" w:color="000000" w:sz="6"/>
+              <w:bottom w:val="single" w:color="000000" w:sz="6"/>
+              <w:right w:val="single" w:color="000000" w:sz="6"/>
+            </w:tcBorders>
+            <w:tcMar>
+              <w:top w:type="dxa" w:w="70"/>
+              <w:left w:type="dxa" w:w="100"/>
+              <w:bottom w:type="dxa" w:w="70"/>
+              <w:right w:type="dxa" w:w="100"/>
+            </w:tcMar>
+            <w:vAlign w:val="center"/>
+          </w:tcPr>
+          <w:p>
+            <w:pPr>
+              <w:spacing w:after="0" w:line="240"/>
+              <w:jc w:val="center"/>
+            </w:pPr>
+            <w:r>
+              <w:rPr>
+                <w:rFonts w:ascii="Times New Roman" w:cs="Times New Roman" w:eastAsia="Times New Roman" w:hAnsi="Times New Roman"/>
+                <w:color w:val="000000"/>
+                <w:sz w:val="21"/>
+                <w:szCs w:val="21"/>
+              </w:rPr>
+              <w:t xml:space="preserve">9682db0</w:t>
+            </w:r>
+          </w:p>
+        </w:tc>
+      </w:tr>
+      <w:tr>
+        <w:trPr>
+          <w:cantSplit/>
+        </w:trPr>
+        <w:tc>
+          <w:tcPr>
+            <w:tcW w:type="dxa" w:w="2880"/>
+            <w:tcBorders>
+              <w:top w:val="single" w:color="000000" w:sz="6"/>
+              <w:left w:val="single" w:color="000000" w:sz="6"/>
+              <w:bottom w:val="single" w:color="000000" w:sz="6"/>
+              <w:right w:val="single" w:color="000000" w:sz="6"/>
+            </w:tcBorders>
+            <w:tcMar>
+              <w:top w:type="dxa" w:w="70"/>
+              <w:left w:type="dxa" w:w="100"/>
+              <w:bottom w:type="dxa" w:w="70"/>
+              <w:right w:type="dxa" w:w="100"/>
+            </w:tcMar>
+            <w:vAlign w:val="center"/>
+          </w:tcPr>
+          <w:p>
+            <w:pPr>
+              <w:spacing w:after="0" w:line="240"/>
+              <w:jc w:val="left"/>
+            </w:pPr>
+            <w:r>
+              <w:rPr>
+                <w:rFonts w:ascii="Times New Roman" w:cs="Times New Roman" w:eastAsia="Times New Roman" w:hAnsi="Times New Roman"/>
+                <w:color w:val="000000"/>
+                <w:sz w:val="21"/>
+                <w:szCs w:val="21"/>
+              </w:rPr>
+              <w:t xml:space="preserve">File</w:t>
+            </w:r>
+          </w:p>
+        </w:tc>
+        <w:tc>
+          <w:tcPr>
+            <w:tcW w:type="dxa" w:w="6336"/>
+            <w:tcBorders>
+              <w:top w:val="single" w:color="000000" w:sz="6"/>
+              <w:left w:val="single" w:color="000000" w:sz="6"/>
+              <w:bottom w:val="single" w:color="000000" w:sz="6"/>
+              <w:right w:val="single" w:color="000000" w:sz="6"/>
+            </w:tcBorders>
+            <w:tcMar>
+              <w:top w:type="dxa" w:w="70"/>
+              <w:left w:type="dxa" w:w="100"/>
+              <w:bottom w:type="dxa" w:w="70"/>
+              <w:right w:type="dxa" w:w="100"/>
+            </w:tcMar>
+            <w:vAlign w:val="center"/>
+          </w:tcPr>
+          <w:p>
+            <w:pPr>
+              <w:spacing w:after="0" w:line="240"/>
+              <w:jc w:val="center"/>
+            </w:pPr>
+            <w:r>
+              <w:rPr>
+                <w:rFonts w:ascii="Times New Roman" w:cs="Times New Roman" w:eastAsia="Times New Roman" w:hAnsi="Times New Roman"/>
+                <w:color w:val="000000"/>
+                <w:sz w:val="21"/>
+                <w:szCs w:val="21"/>
+              </w:rPr>
+              <w:t xml:space="preserve">qwen-2.5-vl/modeling_qwen2_5_vl.py</w:t>
+            </w:r>
+          </w:p>
+        </w:tc>
+      </w:tr>
+      <w:tr>
+        <w:trPr>
+          <w:cantSplit/>
+        </w:trPr>
+        <w:tc>
+          <w:tcPr>
+            <w:tcW w:type="dxa" w:w="2880"/>
+            <w:tcBorders>
+              <w:top w:val="single" w:color="000000" w:sz="6"/>
+              <w:left w:val="single" w:color="000000" w:sz="6"/>
+              <w:bottom w:val="single" w:color="000000" w:sz="6"/>
+              <w:right w:val="single" w:color="000000" w:sz="6"/>
+            </w:tcBorders>
+            <w:tcMar>
+              <w:top w:type="dxa" w:w="70"/>
+              <w:left w:type="dxa" w:w="100"/>
+              <w:bottom w:type="dxa" w:w="70"/>
+              <w:right w:type="dxa" w:w="100"/>
+            </w:tcMar>
+            <w:vAlign w:val="center"/>
+          </w:tcPr>
+          <w:p>
+            <w:pPr>
+              <w:spacing w:after="0" w:line="240"/>
+              <w:jc w:val="left"/>
+            </w:pPr>
+            <w:r>
+              <w:rPr>
+                <w:rFonts w:ascii="Times New Roman" w:cs="Times New Roman" w:eastAsia="Times New Roman" w:hAnsi="Times New Roman"/>
+                <w:color w:val="000000"/>
+                <w:sz w:val="21"/>
+                <w:szCs w:val="21"/>
+              </w:rPr>
+              <w:t xml:space="preserve">Class and method</w:t>
+            </w:r>
+          </w:p>
+        </w:tc>
+        <w:tc>
+          <w:tcPr>
+            <w:tcW w:type="dxa" w:w="6336"/>
+            <w:tcBorders>
+              <w:top w:val="single" w:color="000000" w:sz="6"/>
+              <w:left w:val="single" w:color="000000" w:sz="6"/>
+              <w:bottom w:val="single" w:color="000000" w:sz="6"/>
+              <w:right w:val="single" w:color="000000" w:sz="6"/>
+            </w:tcBorders>
+            <w:tcMar>
+              <w:top w:type="dxa" w:w="70"/>
+              <w:left w:type="dxa" w:w="100"/>
+              <w:bottom w:type="dxa" w:w="70"/>
+              <w:right w:type="dxa" w:w="100"/>
+            </w:tcMar>
+            <w:vAlign w:val="center"/>
+          </w:tcPr>
+          <w:p>
+            <w:pPr>
+              <w:spacing w:after="0" w:line="240"/>
+              <w:jc w:val="center"/>
+            </w:pPr>
+            <w:r>
+              <w:rPr>
+                <w:rFonts w:ascii="Times New Roman" w:cs="Times New Roman" w:eastAsia="Times New Roman" w:hAnsi="Times New Roman"/>
+                <w:color w:val="000000"/>
+                <w:sz w:val="21"/>
+                <w:szCs w:val="21"/>
+              </w:rPr>
+              <w:t xml:space="preserve">Qwen2_5_VLModel.forward, class at line 1115, method at line 1184</w:t>
+            </w:r>
+          </w:p>
+        </w:tc>
+      </w:tr>
+      <w:tr>
+        <w:trPr>
+          <w:cantSplit/>
+        </w:trPr>
+        <w:tc>
+          <w:tcPr>
+            <w:tcW w:type="dxa" w:w="2880"/>
+            <w:tcBorders>
+              <w:top w:val="single" w:color="000000" w:sz="6"/>
+              <w:left w:val="single" w:color="000000" w:sz="6"/>
+              <w:bottom w:val="single" w:color="000000" w:sz="6"/>
+              <w:right w:val="single" w:color="000000" w:sz="6"/>
+            </w:tcBorders>
+            <w:tcMar>
+              <w:top w:type="dxa" w:w="70"/>
+              <w:left w:type="dxa" w:w="100"/>
+              <w:bottom w:type="dxa" w:w="70"/>
+              <w:right w:type="dxa" w:w="100"/>
+            </w:tcMar>
+            <w:vAlign w:val="center"/>
+          </w:tcPr>
+          <w:p>
+            <w:pPr>
+              <w:spacing w:after="0" w:line="240"/>
+              <w:jc w:val="left"/>
+            </w:pPr>
+            <w:r>
+              <w:rPr>
+                <w:rFonts w:ascii="Times New Roman" w:cs="Times New Roman" w:eastAsia="Times New Roman" w:hAnsi="Times New Roman"/>
+                <w:color w:val="000000"/>
+                <w:sz w:val="21"/>
+                <w:szCs w:val="21"/>
+              </w:rPr>
+              <w:t xml:space="preserve">Constants</w:t>
+            </w:r>
+          </w:p>
+        </w:tc>
+        <w:tc>
+          <w:tcPr>
+            <w:tcW w:type="dxa" w:w="6336"/>
+            <w:tcBorders>
+              <w:top w:val="single" w:color="000000" w:sz="6"/>
+              <w:left w:val="single" w:color="000000" w:sz="6"/>
+              <w:bottom w:val="single" w:color="000000" w:sz="6"/>
+              <w:right w:val="single" w:color="000000" w:sz="6"/>
+            </w:tcBorders>
+            <w:tcMar>
+              <w:top w:type="dxa" w:w="70"/>
+              <w:left w:type="dxa" w:w="100"/>
+              <w:bottom w:type="dxa" w:w="70"/>
+              <w:right w:type="dxa" w:w="100"/>
+            </w:tcMar>
+            <w:vAlign w:val="center"/>
+          </w:tcPr>
+          <w:p>
+            <w:pPr>
+              <w:spacing w:after="0" w:line="240"/>
+              <w:jc w:val="center"/>
+            </w:pPr>
+            <w:r>
+              <w:rPr>
+                <w:rFonts w:ascii="Times New Roman" w:cs="Times New Roman" w:eastAsia="Times New Roman" w:hAnsi="Times New Roman"/>
+                <w:color w:val="000000"/>
+                <w:sz w:val="21"/>
+                <w:szCs w:val="21"/>
+              </w:rPr>
+              <w:t xml:space="preserve">lines 1140 to 1144, where end_layer is set to 23</w:t>
+            </w:r>
+          </w:p>
+        </w:tc>
+      </w:tr>
+      <w:tr>
+        <w:trPr>
+          <w:cantSplit/>
+        </w:trPr>
+        <w:tc>
+          <w:tcPr>
+            <w:tcW w:type="dxa" w:w="2880"/>
+            <w:tcBorders>
+              <w:top w:val="single" w:color="000000" w:sz="6"/>
+              <w:left w:val="single" w:color="000000" w:sz="6"/>
+              <w:bottom w:val="single" w:color="000000" w:sz="6"/>
+              <w:right w:val="single" w:color="000000" w:sz="6"/>
+            </w:tcBorders>
+            <w:tcMar>
+              <w:top w:type="dxa" w:w="70"/>
+              <w:left w:type="dxa" w:w="100"/>
+              <w:bottom w:type="dxa" w:w="70"/>
+              <w:right w:type="dxa" w:w="100"/>
+            </w:tcMar>
+            <w:vAlign w:val="center"/>
+          </w:tcPr>
+          <w:p>
+            <w:pPr>
+              <w:spacing w:after="0" w:line="240"/>
+              <w:jc w:val="left"/>
+            </w:pPr>
+            <w:r>
+              <w:rPr>
+                <w:rFonts w:ascii="Times New Roman" w:cs="Times New Roman" w:eastAsia="Times New Roman" w:hAnsi="Times New Roman"/>
+                <w:color w:val="000000"/>
+                <w:sz w:val="21"/>
+                <w:szCs w:val="21"/>
+              </w:rPr>
+              <w:t xml:space="preserve">The branch</w:t>
+            </w:r>
+          </w:p>
+        </w:tc>
+        <w:tc>
+          <w:tcPr>
+            <w:tcW w:type="dxa" w:w="6336"/>
+            <w:tcBorders>
+              <w:top w:val="single" w:color="000000" w:sz="6"/>
+              <w:left w:val="single" w:color="000000" w:sz="6"/>
+              <w:bottom w:val="single" w:color="000000" w:sz="6"/>
+              <w:right w:val="single" w:color="000000" w:sz="6"/>
+            </w:tcBorders>
+            <w:tcMar>
+              <w:top w:type="dxa" w:w="70"/>
+              <w:left w:type="dxa" w:w="100"/>
+              <w:bottom w:type="dxa" w:w="70"/>
+              <w:right w:type="dxa" w:w="100"/>
+            </w:tcMar>
+            <w:vAlign w:val="center"/>
+          </w:tcPr>
+          <w:p>
+            <w:pPr>
+              <w:spacing w:after="0" w:line="240"/>
+              <w:jc w:val="center"/>
+            </w:pPr>
+            <w:r>
+              <w:rPr>
+                <w:rFonts w:ascii="Times New Roman" w:cs="Times New Roman" w:eastAsia="Times New Roman" w:hAnsi="Times New Roman"/>
+                <w:color w:val="000000"/>
+                <w:sz w:val="21"/>
+                <w:szCs w:val="21"/>
+              </w:rPr>
+              <w:t xml:space="preserve">line 1385</w:t>
+            </w:r>
+          </w:p>
+        </w:tc>
+      </w:tr>
+      <w:tr>
+        <w:trPr>
+          <w:cantSplit/>
+        </w:trPr>
+        <w:tc>
+          <w:tcPr>
+            <w:tcW w:type="dxa" w:w="2880"/>
+            <w:tcBorders>
+              <w:top w:val="single" w:color="000000" w:sz="6"/>
+              <w:left w:val="single" w:color="000000" w:sz="6"/>
+              <w:bottom w:val="single" w:color="000000" w:sz="6"/>
+              <w:right w:val="single" w:color="000000" w:sz="6"/>
+            </w:tcBorders>
+            <w:tcMar>
+              <w:top w:type="dxa" w:w="70"/>
+              <w:left w:type="dxa" w:w="100"/>
+              <w:bottom w:type="dxa" w:w="70"/>
+              <w:right w:type="dxa" w:w="100"/>
+            </w:tcMar>
+            <w:vAlign w:val="center"/>
+          </w:tcPr>
+          <w:p>
+            <w:pPr>
+              <w:spacing w:after="0" w:line="240"/>
+              <w:jc w:val="left"/>
+            </w:pPr>
+            <w:r>
+              <w:rPr>
+                <w:rFonts w:ascii="Times New Roman" w:cs="Times New Roman" w:eastAsia="Times New Roman" w:hAnsi="Times New Roman"/>
+                <w:color w:val="000000"/>
+                <w:sz w:val="21"/>
+                <w:szCs w:val="21"/>
+              </w:rPr>
+              <w:t xml:space="preserve">State when read</w:t>
+            </w:r>
+          </w:p>
+        </w:tc>
+        <w:tc>
+          <w:tcPr>
+            <w:tcW w:type="dxa" w:w="6336"/>
+            <w:tcBorders>
+              <w:top w:val="single" w:color="000000" w:sz="6"/>
+              <w:left w:val="single" w:color="000000" w:sz="6"/>
+              <w:bottom w:val="single" w:color="000000" w:sz="6"/>
+              <w:right w:val="single" w:color="000000" w:sz="6"/>
+            </w:tcBorders>
+            <w:tcMar>
+              <w:top w:type="dxa" w:w="70"/>
+              <w:left w:type="dxa" w:w="100"/>
+              <w:bottom w:type="dxa" w:w="70"/>
+              <w:right w:type="dxa" w:w="100"/>
+            </w:tcMar>
+            <w:vAlign w:val="center"/>
+          </w:tcPr>
+          <w:p>
+            <w:pPr>
+              <w:spacing w:after="0" w:line="240"/>
+              <w:jc w:val="center"/>
+            </w:pPr>
+            <w:r>
+              <w:rPr>
+                <w:rFonts w:ascii="Times New Roman" w:cs="Times New Roman" w:eastAsia="Times New Roman" w:hAnsi="Times New Roman"/>
+                <w:color w:val="000000"/>
+                <w:sz w:val="21"/>
+                <w:szCs w:val="21"/>
+              </w:rPr>
+              <w:t xml:space="preserve">unmodified. We copy this file over the installed transformers module and restore the original afterwards, so the released file is never edited in place.</w:t>
             </w:r>
           </w:p>
         </w:tc>
@@ -1098,24 +1849,36 @@
     </w:tbl>
     <w:p>
       <w:pPr>
-        <w:pStyle w:val="Heading1"/>
-        <w:spacing w:after="110" w:before="240"/>
-      </w:pPr>
-      <w:r>
-        <w:rPr>
-          <w:rFonts w:ascii="Kalam" w:cs="Kalam" w:eastAsia="Kalam" w:hAnsi="Kalam"/>
-          <w:b/>
-          <w:bCs/>
-          <w:color w:val="1F3864"/>
-          <w:sz w:val="32"/>
-          <w:szCs w:val="32"/>
-        </w:rPr>
-        <w:t xml:space="preserve">4.  The Cause, and the Proof</w:t>
-      </w:r>
-    </w:p>
-    <w:p>
-      <w:pPr>
-        <w:spacing w:after="110" w:line="248"/>
+        <w:spacing w:after="40"/>
+      </w:pPr>
+      <w:r>
+        <w:rPr>
+          <w:sz w:val="2"/>
+          <w:szCs w:val="2"/>
+        </w:rPr>
+        <w:t xml:space="preserve"/>
+      </w:r>
+    </w:p>
+    <w:p>
+      <w:pPr>
+        <w:spacing w:after="140"/>
+        <w:jc w:val="center"/>
+      </w:pPr>
+      <w:r>
+        <w:rPr>
+          <w:rFonts w:ascii="Times New Roman" w:cs="Times New Roman" w:eastAsia="Times New Roman" w:hAnsi="Times New Roman"/>
+          <w:i/>
+          <w:iCs/>
+          <w:color w:val="444444"/>
+          <w:sz w:val="19"/>
+          <w:szCs w:val="19"/>
+        </w:rPr>
+        <w:t xml:space="preserve">Table 2. Provenance of the code examined. Line numbers refer to the copy in our repository under repo/qwen-2.5-vl/.</w:t>
+      </w:r>
+    </w:p>
+    <w:p>
+      <w:pPr>
+        <w:spacing w:after="110" w:line="264"/>
         <w:jc w:val="both"/>
       </w:pPr>
       <w:r>
@@ -1124,176 +1887,28 @@
           <w:sz w:val="24"/>
           <w:szCs w:val="24"/>
         </w:rPr>
-        <w:t xml:space="preserve">The clue came from a control we added almost as an afterthought: a setting at 100 per cent retention, where the pruning stages keep every token and should behave exactly like no pruning at all. It scored 0.178, the same as every other budget. We verified the retention value was genuinely reaching the worker process. Something downstream of the budget was destroying the image.</w:t>
-      </w:r>
-    </w:p>
-    <w:p>
-      <w:pPr>
-        <w:spacing w:after="110" w:line="248"/>
-        <w:jc w:val="both"/>
-      </w:pPr>
+        <w:t xml:space="preserve">The concatenation joins system tokens and text tokens. There is no </w:t>
+      </w:r>
+      <w:r>
+        <w:rPr>
+          <w:rFonts w:ascii="Consolas" w:cs="Consolas" w:eastAsia="Consolas" w:hAnsi="Consolas"/>
+          <w:sz w:val="20"/>
+          <w:szCs w:val="20"/>
+        </w:rPr>
+        <w:t xml:space="preserve">remain_img_index</w:t>
+      </w:r>
       <w:r>
         <w:rPr>
           <w:rFonts w:ascii="Times New Roman" w:cs="Times New Roman" w:eastAsia="Times New Roman" w:hAnsi="Times New Roman"/>
           <w:sz w:val="24"/>
           <w:szCs w:val="24"/>
         </w:rPr>
-        <w:t xml:space="preserve">Searching the model file for every branch that touches the hidden-state sequence turned up one candidate.</w:t>
-      </w:r>
-    </w:p>
-    <w:p>
-      <w:pPr>
-        <w:spacing w:after="30"/>
-      </w:pPr>
-      <w:r>
-        <w:rPr>
-          <w:sz w:val="2"/>
-          <w:szCs w:val="2"/>
-        </w:rPr>
-        <w:t xml:space="preserve"/>
-      </w:r>
-    </w:p>
-    <w:p>
-      <w:pPr>
-        <w:pBdr>
-          <w:left w:val="single" w:color="A3312F" w:sz="12" w:space="6"/>
-        </w:pBdr>
-        <w:shd w:fill="FCE9E7" w:val="clear"/>
-        <w:spacing w:after="0" w:line="232"/>
-      </w:pPr>
-      <w:r>
-        <w:rPr>
-          <w:rFonts w:ascii="Consolas" w:cs="Consolas" w:eastAsia="Consolas" w:hAnsi="Consolas"/>
-          <w:color w:val="1A1A1A"/>
-          <w:sz w:val="17"/>
-          <w:szCs w:val="17"/>
-        </w:rPr>
-        <w:t xml:space="preserve">elif layer_index == self.end_layer:          # self.end_layer = 23</w:t>
-      </w:r>
-    </w:p>
-    <w:p>
-      <w:pPr>
-        <w:pBdr>
-          <w:left w:val="single" w:color="A3312F" w:sz="12" w:space="6"/>
-        </w:pBdr>
-        <w:shd w:fill="FCE9E7" w:val="clear"/>
-        <w:spacing w:after="0" w:line="232"/>
-      </w:pPr>
-      <w:r>
-        <w:rPr>
-          <w:rFonts w:ascii="Consolas" w:cs="Consolas" w:eastAsia="Consolas" w:hAnsi="Consolas"/>
-          <w:color w:val="1A1A1A"/>
-          <w:sz w:val="17"/>
-          <w:szCs w:val="17"/>
-        </w:rPr>
-        <w:t xml:space="preserve">    remain_sys_index  = torch.tensor(list(range(self.img_start_idx)))</w:t>
-      </w:r>
-    </w:p>
-    <w:p>
-      <w:pPr>
-        <w:pBdr>
-          <w:left w:val="single" w:color="A3312F" w:sz="12" w:space="6"/>
-        </w:pBdr>
-        <w:shd w:fill="FCE9E7" w:val="clear"/>
-        <w:spacing w:after="0" w:line="232"/>
-      </w:pPr>
-      <w:r>
-        <w:rPr>
-          <w:rFonts w:ascii="Consolas" w:cs="Consolas" w:eastAsia="Consolas" w:hAnsi="Consolas"/>
-          <w:color w:val="1A1A1A"/>
-          <w:sz w:val="17"/>
-          <w:szCs w:val="17"/>
-        </w:rPr>
-        <w:t xml:space="preserve">    remain_text_index = torch.tensor(list(range(img_end, total_length)))</w:t>
-      </w:r>
-    </w:p>
-    <w:p>
-      <w:pPr>
-        <w:pBdr>
-          <w:left w:val="single" w:color="A3312F" w:sz="12" w:space="6"/>
-        </w:pBdr>
-        <w:shd w:fill="FCE9E7" w:val="clear"/>
-        <w:spacing w:after="0" w:line="232"/>
-      </w:pPr>
-      <w:r>
-        <w:rPr>
-          <w:rFonts w:ascii="Consolas" w:cs="Consolas" w:eastAsia="Consolas" w:hAnsi="Consolas"/>
-          <w:color w:val="1A1A1A"/>
-          <w:sz w:val="17"/>
-          <w:szCs w:val="17"/>
-        </w:rPr>
-        <w:t xml:space="preserve"> </w:t>
-      </w:r>
-    </w:p>
-    <w:p>
-      <w:pPr>
-        <w:pBdr>
-          <w:left w:val="single" w:color="A3312F" w:sz="12" w:space="6"/>
-        </w:pBdr>
-        <w:shd w:fill="FCE9E7" w:val="clear"/>
-        <w:spacing w:after="0" w:line="232"/>
-      </w:pPr>
-      <w:r>
-        <w:rPr>
-          <w:rFonts w:ascii="Consolas" w:cs="Consolas" w:eastAsia="Consolas" w:hAnsi="Consolas"/>
-          <w:color w:val="1A1A1A"/>
-          <w:sz w:val="17"/>
-          <w:szCs w:val="17"/>
-        </w:rPr>
-        <w:t xml:space="preserve">    #  there is no remain_img_index in the line below</w:t>
-      </w:r>
-    </w:p>
-    <w:p>
-      <w:pPr>
-        <w:pBdr>
-          <w:left w:val="single" w:color="A3312F" w:sz="12" w:space="6"/>
-        </w:pBdr>
-        <w:shd w:fill="FCE9E7" w:val="clear"/>
-        <w:spacing w:after="0" w:line="232"/>
-      </w:pPr>
-      <w:r>
-        <w:rPr>
-          <w:rFonts w:ascii="Consolas" w:cs="Consolas" w:eastAsia="Consolas" w:hAnsi="Consolas"/>
-          <w:color w:val="1A1A1A"/>
-          <w:sz w:val="17"/>
-          <w:szCs w:val="17"/>
-        </w:rPr>
-        <w:t xml:space="preserve">    all_remained_index = torch.cat((remain_sys_index, remain_text_index))</w:t>
-      </w:r>
-    </w:p>
-    <w:p>
-      <w:pPr>
-        <w:pBdr>
-          <w:left w:val="single" w:color="A3312F" w:sz="12" w:space="6"/>
-        </w:pBdr>
-        <w:shd w:fill="FCE9E7" w:val="clear"/>
-        <w:spacing w:after="0" w:line="232"/>
-      </w:pPr>
-      <w:r>
-        <w:rPr>
-          <w:rFonts w:ascii="Consolas" w:cs="Consolas" w:eastAsia="Consolas" w:hAnsi="Consolas"/>
-          <w:color w:val="1A1A1A"/>
-          <w:sz w:val="17"/>
-          <w:szCs w:val="17"/>
-        </w:rPr>
-        <w:t xml:space="preserve">    hidden_states = hidden_states[:, all_remained_index, :]</w:t>
-      </w:r>
-    </w:p>
-    <w:p>
-      <w:pPr>
-        <w:spacing w:after="100"/>
-      </w:pPr>
-      <w:r>
-        <w:rPr>
-          <w:sz w:val="2"/>
-          <w:szCs w:val="2"/>
-        </w:rPr>
-        <w:t xml:space="preserve"/>
-      </w:r>
-    </w:p>
-    <w:p>
-      <w:pPr>
-        <w:spacing w:after="110" w:line="264"/>
+        <w:t xml:space="preserve">. Every image token that survived three stages of careful pruning is deleted at layer 23, always. Just above it sits a commented-out version that would have kept some by attention score.</w:t>
+      </w:r>
+    </w:p>
+    <w:p>
+      <w:pPr>
+        <w:spacing w:after="110" w:line="248"/>
         <w:jc w:val="both"/>
       </w:pPr>
       <w:r>
@@ -1302,37 +1917,7 @@
           <w:sz w:val="24"/>
           <w:szCs w:val="24"/>
         </w:rPr>
-        <w:t xml:space="preserve">The concatenation joins system tokens and text tokens. There is no </w:t>
-      </w:r>
-      <w:r>
-        <w:rPr>
-          <w:rFonts w:ascii="Consolas" w:cs="Consolas" w:eastAsia="Consolas" w:hAnsi="Consolas"/>
-          <w:sz w:val="20"/>
-          <w:szCs w:val="20"/>
-        </w:rPr>
-        <w:t xml:space="preserve">remain_img_index</w:t>
-      </w:r>
-      <w:r>
-        <w:rPr>
-          <w:rFonts w:ascii="Times New Roman" w:cs="Times New Roman" w:eastAsia="Times New Roman" w:hAnsi="Times New Roman"/>
-          <w:sz w:val="24"/>
-          <w:szCs w:val="24"/>
-        </w:rPr>
-        <w:t xml:space="preserve">. Every image token that survived three stages of careful pruning is deleted at layer 23, always. Just above it sits a commented-out version that would have kept some by attention score.</w:t>
-      </w:r>
-    </w:p>
-    <w:p>
-      <w:pPr>
-        <w:spacing w:after="110" w:line="248"/>
-        <w:jc w:val="both"/>
-      </w:pPr>
-      <w:r>
-        <w:rPr>
-          <w:rFonts w:ascii="Times New Roman" w:cs="Times New Roman" w:eastAsia="Times New Roman" w:hAnsi="Times New Roman"/>
-          <w:sz w:val="24"/>
-          <w:szCs w:val="24"/>
-        </w:rPr>
-        <w:t xml:space="preserve">To turn an explanation into a proof we changed one integer, so the branch can never fire, and left everything else alone including the full 12.5 per cent pruning.</w:t>
+        <w:t xml:space="preserve">An explanation that fits the data is not yet evidence of cause. To test it we changed one integer, so the branch can never fire, and left everything else alone including the full 12.5 per cent pruning.</w:t>
       </w:r>
     </w:p>
     <w:tbl>
@@ -1828,7 +2413,7 @@
           <w:sz w:val="19"/>
           <w:szCs w:val="19"/>
         </w:rPr>
-        <w:t xml:space="preserve">Table 2. Job 416735, 200 samples. One line changed, accuracy moves from 0.1725 to 0.7860.</w:t>
+        <w:t xml:space="preserve">Table 3. Job 416735, 200 samples. One line changed, accuracy moves from 0.1725 to 0.7860. The baseline of 0.8565 differs slightly from the 86.2 quoted elsewhere because this intervention used a separate 200 sample subset.</w:t>
       </w:r>
     </w:p>
     <w:p>
@@ -2024,7 +2609,7 @@
           <w:sz w:val="24"/>
           <w:szCs w:val="24"/>
         </w:rPr>
-        <w:t xml:space="preserve">The released code applies the LLaVA schedule to Qwen anyway, with no check for which model is running.</w:t>
+        <w:t xml:space="preserve">In the released implementation we examined, the LLaVA-style deletion is applied to Qwen as well, with no model-specific check.</w:t>
       </w:r>
     </w:p>
     <w:p>
@@ -2074,13 +2659,119 @@
     </w:p>
     <w:p>
       <w:pPr>
+        <w:spacing w:after="30"/>
+      </w:pPr>
+      <w:r>
+        <w:rPr>
+          <w:sz w:val="2"/>
+          <w:szCs w:val="2"/>
+        </w:rPr>
+        <w:t xml:space="preserve"/>
+      </w:r>
+    </w:p>
+    <w:tbl>
+      <w:tblPr>
+        <w:tblW w:type="dxa" w:w="9216"/>
+        <w:jc w:val="center"/>
+        <w:tblBorders>
+          <w:top w:val="single" w:color="000000" w:sz="6"/>
+          <w:left w:val="single" w:color="000000" w:sz="6"/>
+          <w:bottom w:val="single" w:color="000000" w:sz="6"/>
+          <w:right w:val="single" w:color="000000" w:sz="6"/>
+          <w:insideH w:val="single" w:color="000000" w:sz="6"/>
+          <w:insideV w:val="single" w:color="000000" w:sz="6"/>
+        </w:tblBorders>
+        <w:tblLayout w:type="fixed"/>
+      </w:tblPr>
+      <w:tblGrid>
+        <w:gridCol w:w="9216"/>
+      </w:tblGrid>
+      <w:tr>
+        <w:tc>
+          <w:tcPr>
+            <w:tcW w:type="dxa" w:w="9216"/>
+            <w:tcBorders>
+              <w:top w:val="single" w:color="000000" w:sz="6"/>
+              <w:left w:val="single" w:color="1F3864" w:sz="18"/>
+              <w:bottom w:val="single" w:color="000000" w:sz="6"/>
+              <w:right w:val="single" w:color="000000" w:sz="6"/>
+            </w:tcBorders>
+            <w:shd w:fill="E8EEF7" w:val="clear"/>
+            <w:tcMar>
+              <w:top w:type="dxa" w:w="130"/>
+              <w:left w:type="dxa" w:w="170"/>
+              <w:bottom w:type="dxa" w:w="130"/>
+              <w:right w:type="dxa" w:w="150"/>
+            </w:tcMar>
+          </w:tcPr>
+          <w:p>
+            <w:pPr>
+              <w:spacing w:after="70"/>
+            </w:pPr>
+            <w:r>
+              <w:rPr>
+                <w:rFonts w:ascii="Kalam" w:cs="Kalam" w:eastAsia="Kalam" w:hAnsi="Kalam"/>
+                <w:b/>
+                <w:bCs/>
+                <w:color w:val="1F3864"/>
+                <w:sz w:val="26"/>
+                <w:szCs w:val="26"/>
+              </w:rPr>
+              <w:t xml:space="preserve">How layers are counted here</w:t>
+            </w:r>
+          </w:p>
+          <w:p>
+            <w:pPr>
+              <w:spacing w:after="55" w:line="258"/>
+              <w:jc w:val="both"/>
+            </w:pPr>
+            <w:r>
+              <w:rPr>
+                <w:rFonts w:ascii="Times New Roman" w:cs="Times New Roman" w:eastAsia="Times New Roman" w:hAnsi="Times New Roman"/>
+                <w:sz w:val="22"/>
+                <w:szCs w:val="22"/>
+              </w:rPr>
+              <w:t xml:space="preserve">Everything below is expressed as the number of layers that still had access to the image, counting from the first. Deleting before layer 12 of 28 means twelve layers had access and sixteen did not.</w:t>
+            </w:r>
+          </w:p>
+          <w:p>
+            <w:pPr>
+              <w:spacing w:after="55" w:line="258"/>
+              <w:jc w:val="both"/>
+            </w:pPr>
+            <w:r>
+              <w:rPr>
+                <w:rFonts w:ascii="Times New Roman" w:cs="Times New Roman" w:eastAsia="Times New Roman" w:hAnsi="Times New Roman"/>
+                <w:sz w:val="22"/>
+                <w:szCs w:val="22"/>
+              </w:rPr>
+              <w:t xml:space="preserve">This is not the same as the index a method writes in its code. BTP counts decoder layers from one and deletes before the named layer, so its end_layer of 23 leaves twenty-two layers with access. Our sweeps and tool count from zero. The two differ by one, and an earlier draft of this report conflated them.</w:t>
+            </w:r>
+          </w:p>
+        </w:tc>
+      </w:tr>
+    </w:tbl>
+    <w:p>
+      <w:pPr>
+        <w:spacing w:after="120"/>
+      </w:pPr>
+      <w:r>
+        <w:rPr>
+          <w:sz w:val="2"/>
+          <w:szCs w:val="2"/>
+        </w:rPr>
+        <w:t xml:space="preserve"/>
+      </w:r>
+    </w:p>
+    <w:p>
+      <w:pPr>
         <w:spacing w:after="50" w:before="110"/>
         <w:jc w:val="center"/>
       </w:pPr>
       <w:r>
         <w:drawing>
           <wp:inline distT="0" distB="0" distL="0" distR="0">
-            <wp:extent cx="5381625" cy="2190750"/>
+            <wp:extent cx="4953000" cy="2019300"/>
             <wp:effectExtent t="0" r="0" b="0" l="0"/>
             <wp:docPr id="1" name="" descr="" title=""/>
             <wp:cNvGraphicFramePr>
@@ -2105,7 +2796,7 @@
                   <pic:spPr bwMode="auto">
                     <a:xfrm>
                       <a:off x="0" y="0"/>
-                      <a:ext cx="5381625" cy="2190750"/>
+                      <a:ext cx="4953000" cy="2019300"/>
                     </a:xfrm>
                     <a:prstGeom prst="rect">
                       <a:avLst/>
@@ -2146,7 +2837,7 @@
           <w:sz w:val="24"/>
           <w:szCs w:val="24"/>
         </w:rPr>
-        <w:t xml:space="preserve">Both curves have the same shape. Accuracy sits on a floor while the deletion happens early, then rises steeply once it happens late enough. The models keep drawing on image tokens until a certain depth, and after that they no longer need them.</w:t>
+        <w:t xml:space="preserve">Both curves have the same shape. Accuracy sits on a floor while the deletion happens early, then rises steeply once it happens late enough. The results indicate that performance remains sensitive to visual token access until a particular depth, after which the effect of complete deletion becomes much smaller. We measure the effect of removing the tokens, not what the model does with them, so we describe the sensitivity rather than infer an internal mechanism.</w:t>
       </w:r>
     </w:p>
     <w:tbl>
@@ -2242,7 +2933,7 @@
                 <w:sz w:val="21"/>
                 <w:szCs w:val="21"/>
               </w:rPr>
-              <w:t xml:space="preserve">Layers</w:t>
+              <w:t xml:space="preserve">Decoder layers</w:t>
             </w:r>
           </w:p>
         </w:tc>
@@ -2278,7 +2969,7 @@
                 <w:sz w:val="21"/>
                 <w:szCs w:val="21"/>
               </w:rPr>
-              <w:t xml:space="preserve">Half-of-baseline crossing</w:t>
+              <w:t xml:space="preserve">Layers needing the image</w:t>
             </w:r>
           </w:p>
         </w:tc>
@@ -2418,7 +3109,7 @@
                 <w:sz w:val="21"/>
                 <w:szCs w:val="21"/>
               </w:rPr>
-              <w:t xml:space="preserve">layer 18.0</w:t>
+              <w:t xml:space="preserve">18.0</w:t>
             </w:r>
           </w:p>
         </w:tc>
@@ -2555,7 +3246,7 @@
                 <w:sz w:val="21"/>
                 <w:szCs w:val="21"/>
               </w:rPr>
-              <w:t xml:space="preserve">layer 23.5</w:t>
+              <w:t xml:space="preserve">22.5</w:t>
             </w:r>
           </w:p>
         </w:tc>
@@ -2588,7 +3279,7 @@
                 <w:sz w:val="21"/>
                 <w:szCs w:val="21"/>
               </w:rPr>
-              <w:t xml:space="preserve">83.9 %</w:t>
+              <w:t xml:space="preserve">80.3 %</w:t>
             </w:r>
           </w:p>
         </w:tc>
@@ -2620,7 +3311,21 @@
           <w:sz w:val="19"/>
           <w:szCs w:val="19"/>
         </w:rPr>
-        <w:t xml:space="preserve">Table 3. The depth at which each model has finished reading. Sharp, and architecture-specific.</w:t>
+        <w:t xml:space="preserve">Table 4. The number of layers that still need visual tokens. Counted as layers with access, not as the index of the deletion, which differ by one.</w:t>
+      </w:r>
+    </w:p>
+    <w:p>
+      <w:pPr>
+        <w:spacing w:after="110" w:line="248"/>
+        <w:jc w:val="both"/>
+      </w:pPr>
+      <w:r>
+        <w:rPr>
+          <w:rFonts w:ascii="Times New Roman" w:cs="Times New Roman" w:eastAsia="Times New Roman" w:hAnsi="Times New Roman"/>
+          <w:sz w:val="24"/>
+          <w:szCs w:val="24"/>
+        </w:rPr>
+        <w:t xml:space="preserve">The fractional values need defining. We take the threshold to be the point at which accuracy crosses half of the unpruned baseline, and we obtain it by linear interpolation between the two measured layers that bracket that crossing. For Qwen those are 22 layers of access at 27.2 per cent and 23 at 74.8 per cent, giving 22.48. The bisection described later narrows the bracket; it does not change the definition. A different criterion, say 90 per cent of baseline, would move both numbers, so the two models should be compared against each other rather than read as absolutes.</w:t>
       </w:r>
     </w:p>
     <w:p>
@@ -2651,7 +3356,7 @@
           <w:sz w:val="24"/>
           <w:szCs w:val="24"/>
         </w:rPr>
-        <w:t xml:space="preserve">BTP's released configuration deletes at layer 23 of Qwen's 28. Our sweep places Qwen's threshold at 23.5, so the shipped constant lands on the last layer at which total discard is still ruinous.</w:t>
+        <w:t xml:space="preserve">BTP's released configuration sets end_layer to 23, which leaves 22 of Qwen's 28 layers with access to the image. Our sweep places the threshold at 22.5. The shipped constant therefore lands on the last value at which total discard is still ruinous.</w:t>
       </w:r>
     </w:p>
     <w:p>
@@ -2662,7 +3367,7 @@
       <w:r>
         <w:drawing>
           <wp:inline distT="0" distB="0" distL="0" distR="0">
-            <wp:extent cx="3238500" cy="2114550"/>
+            <wp:extent cx="2905125" cy="1895475"/>
             <wp:effectExtent t="0" r="0" b="0" l="0"/>
             <wp:docPr id="1" name="" descr="" title=""/>
             <wp:cNvGraphicFramePr>
@@ -2687,7 +3392,7 @@
                   <pic:spPr bwMode="auto">
                     <a:xfrm>
                       <a:off x="0" y="0"/>
-                      <a:ext cx="3238500" cy="2114550"/>
+                      <a:ext cx="2905125" cy="1895475"/>
                     </a:xfrm>
                     <a:prstGeom prst="rect">
                       <a:avLst/>
@@ -2714,7 +3419,7 @@
           <w:sz w:val="19"/>
           <w:szCs w:val="19"/>
         </w:rPr>
-        <w:t xml:space="preserve">Figure 3. One layer either side of the threshold, measured on TextVQA at 500 samples.</w:t>
+        <w:t xml:space="preserve">Figure 3. One layer either side of the threshold, measured on TextVQA at 500 samples. BTP allows 22.</w:t>
       </w:r>
     </w:p>
     <w:p>
@@ -2728,7 +3433,7 @@
           <w:sz w:val="24"/>
           <w:szCs w:val="24"/>
         </w:rPr>
-        <w:t xml:space="preserve">Had the constant been 24 rather than 23, the same code would have scored about 0.645 instead of 0.234. This is not a subtle tuning question. It is a cliff, and the released value sits at the bottom of it.</w:t>
+        <w:t xml:space="preserve">Had the constant allowed one more layer, the same code would have scored about 0.645 instead of 0.234 on TextVQA. These two figures come from the 500 sample threshold sweep and are therefore not the same numbers as the 200 sample intervention in Table 2, which gave 0.1725 and 0.7860 under a different configuration. This is not a subtle tuning question. It is a cliff, and the released value sits at the bottom of it. The threshold here is measured on TextVQA only; whether it sits at the same depth for documents or charts is the obvious next experiment and is not yet done.</w:t>
       </w:r>
     </w:p>
     <w:p>
@@ -2745,7 +3450,7 @@
           <w:sz w:val="28"/>
           <w:szCs w:val="28"/>
         </w:rPr>
-        <w:t xml:space="preserve">6.2  One difference we did not expect</w:t>
+        <w:t xml:space="preserve">6.2  The measurement does not depend on the instrument</w:t>
       </w:r>
     </w:p>
     <w:p>
@@ -2759,7 +3464,647 @@
           <w:sz w:val="24"/>
           <w:szCs w:val="24"/>
         </w:rPr>
-        <w:t xml:space="preserve">The two models do not behave identically at the top of the curve. InternVL recovers fully, reaching 101 per cent of baseline when the deletion is placed at layer 20 of 24, with four layers still to run. Qwen never quite does. It plateaus at 90.7 per cent even when the deletion is placed at layer 27 of 28. So Qwen continues to draw on visual tokens right to the end of the stack for roughly nine per cent of cases, while InternVL has genuinely finished with them. We report this because it was not predicted and it bears on how safe any late-stage discard can be.</w:t>
+        <w:t xml:space="preserve">Both sweeps above edit the model source, separately for each architecture, which is not something anyone else can reuse. So we also built the measurement as a tool that deletes the tokens with a forward hook and touches no source at all, and ran it on Qwen to see whether it agrees.</w:t>
+      </w:r>
+    </w:p>
+    <w:tbl>
+      <w:tblPr>
+        <w:tblW w:type="dxa" w:w="9216"/>
+        <w:jc w:val="center"/>
+        <w:tblBorders>
+          <w:top w:val="single" w:color="000000" w:sz="6"/>
+          <w:left w:val="single" w:color="000000" w:sz="6"/>
+          <w:bottom w:val="single" w:color="000000" w:sz="6"/>
+          <w:right w:val="single" w:color="000000" w:sz="6"/>
+          <w:insideH w:val="single" w:color="000000" w:sz="6"/>
+          <w:insideV w:val="single" w:color="000000" w:sz="6"/>
+        </w:tblBorders>
+        <w:tblLayout w:type="fixed"/>
+      </w:tblPr>
+      <w:tblGrid>
+        <w:gridCol w:w="3456"/>
+        <w:gridCol w:w="2880"/>
+        <w:gridCol w:w="2880"/>
+      </w:tblGrid>
+      <w:tr>
+        <w:trPr>
+          <w:cantSplit/>
+          <w:tblHeader/>
+        </w:trPr>
+        <w:tc>
+          <w:tcPr>
+            <w:tcW w:type="dxa" w:w="3456"/>
+            <w:tcBorders>
+              <w:top w:val="single" w:color="000000" w:sz="6"/>
+              <w:left w:val="single" w:color="000000" w:sz="6"/>
+              <w:bottom w:val="single" w:color="000000" w:sz="6"/>
+              <w:right w:val="single" w:color="000000" w:sz="6"/>
+            </w:tcBorders>
+            <w:shd w:fill="D9E1F0" w:val="clear"/>
+            <w:tcMar>
+              <w:top w:type="dxa" w:w="70"/>
+              <w:left w:type="dxa" w:w="100"/>
+              <w:bottom w:type="dxa" w:w="70"/>
+              <w:right w:type="dxa" w:w="100"/>
+            </w:tcMar>
+            <w:vAlign w:val="center"/>
+          </w:tcPr>
+          <w:p>
+            <w:pPr>
+              <w:spacing w:after="0" w:line="240"/>
+              <w:jc w:val="left"/>
+            </w:pPr>
+            <w:r>
+              <w:rPr>
+                <w:rFonts w:ascii="Times New Roman" w:cs="Times New Roman" w:eastAsia="Times New Roman" w:hAnsi="Times New Roman"/>
+                <w:b/>
+                <w:bCs/>
+                <w:color w:val="000000"/>
+                <w:sz w:val="21"/>
+                <w:szCs w:val="21"/>
+              </w:rPr>
+              <w:t xml:space="preserve">Layers with access</w:t>
+            </w:r>
+          </w:p>
+        </w:tc>
+        <w:tc>
+          <w:tcPr>
+            <w:tcW w:type="dxa" w:w="2880"/>
+            <w:tcBorders>
+              <w:top w:val="single" w:color="000000" w:sz="6"/>
+              <w:left w:val="single" w:color="000000" w:sz="6"/>
+              <w:bottom w:val="single" w:color="000000" w:sz="6"/>
+              <w:right w:val="single" w:color="000000" w:sz="6"/>
+            </w:tcBorders>
+            <w:shd w:fill="D9E1F0" w:val="clear"/>
+            <w:tcMar>
+              <w:top w:type="dxa" w:w="70"/>
+              <w:left w:type="dxa" w:w="100"/>
+              <w:bottom w:type="dxa" w:w="70"/>
+              <w:right w:type="dxa" w:w="100"/>
+            </w:tcMar>
+            <w:vAlign w:val="center"/>
+          </w:tcPr>
+          <w:p>
+            <w:pPr>
+              <w:spacing w:after="0" w:line="240"/>
+              <w:jc w:val="center"/>
+            </w:pPr>
+            <w:r>
+              <w:rPr>
+                <w:rFonts w:ascii="Times New Roman" w:cs="Times New Roman" w:eastAsia="Times New Roman" w:hAnsi="Times New Roman"/>
+                <w:b/>
+                <w:bCs/>
+                <w:color w:val="000000"/>
+                <w:sz w:val="21"/>
+                <w:szCs w:val="21"/>
+              </w:rPr>
+              <w:t xml:space="preserve">By source patch</w:t>
+            </w:r>
+          </w:p>
+        </w:tc>
+        <w:tc>
+          <w:tcPr>
+            <w:tcW w:type="dxa" w:w="2880"/>
+            <w:tcBorders>
+              <w:top w:val="single" w:color="000000" w:sz="6"/>
+              <w:left w:val="single" w:color="000000" w:sz="6"/>
+              <w:bottom w:val="single" w:color="000000" w:sz="6"/>
+              <w:right w:val="single" w:color="000000" w:sz="6"/>
+            </w:tcBorders>
+            <w:shd w:fill="D9E1F0" w:val="clear"/>
+            <w:tcMar>
+              <w:top w:type="dxa" w:w="70"/>
+              <w:left w:type="dxa" w:w="100"/>
+              <w:bottom w:type="dxa" w:w="70"/>
+              <w:right w:type="dxa" w:w="100"/>
+            </w:tcMar>
+            <w:vAlign w:val="center"/>
+          </w:tcPr>
+          <w:p>
+            <w:pPr>
+              <w:spacing w:after="0" w:line="240"/>
+              <w:jc w:val="center"/>
+            </w:pPr>
+            <w:r>
+              <w:rPr>
+                <w:rFonts w:ascii="Times New Roman" w:cs="Times New Roman" w:eastAsia="Times New Roman" w:hAnsi="Times New Roman"/>
+                <w:b/>
+                <w:bCs/>
+                <w:color w:val="000000"/>
+                <w:sz w:val="21"/>
+                <w:szCs w:val="21"/>
+              </w:rPr>
+              <w:t xml:space="preserve">By forward hook</w:t>
+            </w:r>
+          </w:p>
+        </w:tc>
+      </w:tr>
+      <w:tr>
+        <w:trPr>
+          <w:cantSplit/>
+        </w:trPr>
+        <w:tc>
+          <w:tcPr>
+            <w:tcW w:type="dxa" w:w="3456"/>
+            <w:tcBorders>
+              <w:top w:val="single" w:color="000000" w:sz="6"/>
+              <w:left w:val="single" w:color="000000" w:sz="6"/>
+              <w:bottom w:val="single" w:color="000000" w:sz="6"/>
+              <w:right w:val="single" w:color="000000" w:sz="6"/>
+            </w:tcBorders>
+            <w:tcMar>
+              <w:top w:type="dxa" w:w="70"/>
+              <w:left w:type="dxa" w:w="100"/>
+              <w:bottom w:type="dxa" w:w="70"/>
+              <w:right w:type="dxa" w:w="100"/>
+            </w:tcMar>
+            <w:vAlign w:val="center"/>
+          </w:tcPr>
+          <w:p>
+            <w:pPr>
+              <w:spacing w:after="0" w:line="240"/>
+              <w:jc w:val="left"/>
+            </w:pPr>
+            <w:r>
+              <w:rPr>
+                <w:rFonts w:ascii="Times New Roman" w:cs="Times New Roman" w:eastAsia="Times New Roman" w:hAnsi="Times New Roman"/>
+                <w:color w:val="000000"/>
+                <w:sz w:val="21"/>
+                <w:szCs w:val="21"/>
+              </w:rPr>
+              <w:t xml:space="preserve">13</w:t>
+            </w:r>
+          </w:p>
+        </w:tc>
+        <w:tc>
+          <w:tcPr>
+            <w:tcW w:type="dxa" w:w="2880"/>
+            <w:tcBorders>
+              <w:top w:val="single" w:color="000000" w:sz="6"/>
+              <w:left w:val="single" w:color="000000" w:sz="6"/>
+              <w:bottom w:val="single" w:color="000000" w:sz="6"/>
+              <w:right w:val="single" w:color="000000" w:sz="6"/>
+            </w:tcBorders>
+            <w:tcMar>
+              <w:top w:type="dxa" w:w="70"/>
+              <w:left w:type="dxa" w:w="100"/>
+              <w:bottom w:type="dxa" w:w="70"/>
+              <w:right w:type="dxa" w:w="100"/>
+            </w:tcMar>
+            <w:vAlign w:val="center"/>
+          </w:tcPr>
+          <w:p>
+            <w:pPr>
+              <w:spacing w:after="0" w:line="240"/>
+              <w:jc w:val="center"/>
+            </w:pPr>
+            <w:r>
+              <w:rPr>
+                <w:rFonts w:ascii="Times New Roman" w:cs="Times New Roman" w:eastAsia="Times New Roman" w:hAnsi="Times New Roman"/>
+                <w:color w:val="000000"/>
+                <w:sz w:val="21"/>
+                <w:szCs w:val="21"/>
+              </w:rPr>
+              <w:t xml:space="preserve">15.7 %</w:t>
+            </w:r>
+          </w:p>
+        </w:tc>
+        <w:tc>
+          <w:tcPr>
+            <w:tcW w:type="dxa" w:w="2880"/>
+            <w:tcBorders>
+              <w:top w:val="single" w:color="000000" w:sz="6"/>
+              <w:left w:val="single" w:color="000000" w:sz="6"/>
+              <w:bottom w:val="single" w:color="000000" w:sz="6"/>
+              <w:right w:val="single" w:color="000000" w:sz="6"/>
+            </w:tcBorders>
+            <w:tcMar>
+              <w:top w:type="dxa" w:w="70"/>
+              <w:left w:type="dxa" w:w="100"/>
+              <w:bottom w:type="dxa" w:w="70"/>
+              <w:right w:type="dxa" w:w="100"/>
+            </w:tcMar>
+            <w:vAlign w:val="center"/>
+          </w:tcPr>
+          <w:p>
+            <w:pPr>
+              <w:spacing w:after="0" w:line="240"/>
+              <w:jc w:val="center"/>
+            </w:pPr>
+            <w:r>
+              <w:rPr>
+                <w:rFonts w:ascii="Times New Roman" w:cs="Times New Roman" w:eastAsia="Times New Roman" w:hAnsi="Times New Roman"/>
+                <w:color w:val="000000"/>
+                <w:sz w:val="21"/>
+                <w:szCs w:val="21"/>
+              </w:rPr>
+              <w:t xml:space="preserve">17.0 %</w:t>
+            </w:r>
+          </w:p>
+        </w:tc>
+      </w:tr>
+      <w:tr>
+        <w:trPr>
+          <w:cantSplit/>
+        </w:trPr>
+        <w:tc>
+          <w:tcPr>
+            <w:tcW w:type="dxa" w:w="3456"/>
+            <w:tcBorders>
+              <w:top w:val="single" w:color="000000" w:sz="6"/>
+              <w:left w:val="single" w:color="000000" w:sz="6"/>
+              <w:bottom w:val="single" w:color="000000" w:sz="6"/>
+              <w:right w:val="single" w:color="000000" w:sz="6"/>
+            </w:tcBorders>
+            <w:tcMar>
+              <w:top w:type="dxa" w:w="70"/>
+              <w:left w:type="dxa" w:w="100"/>
+              <w:bottom w:type="dxa" w:w="70"/>
+              <w:right w:type="dxa" w:w="100"/>
+            </w:tcMar>
+            <w:vAlign w:val="center"/>
+          </w:tcPr>
+          <w:p>
+            <w:pPr>
+              <w:spacing w:after="0" w:line="240"/>
+              <w:jc w:val="left"/>
+            </w:pPr>
+            <w:r>
+              <w:rPr>
+                <w:rFonts w:ascii="Times New Roman" w:cs="Times New Roman" w:eastAsia="Times New Roman" w:hAnsi="Times New Roman"/>
+                <w:color w:val="000000"/>
+                <w:sz w:val="21"/>
+                <w:szCs w:val="21"/>
+              </w:rPr>
+              <w:t xml:space="preserve">22</w:t>
+            </w:r>
+          </w:p>
+        </w:tc>
+        <w:tc>
+          <w:tcPr>
+            <w:tcW w:type="dxa" w:w="2880"/>
+            <w:tcBorders>
+              <w:top w:val="single" w:color="000000" w:sz="6"/>
+              <w:left w:val="single" w:color="000000" w:sz="6"/>
+              <w:bottom w:val="single" w:color="000000" w:sz="6"/>
+              <w:right w:val="single" w:color="000000" w:sz="6"/>
+            </w:tcBorders>
+            <w:tcMar>
+              <w:top w:type="dxa" w:w="70"/>
+              <w:left w:type="dxa" w:w="100"/>
+              <w:bottom w:type="dxa" w:w="70"/>
+              <w:right w:type="dxa" w:w="100"/>
+            </w:tcMar>
+            <w:vAlign w:val="center"/>
+          </w:tcPr>
+          <w:p>
+            <w:pPr>
+              <w:spacing w:after="0" w:line="240"/>
+              <w:jc w:val="center"/>
+            </w:pPr>
+            <w:r>
+              <w:rPr>
+                <w:rFonts w:ascii="Times New Roman" w:cs="Times New Roman" w:eastAsia="Times New Roman" w:hAnsi="Times New Roman"/>
+                <w:color w:val="000000"/>
+                <w:sz w:val="21"/>
+                <w:szCs w:val="21"/>
+              </w:rPr>
+              <w:t xml:space="preserve">27.2 %</w:t>
+            </w:r>
+          </w:p>
+        </w:tc>
+        <w:tc>
+          <w:tcPr>
+            <w:tcW w:type="dxa" w:w="2880"/>
+            <w:tcBorders>
+              <w:top w:val="single" w:color="000000" w:sz="6"/>
+              <w:left w:val="single" w:color="000000" w:sz="6"/>
+              <w:bottom w:val="single" w:color="000000" w:sz="6"/>
+              <w:right w:val="single" w:color="000000" w:sz="6"/>
+            </w:tcBorders>
+            <w:tcMar>
+              <w:top w:type="dxa" w:w="70"/>
+              <w:left w:type="dxa" w:w="100"/>
+              <w:bottom w:type="dxa" w:w="70"/>
+              <w:right w:type="dxa" w:w="100"/>
+            </w:tcMar>
+            <w:vAlign w:val="center"/>
+          </w:tcPr>
+          <w:p>
+            <w:pPr>
+              <w:spacing w:after="0" w:line="240"/>
+              <w:jc w:val="center"/>
+            </w:pPr>
+            <w:r>
+              <w:rPr>
+                <w:rFonts w:ascii="Times New Roman" w:cs="Times New Roman" w:eastAsia="Times New Roman" w:hAnsi="Times New Roman"/>
+                <w:color w:val="000000"/>
+                <w:sz w:val="21"/>
+                <w:szCs w:val="21"/>
+              </w:rPr>
+              <w:t xml:space="preserve">27.5 %</w:t>
+            </w:r>
+          </w:p>
+        </w:tc>
+      </w:tr>
+      <w:tr>
+        <w:trPr>
+          <w:cantSplit/>
+        </w:trPr>
+        <w:tc>
+          <w:tcPr>
+            <w:tcW w:type="dxa" w:w="3456"/>
+            <w:tcBorders>
+              <w:top w:val="single" w:color="000000" w:sz="6"/>
+              <w:left w:val="single" w:color="000000" w:sz="6"/>
+              <w:bottom w:val="single" w:color="000000" w:sz="6"/>
+              <w:right w:val="single" w:color="000000" w:sz="6"/>
+            </w:tcBorders>
+            <w:tcMar>
+              <w:top w:type="dxa" w:w="70"/>
+              <w:left w:type="dxa" w:w="100"/>
+              <w:bottom w:type="dxa" w:w="70"/>
+              <w:right w:type="dxa" w:w="100"/>
+            </w:tcMar>
+            <w:vAlign w:val="center"/>
+          </w:tcPr>
+          <w:p>
+            <w:pPr>
+              <w:spacing w:after="0" w:line="240"/>
+              <w:jc w:val="left"/>
+            </w:pPr>
+            <w:r>
+              <w:rPr>
+                <w:rFonts w:ascii="Times New Roman" w:cs="Times New Roman" w:eastAsia="Times New Roman" w:hAnsi="Times New Roman"/>
+                <w:color w:val="000000"/>
+                <w:sz w:val="21"/>
+                <w:szCs w:val="21"/>
+              </w:rPr>
+              <w:t xml:space="preserve">23</w:t>
+            </w:r>
+          </w:p>
+        </w:tc>
+        <w:tc>
+          <w:tcPr>
+            <w:tcW w:type="dxa" w:w="2880"/>
+            <w:tcBorders>
+              <w:top w:val="single" w:color="000000" w:sz="6"/>
+              <w:left w:val="single" w:color="000000" w:sz="6"/>
+              <w:bottom w:val="single" w:color="000000" w:sz="6"/>
+              <w:right w:val="single" w:color="000000" w:sz="6"/>
+            </w:tcBorders>
+            <w:tcMar>
+              <w:top w:type="dxa" w:w="70"/>
+              <w:left w:type="dxa" w:w="100"/>
+              <w:bottom w:type="dxa" w:w="70"/>
+              <w:right w:type="dxa" w:w="100"/>
+            </w:tcMar>
+            <w:vAlign w:val="center"/>
+          </w:tcPr>
+          <w:p>
+            <w:pPr>
+              <w:spacing w:after="0" w:line="240"/>
+              <w:jc w:val="center"/>
+            </w:pPr>
+            <w:r>
+              <w:rPr>
+                <w:rFonts w:ascii="Times New Roman" w:cs="Times New Roman" w:eastAsia="Times New Roman" w:hAnsi="Times New Roman"/>
+                <w:color w:val="000000"/>
+                <w:sz w:val="21"/>
+                <w:szCs w:val="21"/>
+              </w:rPr>
+              <w:t xml:space="preserve">74.8 %</w:t>
+            </w:r>
+          </w:p>
+        </w:tc>
+        <w:tc>
+          <w:tcPr>
+            <w:tcW w:type="dxa" w:w="2880"/>
+            <w:tcBorders>
+              <w:top w:val="single" w:color="000000" w:sz="6"/>
+              <w:left w:val="single" w:color="000000" w:sz="6"/>
+              <w:bottom w:val="single" w:color="000000" w:sz="6"/>
+              <w:right w:val="single" w:color="000000" w:sz="6"/>
+            </w:tcBorders>
+            <w:tcMar>
+              <w:top w:type="dxa" w:w="70"/>
+              <w:left w:type="dxa" w:w="100"/>
+              <w:bottom w:type="dxa" w:w="70"/>
+              <w:right w:type="dxa" w:w="100"/>
+            </w:tcMar>
+            <w:vAlign w:val="center"/>
+          </w:tcPr>
+          <w:p>
+            <w:pPr>
+              <w:spacing w:after="0" w:line="240"/>
+              <w:jc w:val="center"/>
+            </w:pPr>
+            <w:r>
+              <w:rPr>
+                <w:rFonts w:ascii="Times New Roman" w:cs="Times New Roman" w:eastAsia="Times New Roman" w:hAnsi="Times New Roman"/>
+                <w:color w:val="000000"/>
+                <w:sz w:val="21"/>
+                <w:szCs w:val="21"/>
+              </w:rPr>
+              <w:t xml:space="preserve">75.8 %</w:t>
+            </w:r>
+          </w:p>
+        </w:tc>
+      </w:tr>
+      <w:tr>
+        <w:trPr>
+          <w:cantSplit/>
+        </w:trPr>
+        <w:tc>
+          <w:tcPr>
+            <w:tcW w:type="dxa" w:w="3456"/>
+            <w:tcBorders>
+              <w:top w:val="single" w:color="000000" w:sz="6"/>
+              <w:left w:val="single" w:color="000000" w:sz="6"/>
+              <w:bottom w:val="single" w:color="000000" w:sz="6"/>
+              <w:right w:val="single" w:color="000000" w:sz="6"/>
+            </w:tcBorders>
+            <w:tcMar>
+              <w:top w:type="dxa" w:w="70"/>
+              <w:left w:type="dxa" w:w="100"/>
+              <w:bottom w:type="dxa" w:w="70"/>
+              <w:right w:type="dxa" w:w="100"/>
+            </w:tcMar>
+            <w:vAlign w:val="center"/>
+          </w:tcPr>
+          <w:p>
+            <w:pPr>
+              <w:spacing w:after="0" w:line="240"/>
+              <w:jc w:val="left"/>
+            </w:pPr>
+            <w:r>
+              <w:rPr>
+                <w:rFonts w:ascii="Times New Roman" w:cs="Times New Roman" w:eastAsia="Times New Roman" w:hAnsi="Times New Roman"/>
+                <w:color w:val="000000"/>
+                <w:sz w:val="21"/>
+                <w:szCs w:val="21"/>
+              </w:rPr>
+              <w:t xml:space="preserve">24</w:t>
+            </w:r>
+          </w:p>
+        </w:tc>
+        <w:tc>
+          <w:tcPr>
+            <w:tcW w:type="dxa" w:w="2880"/>
+            <w:tcBorders>
+              <w:top w:val="single" w:color="000000" w:sz="6"/>
+              <w:left w:val="single" w:color="000000" w:sz="6"/>
+              <w:bottom w:val="single" w:color="000000" w:sz="6"/>
+              <w:right w:val="single" w:color="000000" w:sz="6"/>
+            </w:tcBorders>
+            <w:tcMar>
+              <w:top w:type="dxa" w:w="70"/>
+              <w:left w:type="dxa" w:w="100"/>
+              <w:bottom w:type="dxa" w:w="70"/>
+              <w:right w:type="dxa" w:w="100"/>
+            </w:tcMar>
+            <w:vAlign w:val="center"/>
+          </w:tcPr>
+          <w:p>
+            <w:pPr>
+              <w:spacing w:after="0" w:line="240"/>
+              <w:jc w:val="center"/>
+            </w:pPr>
+            <w:r>
+              <w:rPr>
+                <w:rFonts w:ascii="Times New Roman" w:cs="Times New Roman" w:eastAsia="Times New Roman" w:hAnsi="Times New Roman"/>
+                <w:color w:val="000000"/>
+                <w:sz w:val="21"/>
+                <w:szCs w:val="21"/>
+              </w:rPr>
+              <w:t xml:space="preserve">88.5 %</w:t>
+            </w:r>
+          </w:p>
+        </w:tc>
+        <w:tc>
+          <w:tcPr>
+            <w:tcW w:type="dxa" w:w="2880"/>
+            <w:tcBorders>
+              <w:top w:val="single" w:color="000000" w:sz="6"/>
+              <w:left w:val="single" w:color="000000" w:sz="6"/>
+              <w:bottom w:val="single" w:color="000000" w:sz="6"/>
+              <w:right w:val="single" w:color="000000" w:sz="6"/>
+            </w:tcBorders>
+            <w:tcMar>
+              <w:top w:type="dxa" w:w="70"/>
+              <w:left w:type="dxa" w:w="100"/>
+              <w:bottom w:type="dxa" w:w="70"/>
+              <w:right w:type="dxa" w:w="100"/>
+            </w:tcMar>
+            <w:vAlign w:val="center"/>
+          </w:tcPr>
+          <w:p>
+            <w:pPr>
+              <w:spacing w:after="0" w:line="240"/>
+              <w:jc w:val="center"/>
+            </w:pPr>
+            <w:r>
+              <w:rPr>
+                <w:rFonts w:ascii="Times New Roman" w:cs="Times New Roman" w:eastAsia="Times New Roman" w:hAnsi="Times New Roman"/>
+                <w:color w:val="000000"/>
+                <w:sz w:val="21"/>
+                <w:szCs w:val="21"/>
+              </w:rPr>
+              <w:t xml:space="preserve">86.3 %</w:t>
+            </w:r>
+          </w:p>
+        </w:tc>
+      </w:tr>
+    </w:tbl>
+    <w:p>
+      <w:pPr>
+        <w:spacing w:after="45"/>
+      </w:pPr>
+      <w:r>
+        <w:rPr>
+          <w:sz w:val="2"/>
+          <w:szCs w:val="2"/>
+        </w:rPr>
+        <w:t xml:space="preserve"/>
+      </w:r>
+    </w:p>
+    <w:p>
+      <w:pPr>
+        <w:spacing w:after="140"/>
+        <w:jc w:val="center"/>
+      </w:pPr>
+      <w:r>
+        <w:rPr>
+          <w:rFonts w:ascii="Times New Roman" w:cs="Times New Roman" w:eastAsia="Times New Roman" w:hAnsi="Times New Roman"/>
+          <w:i/>
+          <w:iCs/>
+          <w:color w:val="444444"/>
+          <w:sz w:val="19"/>
+          <w:szCs w:val="19"/>
+        </w:rPr>
+        <w:t xml:space="preserve">Table 5. The same threshold from two independent instruments on different samples. Job 423959.</w:t>
+      </w:r>
+    </w:p>
+    <w:p>
+      <w:pPr>
+        <w:spacing w:after="110" w:line="248"/>
+        <w:jc w:val="both"/>
+      </w:pPr>
+      <w:r>
+        <w:rPr>
+          <w:rFonts w:ascii="Times New Roman" w:cs="Times New Roman" w:eastAsia="Times New Roman" w:hAnsi="Times New Roman"/>
+          <w:sz w:val="24"/>
+          <w:szCs w:val="24"/>
+        </w:rPr>
+        <w:t xml:space="preserve">The two agree within a couple of points across the curve, on different sample sets. On this model, then, the threshold is not an artefact of how it was measured. We have run the comparison on one model, so this establishes that the tool works, not that it will agree everywhere. The tool needs no training, no calibration set and no changes to the model, and a coarse sweep with bisection locates the threshold in about seven evaluations.</w:t>
+      </w:r>
+    </w:p>
+    <w:p>
+      <w:pPr>
+        <w:spacing w:after="110" w:line="248"/>
+        <w:jc w:val="both"/>
+      </w:pPr>
+      <w:r>
+        <w:rPr>
+          <w:rFonts w:ascii="Times New Roman" w:cs="Times New Roman" w:eastAsia="Times New Roman" w:hAnsi="Times New Roman"/>
+          <w:i/>
+          <w:iCs/>
+          <w:sz w:val="24"/>
+          <w:szCs w:val="24"/>
+        </w:rPr>
+        <w:t xml:space="preserve">This comparison also corrected an error of ours. BTP counts decoder layers from one, our hook counts from zero, and both delete before the named layer runs, so the same experiment carries two different labels. An earlier draft quoted Qwen's threshold as 84 per cent by taking the raw layer index rather than the number of layers with access. Measured consistently it is 80 per cent. The figures and tables above use layers with access throughout.</w:t>
+      </w:r>
+    </w:p>
+    <w:p>
+      <w:pPr>
+        <w:pStyle w:val="Heading2"/>
+        <w:spacing w:after="90" w:before="170"/>
+      </w:pPr>
+      <w:r>
+        <w:rPr>
+          <w:rFonts w:ascii="Kalam" w:cs="Kalam" w:eastAsia="Kalam" w:hAnsi="Kalam"/>
+          <w:b/>
+          <w:bCs/>
+          <w:color w:val="1D6B6B"/>
+          <w:sz w:val="28"/>
+          <w:szCs w:val="28"/>
+        </w:rPr>
+        <w:t xml:space="preserve">6.3  One difference we did not expect</w:t>
+      </w:r>
+    </w:p>
+    <w:p>
+      <w:pPr>
+        <w:spacing w:after="110" w:line="248"/>
+        <w:jc w:val="both"/>
+      </w:pPr>
+      <w:r>
+        <w:rPr>
+          <w:rFonts w:ascii="Times New Roman" w:cs="Times New Roman" w:eastAsia="Times New Roman" w:hAnsi="Times New Roman"/>
+          <w:sz w:val="24"/>
+          <w:szCs w:val="24"/>
+        </w:rPr>
+        <w:t xml:space="preserve">The two models do not behave identically at the top of the curve. InternVL recovers fully, reaching 101 per cent of baseline with 20 of its 24 layers given access, four still to run. Qwen does not. Its accuracy plateaus at about 90.7 per cent even with 26 of its 28 layers given access, which suggests that visual information may remain useful very late in the decoder for some subset of examples. We cannot say from this experiment which examples those are, or how many. We report it because it was not predicted and it bears on how safe any late-stage discard can be.</w:t>
       </w:r>
     </w:p>
     <w:p>
@@ -2790,7 +4135,7 @@
           <w:sz w:val="24"/>
           <w:szCs w:val="24"/>
         </w:rPr>
-        <w:t xml:space="preserve">With the mechanism understood, we evaluated a corrected arm on the full benchmark suite. Baseline and as-released numbers were reused from earlier phases with matching sample limits, so only the corrected arm needed fresh GPU time.</w:t>
+        <w:t xml:space="preserve">With the mechanism understood, we evaluated a corrected arm across the benchmarks used in our comparison. Baseline and as-released numbers were reused from earlier phases with matching sample limits, so only the corrected arm needed fresh GPU time.</w:t>
       </w:r>
     </w:p>
     <w:tbl>
@@ -4662,7 +6007,7 @@
           <w:sz w:val="19"/>
           <w:szCs w:val="19"/>
         </w:rPr>
-        <w:t xml:space="preserve">Table 4. Qwen2.5-VL-7B. Highlighted rows need the model to read.</w:t>
+        <w:t xml:space="preserve">Table 6. Qwen2.5-VL-7B. Kept is the corrected score as a percentage of the corresponding baseline. Highlighted rows need the model to read.</w:t>
       </w:r>
     </w:p>
     <w:p>
@@ -4673,7 +6018,7 @@
       <w:r>
         <w:drawing>
           <wp:inline distT="0" distB="0" distL="0" distR="0">
-            <wp:extent cx="4286250" cy="2181225"/>
+            <wp:extent cx="3857625" cy="1962150"/>
             <wp:effectExtent t="0" r="0" b="0" l="0"/>
             <wp:docPr id="1" name="" descr="" title=""/>
             <wp:cNvGraphicFramePr>
@@ -4698,7 +6043,7 @@
                   <pic:spPr bwMode="auto">
                     <a:xfrm>
                       <a:off x="0" y="0"/>
-                      <a:ext cx="4286250" cy="2181225"/>
+                      <a:ext cx="3857625" cy="1962150"/>
                     </a:xfrm>
                     <a:prstGeom prst="rect">
                       <a:avLst/>
@@ -4756,7 +6101,7 @@
           <w:sz w:val="24"/>
           <w:szCs w:val="24"/>
         </w:rPr>
-        <w:t xml:space="preserve">On POPE, MME, MMBench and ScienceQA the released arm and the corrected arm are the same within noise: 86.2 against 86.3, 1659 against 1651, 79.3 against 79.0, 85.1 against 85.0. Those tasks do not consult the image after layer 23.</w:t>
+        <w:t xml:space="preserve">The paper reports six benchmarks: GQA, MME, MMBench, POPE, ScienceQA and MM-Vet. We evaluated five of them. MM-Vet is omitted because it is scored by a language model judge, which would add a second source of variance to a comparison meant to isolate one line of code.</w:t>
       </w:r>
     </w:p>
     <w:p>
@@ -4770,7 +6115,1575 @@
           <w:sz w:val="24"/>
           <w:szCs w:val="24"/>
         </w:rPr>
-        <w:t xml:space="preserve">Averaged across the paper's own five benchmarks, the released code retains 96.1 per cent of baseline against a claimed 96 to 98 per cent. The corrected arm gives 96.9 per cent. The fault does not merely slip past individual benchmarks; it slips past the average. Anyone evaluating on that suite would call the implementation a clean success. On the three reading tasks the same two arms score 28.4 and 77.9 per cent.</w:t>
+        <w:t xml:space="preserve">Across all five, the released arm and the corrected arm are close: POPE 86.2 against 86.3, MME 1659 against 1651, MMBench 79.3 against 79.0, ScienceQA 85.1 against 85.0, and GQA 55.9 against 58.8. GQA shows the largest gap of the five at 2.9 points, still an order of magnitude smaller than the reading tasks.</w:t>
+      </w:r>
+    </w:p>
+    <w:p>
+      <w:pPr>
+        <w:spacing w:after="110" w:line="248"/>
+        <w:jc w:val="both"/>
+      </w:pPr>
+      <w:r>
+        <w:rPr>
+          <w:rFonts w:ascii="Times New Roman" w:cs="Times New Roman" w:eastAsia="Times New Roman" w:hAnsi="Times New Roman"/>
+          <w:sz w:val="24"/>
+          <w:szCs w:val="24"/>
+        </w:rPr>
+        <w:t xml:space="preserve">Averaged across those five, the released code retains 96.1 per cent of baseline against a claimed 96 to 98 per cent. The corrected arm gives 96.9 per cent. The fault does not merely slip past individual benchmarks; it slips past the average. An evaluation restricted to that suite could therefore classify the implementation as successful, despite the failure on text-reading tasks. On the three reading tasks the same two arms score 28.4 and 77.9 per cent.</w:t>
+      </w:r>
+    </w:p>
+    <w:p>
+      <w:pPr>
+        <w:pStyle w:val="Heading2"/>
+        <w:spacing w:after="90" w:before="170"/>
+      </w:pPr>
+      <w:r>
+        <w:rPr>
+          <w:rFonts w:ascii="Kalam" w:cs="Kalam" w:eastAsia="Kalam" w:hAnsi="Kalam"/>
+          <w:b/>
+          <w:bCs/>
+          <w:color w:val="1D6B6B"/>
+          <w:sz w:val="28"/>
+          <w:szCs w:val="28"/>
+        </w:rPr>
+        <w:t xml:space="preserve">7.2  Separating the two effects</w:t>
+      </w:r>
+    </w:p>
+    <w:p>
+      <w:pPr>
+        <w:spacing w:after="110" w:line="248"/>
+        <w:jc w:val="both"/>
+      </w:pPr>
+      <w:r>
+        <w:rPr>
+          <w:rFonts w:ascii="Times New Roman" w:cs="Times New Roman" w:eastAsia="Times New Roman" w:hAnsi="Times New Roman"/>
+          <w:sz w:val="24"/>
+          <w:szCs w:val="24"/>
+        </w:rPr>
+        <w:t xml:space="preserve">The three arms allow the loss to be split. The corrected arm still prunes to 12.5 per cent; it simply does not delete the remainder. So the gap between baseline and corrected is the cost of pruning, and the gap between corrected and released is the cost of the deletion. They are different quantities and should not be quoted as one.</w:t>
+      </w:r>
+    </w:p>
+    <w:tbl>
+      <w:tblPr>
+        <w:tblW w:type="dxa" w:w="9216"/>
+        <w:jc w:val="center"/>
+        <w:tblBorders>
+          <w:top w:val="single" w:color="000000" w:sz="6"/>
+          <w:left w:val="single" w:color="000000" w:sz="6"/>
+          <w:bottom w:val="single" w:color="000000" w:sz="6"/>
+          <w:right w:val="single" w:color="000000" w:sz="6"/>
+          <w:insideH w:val="single" w:color="000000" w:sz="6"/>
+          <w:insideV w:val="single" w:color="000000" w:sz="6"/>
+        </w:tblBorders>
+        <w:tblLayout w:type="fixed"/>
+      </w:tblPr>
+      <w:tblGrid>
+        <w:gridCol w:w="2525"/>
+        <w:gridCol w:w="2020"/>
+        <w:gridCol w:w="2272"/>
+        <w:gridCol w:w="2399"/>
+      </w:tblGrid>
+      <w:tr>
+        <w:trPr>
+          <w:cantSplit/>
+          <w:tblHeader/>
+        </w:trPr>
+        <w:tc>
+          <w:tcPr>
+            <w:tcW w:type="dxa" w:w="2525"/>
+            <w:tcBorders>
+              <w:top w:val="single" w:color="000000" w:sz="6"/>
+              <w:left w:val="single" w:color="000000" w:sz="6"/>
+              <w:bottom w:val="single" w:color="000000" w:sz="6"/>
+              <w:right w:val="single" w:color="000000" w:sz="6"/>
+            </w:tcBorders>
+            <w:shd w:fill="D9E1F0" w:val="clear"/>
+            <w:tcMar>
+              <w:top w:type="dxa" w:w="70"/>
+              <w:left w:type="dxa" w:w="100"/>
+              <w:bottom w:type="dxa" w:w="70"/>
+              <w:right w:type="dxa" w:w="100"/>
+            </w:tcMar>
+            <w:vAlign w:val="center"/>
+          </w:tcPr>
+          <w:p>
+            <w:pPr>
+              <w:spacing w:after="0" w:line="240"/>
+              <w:jc w:val="left"/>
+            </w:pPr>
+            <w:r>
+              <w:rPr>
+                <w:rFonts w:ascii="Times New Roman" w:cs="Times New Roman" w:eastAsia="Times New Roman" w:hAnsi="Times New Roman"/>
+                <w:b/>
+                <w:bCs/>
+                <w:color w:val="000000"/>
+                <w:sz w:val="21"/>
+                <w:szCs w:val="21"/>
+              </w:rPr>
+              <w:t xml:space="preserve">Benchmark</w:t>
+            </w:r>
+          </w:p>
+        </w:tc>
+        <w:tc>
+          <w:tcPr>
+            <w:tcW w:type="dxa" w:w="2020"/>
+            <w:tcBorders>
+              <w:top w:val="single" w:color="000000" w:sz="6"/>
+              <w:left w:val="single" w:color="000000" w:sz="6"/>
+              <w:bottom w:val="single" w:color="000000" w:sz="6"/>
+              <w:right w:val="single" w:color="000000" w:sz="6"/>
+            </w:tcBorders>
+            <w:shd w:fill="D9E1F0" w:val="clear"/>
+            <w:tcMar>
+              <w:top w:type="dxa" w:w="70"/>
+              <w:left w:type="dxa" w:w="100"/>
+              <w:bottom w:type="dxa" w:w="70"/>
+              <w:right w:type="dxa" w:w="100"/>
+            </w:tcMar>
+            <w:vAlign w:val="center"/>
+          </w:tcPr>
+          <w:p>
+            <w:pPr>
+              <w:spacing w:after="0" w:line="240"/>
+              <w:jc w:val="center"/>
+            </w:pPr>
+            <w:r>
+              <w:rPr>
+                <w:rFonts w:ascii="Times New Roman" w:cs="Times New Roman" w:eastAsia="Times New Roman" w:hAnsi="Times New Roman"/>
+                <w:b/>
+                <w:bCs/>
+                <w:color w:val="000000"/>
+                <w:sz w:val="21"/>
+                <w:szCs w:val="21"/>
+              </w:rPr>
+              <w:t xml:space="preserve">Cost of pruning</w:t>
+            </w:r>
+          </w:p>
+        </w:tc>
+        <w:tc>
+          <w:tcPr>
+            <w:tcW w:type="dxa" w:w="2272"/>
+            <w:tcBorders>
+              <w:top w:val="single" w:color="000000" w:sz="6"/>
+              <w:left w:val="single" w:color="000000" w:sz="6"/>
+              <w:bottom w:val="single" w:color="000000" w:sz="6"/>
+              <w:right w:val="single" w:color="000000" w:sz="6"/>
+            </w:tcBorders>
+            <w:shd w:fill="D9E1F0" w:val="clear"/>
+            <w:tcMar>
+              <w:top w:type="dxa" w:w="70"/>
+              <w:left w:type="dxa" w:w="100"/>
+              <w:bottom w:type="dxa" w:w="70"/>
+              <w:right w:type="dxa" w:w="100"/>
+            </w:tcMar>
+            <w:vAlign w:val="center"/>
+          </w:tcPr>
+          <w:p>
+            <w:pPr>
+              <w:spacing w:after="0" w:line="240"/>
+              <w:jc w:val="center"/>
+            </w:pPr>
+            <w:r>
+              <w:rPr>
+                <w:rFonts w:ascii="Times New Roman" w:cs="Times New Roman" w:eastAsia="Times New Roman" w:hAnsi="Times New Roman"/>
+                <w:b/>
+                <w:bCs/>
+                <w:color w:val="000000"/>
+                <w:sz w:val="21"/>
+                <w:szCs w:val="21"/>
+              </w:rPr>
+              <w:t xml:space="preserve">Cost of the deletion</w:t>
+            </w:r>
+          </w:p>
+        </w:tc>
+        <w:tc>
+          <w:tcPr>
+            <w:tcW w:type="dxa" w:w="2399"/>
+            <w:tcBorders>
+              <w:top w:val="single" w:color="000000" w:sz="6"/>
+              <w:left w:val="single" w:color="000000" w:sz="6"/>
+              <w:bottom w:val="single" w:color="000000" w:sz="6"/>
+              <w:right w:val="single" w:color="000000" w:sz="6"/>
+            </w:tcBorders>
+            <w:shd w:fill="D9E1F0" w:val="clear"/>
+            <w:tcMar>
+              <w:top w:type="dxa" w:w="70"/>
+              <w:left w:type="dxa" w:w="100"/>
+              <w:bottom w:type="dxa" w:w="70"/>
+              <w:right w:type="dxa" w:w="100"/>
+            </w:tcMar>
+            <w:vAlign w:val="center"/>
+          </w:tcPr>
+          <w:p>
+            <w:pPr>
+              <w:spacing w:after="0" w:line="240"/>
+              <w:jc w:val="center"/>
+            </w:pPr>
+            <w:r>
+              <w:rPr>
+                <w:rFonts w:ascii="Times New Roman" w:cs="Times New Roman" w:eastAsia="Times New Roman" w:hAnsi="Times New Roman"/>
+                <w:b/>
+                <w:bCs/>
+                <w:color w:val="000000"/>
+                <w:sz w:val="21"/>
+                <w:szCs w:val="21"/>
+              </w:rPr>
+              <w:t xml:space="preserve">Which dominates</w:t>
+            </w:r>
+          </w:p>
+        </w:tc>
+      </w:tr>
+      <w:tr>
+        <w:trPr>
+          <w:cantSplit/>
+        </w:trPr>
+        <w:tc>
+          <w:tcPr>
+            <w:tcW w:type="dxa" w:w="2525"/>
+            <w:tcBorders>
+              <w:top w:val="single" w:color="000000" w:sz="6"/>
+              <w:left w:val="single" w:color="000000" w:sz="6"/>
+              <w:bottom w:val="single" w:color="000000" w:sz="6"/>
+              <w:right w:val="single" w:color="000000" w:sz="6"/>
+            </w:tcBorders>
+            <w:tcMar>
+              <w:top w:type="dxa" w:w="70"/>
+              <w:left w:type="dxa" w:w="100"/>
+              <w:bottom w:type="dxa" w:w="70"/>
+              <w:right w:type="dxa" w:w="100"/>
+            </w:tcMar>
+            <w:vAlign w:val="center"/>
+          </w:tcPr>
+          <w:p>
+            <w:pPr>
+              <w:spacing w:after="0" w:line="240"/>
+              <w:jc w:val="left"/>
+            </w:pPr>
+            <w:r>
+              <w:rPr>
+                <w:rFonts w:ascii="Times New Roman" w:cs="Times New Roman" w:eastAsia="Times New Roman" w:hAnsi="Times New Roman"/>
+                <w:b w:val="false"/>
+                <w:bCs w:val="false"/>
+                <w:color w:val="000000"/>
+                <w:sz w:val="21"/>
+                <w:szCs w:val="21"/>
+              </w:rPr>
+              <w:t xml:space="preserve">TextVQA</w:t>
+            </w:r>
+          </w:p>
+        </w:tc>
+        <w:tc>
+          <w:tcPr>
+            <w:tcW w:type="dxa" w:w="2020"/>
+            <w:tcBorders>
+              <w:top w:val="single" w:color="000000" w:sz="6"/>
+              <w:left w:val="single" w:color="000000" w:sz="6"/>
+              <w:bottom w:val="single" w:color="000000" w:sz="6"/>
+              <w:right w:val="single" w:color="000000" w:sz="6"/>
+            </w:tcBorders>
+            <w:tcMar>
+              <w:top w:type="dxa" w:w="70"/>
+              <w:left w:type="dxa" w:w="100"/>
+              <w:bottom w:type="dxa" w:w="70"/>
+              <w:right w:type="dxa" w:w="100"/>
+            </w:tcMar>
+            <w:vAlign w:val="center"/>
+          </w:tcPr>
+          <w:p>
+            <w:pPr>
+              <w:spacing w:after="0" w:line="240"/>
+              <w:jc w:val="center"/>
+            </w:pPr>
+            <w:r>
+              <w:rPr>
+                <w:rFonts w:ascii="Times New Roman" w:cs="Times New Roman" w:eastAsia="Times New Roman" w:hAnsi="Times New Roman"/>
+                <w:b w:val="false"/>
+                <w:bCs w:val="false"/>
+                <w:color w:val="000000"/>
+                <w:sz w:val="21"/>
+                <w:szCs w:val="21"/>
+              </w:rPr>
+              <w:t xml:space="preserve">5.7</w:t>
+            </w:r>
+          </w:p>
+        </w:tc>
+        <w:tc>
+          <w:tcPr>
+            <w:tcW w:type="dxa" w:w="2272"/>
+            <w:tcBorders>
+              <w:top w:val="single" w:color="000000" w:sz="6"/>
+              <w:left w:val="single" w:color="000000" w:sz="6"/>
+              <w:bottom w:val="single" w:color="000000" w:sz="6"/>
+              <w:right w:val="single" w:color="000000" w:sz="6"/>
+            </w:tcBorders>
+            <w:tcMar>
+              <w:top w:type="dxa" w:w="70"/>
+              <w:left w:type="dxa" w:w="100"/>
+              <w:bottom w:type="dxa" w:w="70"/>
+              <w:right w:type="dxa" w:w="100"/>
+            </w:tcMar>
+            <w:vAlign w:val="center"/>
+          </w:tcPr>
+          <w:p>
+            <w:pPr>
+              <w:spacing w:after="0" w:line="240"/>
+              <w:jc w:val="center"/>
+            </w:pPr>
+            <w:r>
+              <w:rPr>
+                <w:rFonts w:ascii="Times New Roman" w:cs="Times New Roman" w:eastAsia="Times New Roman" w:hAnsi="Times New Roman"/>
+                <w:b w:val="false"/>
+                <w:bCs w:val="false"/>
+                <w:color w:val="000000"/>
+                <w:sz w:val="21"/>
+                <w:szCs w:val="21"/>
+              </w:rPr>
+              <w:t xml:space="preserve">57.2</w:t>
+            </w:r>
+          </w:p>
+        </w:tc>
+        <w:tc>
+          <w:tcPr>
+            <w:tcW w:type="dxa" w:w="2399"/>
+            <w:tcBorders>
+              <w:top w:val="single" w:color="000000" w:sz="6"/>
+              <w:left w:val="single" w:color="000000" w:sz="6"/>
+              <w:bottom w:val="single" w:color="000000" w:sz="6"/>
+              <w:right w:val="single" w:color="000000" w:sz="6"/>
+            </w:tcBorders>
+            <w:tcMar>
+              <w:top w:type="dxa" w:w="70"/>
+              <w:left w:type="dxa" w:w="100"/>
+              <w:bottom w:type="dxa" w:w="70"/>
+              <w:right w:type="dxa" w:w="100"/>
+            </w:tcMar>
+            <w:vAlign w:val="center"/>
+          </w:tcPr>
+          <w:p>
+            <w:pPr>
+              <w:spacing w:after="0" w:line="240"/>
+              <w:jc w:val="center"/>
+            </w:pPr>
+            <w:r>
+              <w:rPr>
+                <w:rFonts w:ascii="Times New Roman" w:cs="Times New Roman" w:eastAsia="Times New Roman" w:hAnsi="Times New Roman"/>
+                <w:b w:val="false"/>
+                <w:bCs w:val="false"/>
+                <w:color w:val="000000"/>
+                <w:sz w:val="21"/>
+                <w:szCs w:val="21"/>
+              </w:rPr>
+              <w:t xml:space="preserve">deletion, 10 to 1</w:t>
+            </w:r>
+          </w:p>
+        </w:tc>
+      </w:tr>
+      <w:tr>
+        <w:trPr>
+          <w:cantSplit/>
+        </w:trPr>
+        <w:tc>
+          <w:tcPr>
+            <w:tcW w:type="dxa" w:w="2525"/>
+            <w:tcBorders>
+              <w:top w:val="single" w:color="000000" w:sz="6"/>
+              <w:left w:val="single" w:color="000000" w:sz="6"/>
+              <w:bottom w:val="single" w:color="000000" w:sz="6"/>
+              <w:right w:val="single" w:color="000000" w:sz="6"/>
+            </w:tcBorders>
+            <w:tcMar>
+              <w:top w:type="dxa" w:w="70"/>
+              <w:left w:type="dxa" w:w="100"/>
+              <w:bottom w:type="dxa" w:w="70"/>
+              <w:right w:type="dxa" w:w="100"/>
+            </w:tcMar>
+            <w:vAlign w:val="center"/>
+          </w:tcPr>
+          <w:p>
+            <w:pPr>
+              <w:spacing w:after="0" w:line="240"/>
+              <w:jc w:val="left"/>
+            </w:pPr>
+            <w:r>
+              <w:rPr>
+                <w:rFonts w:ascii="Times New Roman" w:cs="Times New Roman" w:eastAsia="Times New Roman" w:hAnsi="Times New Roman"/>
+                <w:b w:val="false"/>
+                <w:bCs w:val="false"/>
+                <w:color w:val="000000"/>
+                <w:sz w:val="21"/>
+                <w:szCs w:val="21"/>
+              </w:rPr>
+              <w:t xml:space="preserve">DocVQA</w:t>
+            </w:r>
+          </w:p>
+        </w:tc>
+        <w:tc>
+          <w:tcPr>
+            <w:tcW w:type="dxa" w:w="2020"/>
+            <w:tcBorders>
+              <w:top w:val="single" w:color="000000" w:sz="6"/>
+              <w:left w:val="single" w:color="000000" w:sz="6"/>
+              <w:bottom w:val="single" w:color="000000" w:sz="6"/>
+              <w:right w:val="single" w:color="000000" w:sz="6"/>
+            </w:tcBorders>
+            <w:tcMar>
+              <w:top w:type="dxa" w:w="70"/>
+              <w:left w:type="dxa" w:w="100"/>
+              <w:bottom w:type="dxa" w:w="70"/>
+              <w:right w:type="dxa" w:w="100"/>
+            </w:tcMar>
+            <w:vAlign w:val="center"/>
+          </w:tcPr>
+          <w:p>
+            <w:pPr>
+              <w:spacing w:after="0" w:line="240"/>
+              <w:jc w:val="center"/>
+            </w:pPr>
+            <w:r>
+              <w:rPr>
+                <w:rFonts w:ascii="Times New Roman" w:cs="Times New Roman" w:eastAsia="Times New Roman" w:hAnsi="Times New Roman"/>
+                <w:b w:val="false"/>
+                <w:bCs w:val="false"/>
+                <w:color w:val="000000"/>
+                <w:sz w:val="21"/>
+                <w:szCs w:val="21"/>
+              </w:rPr>
+              <w:t xml:space="preserve">17.9</w:t>
+            </w:r>
+          </w:p>
+        </w:tc>
+        <w:tc>
+          <w:tcPr>
+            <w:tcW w:type="dxa" w:w="2272"/>
+            <w:tcBorders>
+              <w:top w:val="single" w:color="000000" w:sz="6"/>
+              <w:left w:val="single" w:color="000000" w:sz="6"/>
+              <w:bottom w:val="single" w:color="000000" w:sz="6"/>
+              <w:right w:val="single" w:color="000000" w:sz="6"/>
+            </w:tcBorders>
+            <w:tcMar>
+              <w:top w:type="dxa" w:w="70"/>
+              <w:left w:type="dxa" w:w="100"/>
+              <w:bottom w:type="dxa" w:w="70"/>
+              <w:right w:type="dxa" w:w="100"/>
+            </w:tcMar>
+            <w:vAlign w:val="center"/>
+          </w:tcPr>
+          <w:p>
+            <w:pPr>
+              <w:spacing w:after="0" w:line="240"/>
+              <w:jc w:val="center"/>
+            </w:pPr>
+            <w:r>
+              <w:rPr>
+                <w:rFonts w:ascii="Times New Roman" w:cs="Times New Roman" w:eastAsia="Times New Roman" w:hAnsi="Times New Roman"/>
+                <w:b w:val="false"/>
+                <w:bCs w:val="false"/>
+                <w:color w:val="000000"/>
+                <w:sz w:val="21"/>
+                <w:szCs w:val="21"/>
+              </w:rPr>
+              <w:t xml:space="preserve">57.6</w:t>
+            </w:r>
+          </w:p>
+        </w:tc>
+        <w:tc>
+          <w:tcPr>
+            <w:tcW w:type="dxa" w:w="2399"/>
+            <w:tcBorders>
+              <w:top w:val="single" w:color="000000" w:sz="6"/>
+              <w:left w:val="single" w:color="000000" w:sz="6"/>
+              <w:bottom w:val="single" w:color="000000" w:sz="6"/>
+              <w:right w:val="single" w:color="000000" w:sz="6"/>
+            </w:tcBorders>
+            <w:tcMar>
+              <w:top w:type="dxa" w:w="70"/>
+              <w:left w:type="dxa" w:w="100"/>
+              <w:bottom w:type="dxa" w:w="70"/>
+              <w:right w:type="dxa" w:w="100"/>
+            </w:tcMar>
+            <w:vAlign w:val="center"/>
+          </w:tcPr>
+          <w:p>
+            <w:pPr>
+              <w:spacing w:after="0" w:line="240"/>
+              <w:jc w:val="center"/>
+            </w:pPr>
+            <w:r>
+              <w:rPr>
+                <w:rFonts w:ascii="Times New Roman" w:cs="Times New Roman" w:eastAsia="Times New Roman" w:hAnsi="Times New Roman"/>
+                <w:b w:val="false"/>
+                <w:bCs w:val="false"/>
+                <w:color w:val="000000"/>
+                <w:sz w:val="21"/>
+                <w:szCs w:val="21"/>
+              </w:rPr>
+              <w:t xml:space="preserve">deletion, 3 to 1</w:t>
+            </w:r>
+          </w:p>
+        </w:tc>
+      </w:tr>
+      <w:tr>
+        <w:trPr>
+          <w:cantSplit/>
+        </w:trPr>
+        <w:tc>
+          <w:tcPr>
+            <w:tcW w:type="dxa" w:w="2525"/>
+            <w:tcBorders>
+              <w:top w:val="single" w:color="000000" w:sz="6"/>
+              <w:left w:val="single" w:color="000000" w:sz="6"/>
+              <w:bottom w:val="single" w:color="000000" w:sz="6"/>
+              <w:right w:val="single" w:color="000000" w:sz="6"/>
+            </w:tcBorders>
+            <w:shd w:fill="FCE9E7" w:val="clear"/>
+            <w:tcMar>
+              <w:top w:type="dxa" w:w="70"/>
+              <w:left w:type="dxa" w:w="100"/>
+              <w:bottom w:type="dxa" w:w="70"/>
+              <w:right w:type="dxa" w:w="100"/>
+            </w:tcMar>
+            <w:vAlign w:val="center"/>
+          </w:tcPr>
+          <w:p>
+            <w:pPr>
+              <w:spacing w:after="0" w:line="240"/>
+              <w:jc w:val="left"/>
+            </w:pPr>
+            <w:r>
+              <w:rPr>
+                <w:rFonts w:ascii="Times New Roman" w:cs="Times New Roman" w:eastAsia="Times New Roman" w:hAnsi="Times New Roman"/>
+                <w:b w:val="false"/>
+                <w:bCs w:val="false"/>
+                <w:color w:val="000000"/>
+                <w:sz w:val="21"/>
+                <w:szCs w:val="21"/>
+              </w:rPr>
+              <w:t xml:space="preserve">ChartQA</w:t>
+            </w:r>
+          </w:p>
+        </w:tc>
+        <w:tc>
+          <w:tcPr>
+            <w:tcW w:type="dxa" w:w="2020"/>
+            <w:tcBorders>
+              <w:top w:val="single" w:color="000000" w:sz="6"/>
+              <w:left w:val="single" w:color="000000" w:sz="6"/>
+              <w:bottom w:val="single" w:color="000000" w:sz="6"/>
+              <w:right w:val="single" w:color="000000" w:sz="6"/>
+            </w:tcBorders>
+            <w:shd w:fill="FCE9E7" w:val="clear"/>
+            <w:tcMar>
+              <w:top w:type="dxa" w:w="70"/>
+              <w:left w:type="dxa" w:w="100"/>
+              <w:bottom w:type="dxa" w:w="70"/>
+              <w:right w:type="dxa" w:w="100"/>
+            </w:tcMar>
+            <w:vAlign w:val="center"/>
+          </w:tcPr>
+          <w:p>
+            <w:pPr>
+              <w:spacing w:after="0" w:line="240"/>
+              <w:jc w:val="center"/>
+            </w:pPr>
+            <w:r>
+              <w:rPr>
+                <w:rFonts w:ascii="Times New Roman" w:cs="Times New Roman" w:eastAsia="Times New Roman" w:hAnsi="Times New Roman"/>
+                <w:b/>
+                <w:bCs/>
+                <w:color w:val="A3312F"/>
+                <w:sz w:val="21"/>
+                <w:szCs w:val="21"/>
+              </w:rPr>
+              <w:t xml:space="preserve">31.4</w:t>
+            </w:r>
+          </w:p>
+        </w:tc>
+        <w:tc>
+          <w:tcPr>
+            <w:tcW w:type="dxa" w:w="2272"/>
+            <w:tcBorders>
+              <w:top w:val="single" w:color="000000" w:sz="6"/>
+              <w:left w:val="single" w:color="000000" w:sz="6"/>
+              <w:bottom w:val="single" w:color="000000" w:sz="6"/>
+              <w:right w:val="single" w:color="000000" w:sz="6"/>
+            </w:tcBorders>
+            <w:shd w:fill="FCE9E7" w:val="clear"/>
+            <w:tcMar>
+              <w:top w:type="dxa" w:w="70"/>
+              <w:left w:type="dxa" w:w="100"/>
+              <w:bottom w:type="dxa" w:w="70"/>
+              <w:right w:type="dxa" w:w="100"/>
+            </w:tcMar>
+            <w:vAlign w:val="center"/>
+          </w:tcPr>
+          <w:p>
+            <w:pPr>
+              <w:spacing w:after="0" w:line="240"/>
+              <w:jc w:val="center"/>
+            </w:pPr>
+            <w:r>
+              <w:rPr>
+                <w:rFonts w:ascii="Times New Roman" w:cs="Times New Roman" w:eastAsia="Times New Roman" w:hAnsi="Times New Roman"/>
+                <w:b/>
+                <w:bCs/>
+                <w:color w:val="A3312F"/>
+                <w:sz w:val="21"/>
+                <w:szCs w:val="21"/>
+              </w:rPr>
+              <w:t xml:space="preserve">16.4</w:t>
+            </w:r>
+          </w:p>
+        </w:tc>
+        <w:tc>
+          <w:tcPr>
+            <w:tcW w:type="dxa" w:w="2399"/>
+            <w:tcBorders>
+              <w:top w:val="single" w:color="000000" w:sz="6"/>
+              <w:left w:val="single" w:color="000000" w:sz="6"/>
+              <w:bottom w:val="single" w:color="000000" w:sz="6"/>
+              <w:right w:val="single" w:color="000000" w:sz="6"/>
+            </w:tcBorders>
+            <w:shd w:fill="FCE9E7" w:val="clear"/>
+            <w:tcMar>
+              <w:top w:type="dxa" w:w="70"/>
+              <w:left w:type="dxa" w:w="100"/>
+              <w:bottom w:type="dxa" w:w="70"/>
+              <w:right w:type="dxa" w:w="100"/>
+            </w:tcMar>
+            <w:vAlign w:val="center"/>
+          </w:tcPr>
+          <w:p>
+            <w:pPr>
+              <w:spacing w:after="0" w:line="240"/>
+              <w:jc w:val="center"/>
+            </w:pPr>
+            <w:r>
+              <w:rPr>
+                <w:rFonts w:ascii="Times New Roman" w:cs="Times New Roman" w:eastAsia="Times New Roman" w:hAnsi="Times New Roman"/>
+                <w:b/>
+                <w:bCs/>
+                <w:color w:val="A3312F"/>
+                <w:sz w:val="21"/>
+                <w:szCs w:val="21"/>
+              </w:rPr>
+              <w:t xml:space="preserve">pruning, 2 to 1</w:t>
+            </w:r>
+          </w:p>
+        </w:tc>
+      </w:tr>
+      <w:tr>
+        <w:trPr>
+          <w:cantSplit/>
+        </w:trPr>
+        <w:tc>
+          <w:tcPr>
+            <w:tcW w:type="dxa" w:w="2525"/>
+            <w:tcBorders>
+              <w:top w:val="single" w:color="000000" w:sz="6"/>
+              <w:left w:val="single" w:color="000000" w:sz="6"/>
+              <w:bottom w:val="single" w:color="000000" w:sz="6"/>
+              <w:right w:val="single" w:color="000000" w:sz="6"/>
+            </w:tcBorders>
+            <w:tcMar>
+              <w:top w:type="dxa" w:w="70"/>
+              <w:left w:type="dxa" w:w="100"/>
+              <w:bottom w:type="dxa" w:w="70"/>
+              <w:right w:type="dxa" w:w="100"/>
+            </w:tcMar>
+            <w:vAlign w:val="center"/>
+          </w:tcPr>
+          <w:p>
+            <w:pPr>
+              <w:spacing w:after="0" w:line="240"/>
+              <w:jc w:val="left"/>
+            </w:pPr>
+            <w:r>
+              <w:rPr>
+                <w:rFonts w:ascii="Times New Roman" w:cs="Times New Roman" w:eastAsia="Times New Roman" w:hAnsi="Times New Roman"/>
+                <w:b w:val="false"/>
+                <w:bCs w:val="false"/>
+                <w:color w:val="000000"/>
+                <w:sz w:val="21"/>
+                <w:szCs w:val="21"/>
+              </w:rPr>
+              <w:t xml:space="preserve">AI2D (control)</w:t>
+            </w:r>
+          </w:p>
+        </w:tc>
+        <w:tc>
+          <w:tcPr>
+            <w:tcW w:type="dxa" w:w="2020"/>
+            <w:tcBorders>
+              <w:top w:val="single" w:color="000000" w:sz="6"/>
+              <w:left w:val="single" w:color="000000" w:sz="6"/>
+              <w:bottom w:val="single" w:color="000000" w:sz="6"/>
+              <w:right w:val="single" w:color="000000" w:sz="6"/>
+            </w:tcBorders>
+            <w:tcMar>
+              <w:top w:type="dxa" w:w="70"/>
+              <w:left w:type="dxa" w:w="100"/>
+              <w:bottom w:type="dxa" w:w="70"/>
+              <w:right w:type="dxa" w:w="100"/>
+            </w:tcMar>
+            <w:vAlign w:val="center"/>
+          </w:tcPr>
+          <w:p>
+            <w:pPr>
+              <w:spacing w:after="0" w:line="240"/>
+              <w:jc w:val="center"/>
+            </w:pPr>
+            <w:r>
+              <w:rPr>
+                <w:rFonts w:ascii="Times New Roman" w:cs="Times New Roman" w:eastAsia="Times New Roman" w:hAnsi="Times New Roman"/>
+                <w:b w:val="false"/>
+                <w:bCs w:val="false"/>
+                <w:color w:val="000000"/>
+                <w:sz w:val="21"/>
+                <w:szCs w:val="21"/>
+              </w:rPr>
+              <w:t xml:space="preserve">7.2</w:t>
+            </w:r>
+          </w:p>
+        </w:tc>
+        <w:tc>
+          <w:tcPr>
+            <w:tcW w:type="dxa" w:w="2272"/>
+            <w:tcBorders>
+              <w:top w:val="single" w:color="000000" w:sz="6"/>
+              <w:left w:val="single" w:color="000000" w:sz="6"/>
+              <w:bottom w:val="single" w:color="000000" w:sz="6"/>
+              <w:right w:val="single" w:color="000000" w:sz="6"/>
+            </w:tcBorders>
+            <w:tcMar>
+              <w:top w:type="dxa" w:w="70"/>
+              <w:left w:type="dxa" w:w="100"/>
+              <w:bottom w:type="dxa" w:w="70"/>
+              <w:right w:type="dxa" w:w="100"/>
+            </w:tcMar>
+            <w:vAlign w:val="center"/>
+          </w:tcPr>
+          <w:p>
+            <w:pPr>
+              <w:spacing w:after="0" w:line="240"/>
+              <w:jc w:val="center"/>
+            </w:pPr>
+            <w:r>
+              <w:rPr>
+                <w:rFonts w:ascii="Times New Roman" w:cs="Times New Roman" w:eastAsia="Times New Roman" w:hAnsi="Times New Roman"/>
+                <w:b w:val="false"/>
+                <w:bCs w:val="false"/>
+                <w:color w:val="000000"/>
+                <w:sz w:val="21"/>
+                <w:szCs w:val="21"/>
+              </w:rPr>
+              <w:t xml:space="preserve">0.4</w:t>
+            </w:r>
+          </w:p>
+        </w:tc>
+        <w:tc>
+          <w:tcPr>
+            <w:tcW w:type="dxa" w:w="2399"/>
+            <w:tcBorders>
+              <w:top w:val="single" w:color="000000" w:sz="6"/>
+              <w:left w:val="single" w:color="000000" w:sz="6"/>
+              <w:bottom w:val="single" w:color="000000" w:sz="6"/>
+              <w:right w:val="single" w:color="000000" w:sz="6"/>
+            </w:tcBorders>
+            <w:tcMar>
+              <w:top w:type="dxa" w:w="70"/>
+              <w:left w:type="dxa" w:w="100"/>
+              <w:bottom w:type="dxa" w:w="70"/>
+              <w:right w:type="dxa" w:w="100"/>
+            </w:tcMar>
+            <w:vAlign w:val="center"/>
+          </w:tcPr>
+          <w:p>
+            <w:pPr>
+              <w:spacing w:after="0" w:line="240"/>
+              <w:jc w:val="center"/>
+            </w:pPr>
+            <w:r>
+              <w:rPr>
+                <w:rFonts w:ascii="Times New Roman" w:cs="Times New Roman" w:eastAsia="Times New Roman" w:hAnsi="Times New Roman"/>
+                <w:b w:val="false"/>
+                <w:bCs w:val="false"/>
+                <w:color w:val="000000"/>
+                <w:sz w:val="21"/>
+                <w:szCs w:val="21"/>
+              </w:rPr>
+              <w:t xml:space="preserve">pruning</w:t>
+            </w:r>
+          </w:p>
+        </w:tc>
+      </w:tr>
+      <w:tr>
+        <w:trPr>
+          <w:cantSplit/>
+        </w:trPr>
+        <w:tc>
+          <w:tcPr>
+            <w:tcW w:type="dxa" w:w="2525"/>
+            <w:tcBorders>
+              <w:top w:val="single" w:color="000000" w:sz="6"/>
+              <w:left w:val="single" w:color="000000" w:sz="6"/>
+              <w:bottom w:val="single" w:color="000000" w:sz="6"/>
+              <w:right w:val="single" w:color="000000" w:sz="6"/>
+            </w:tcBorders>
+            <w:tcMar>
+              <w:top w:type="dxa" w:w="70"/>
+              <w:left w:type="dxa" w:w="100"/>
+              <w:bottom w:type="dxa" w:w="70"/>
+              <w:right w:type="dxa" w:w="100"/>
+            </w:tcMar>
+            <w:vAlign w:val="center"/>
+          </w:tcPr>
+          <w:p>
+            <w:pPr>
+              <w:spacing w:after="0" w:line="240"/>
+              <w:jc w:val="left"/>
+            </w:pPr>
+            <w:r>
+              <w:rPr>
+                <w:rFonts w:ascii="Times New Roman" w:cs="Times New Roman" w:eastAsia="Times New Roman" w:hAnsi="Times New Roman"/>
+                <w:b w:val="false"/>
+                <w:bCs w:val="false"/>
+                <w:color w:val="000000"/>
+                <w:sz w:val="21"/>
+                <w:szCs w:val="21"/>
+              </w:rPr>
+              <w:t xml:space="preserve">GQA</w:t>
+            </w:r>
+          </w:p>
+        </w:tc>
+        <w:tc>
+          <w:tcPr>
+            <w:tcW w:type="dxa" w:w="2020"/>
+            <w:tcBorders>
+              <w:top w:val="single" w:color="000000" w:sz="6"/>
+              <w:left w:val="single" w:color="000000" w:sz="6"/>
+              <w:bottom w:val="single" w:color="000000" w:sz="6"/>
+              <w:right w:val="single" w:color="000000" w:sz="6"/>
+            </w:tcBorders>
+            <w:tcMar>
+              <w:top w:type="dxa" w:w="70"/>
+              <w:left w:type="dxa" w:w="100"/>
+              <w:bottom w:type="dxa" w:w="70"/>
+              <w:right w:type="dxa" w:w="100"/>
+            </w:tcMar>
+            <w:vAlign w:val="center"/>
+          </w:tcPr>
+          <w:p>
+            <w:pPr>
+              <w:spacing w:after="0" w:line="240"/>
+              <w:jc w:val="center"/>
+            </w:pPr>
+            <w:r>
+              <w:rPr>
+                <w:rFonts w:ascii="Times New Roman" w:cs="Times New Roman" w:eastAsia="Times New Roman" w:hAnsi="Times New Roman"/>
+                <w:b w:val="false"/>
+                <w:bCs w:val="false"/>
+                <w:color w:val="000000"/>
+                <w:sz w:val="21"/>
+                <w:szCs w:val="21"/>
+              </w:rPr>
+              <w:t xml:space="preserve">2.1</w:t>
+            </w:r>
+          </w:p>
+        </w:tc>
+        <w:tc>
+          <w:tcPr>
+            <w:tcW w:type="dxa" w:w="2272"/>
+            <w:tcBorders>
+              <w:top w:val="single" w:color="000000" w:sz="6"/>
+              <w:left w:val="single" w:color="000000" w:sz="6"/>
+              <w:bottom w:val="single" w:color="000000" w:sz="6"/>
+              <w:right w:val="single" w:color="000000" w:sz="6"/>
+            </w:tcBorders>
+            <w:tcMar>
+              <w:top w:type="dxa" w:w="70"/>
+              <w:left w:type="dxa" w:w="100"/>
+              <w:bottom w:type="dxa" w:w="70"/>
+              <w:right w:type="dxa" w:w="100"/>
+            </w:tcMar>
+            <w:vAlign w:val="center"/>
+          </w:tcPr>
+          <w:p>
+            <w:pPr>
+              <w:spacing w:after="0" w:line="240"/>
+              <w:jc w:val="center"/>
+            </w:pPr>
+            <w:r>
+              <w:rPr>
+                <w:rFonts w:ascii="Times New Roman" w:cs="Times New Roman" w:eastAsia="Times New Roman" w:hAnsi="Times New Roman"/>
+                <w:b w:val="false"/>
+                <w:bCs w:val="false"/>
+                <w:color w:val="000000"/>
+                <w:sz w:val="21"/>
+                <w:szCs w:val="21"/>
+              </w:rPr>
+              <w:t xml:space="preserve">2.9</w:t>
+            </w:r>
+          </w:p>
+        </w:tc>
+        <w:tc>
+          <w:tcPr>
+            <w:tcW w:type="dxa" w:w="2399"/>
+            <w:tcBorders>
+              <w:top w:val="single" w:color="000000" w:sz="6"/>
+              <w:left w:val="single" w:color="000000" w:sz="6"/>
+              <w:bottom w:val="single" w:color="000000" w:sz="6"/>
+              <w:right w:val="single" w:color="000000" w:sz="6"/>
+            </w:tcBorders>
+            <w:tcMar>
+              <w:top w:type="dxa" w:w="70"/>
+              <w:left w:type="dxa" w:w="100"/>
+              <w:bottom w:type="dxa" w:w="70"/>
+              <w:right w:type="dxa" w:w="100"/>
+            </w:tcMar>
+            <w:vAlign w:val="center"/>
+          </w:tcPr>
+          <w:p>
+            <w:pPr>
+              <w:spacing w:after="0" w:line="240"/>
+              <w:jc w:val="center"/>
+            </w:pPr>
+            <w:r>
+              <w:rPr>
+                <w:rFonts w:ascii="Times New Roman" w:cs="Times New Roman" w:eastAsia="Times New Roman" w:hAnsi="Times New Roman"/>
+                <w:b w:val="false"/>
+                <w:bCs w:val="false"/>
+                <w:color w:val="000000"/>
+                <w:sz w:val="21"/>
+                <w:szCs w:val="21"/>
+              </w:rPr>
+              <w:t xml:space="preserve">neither, both small</w:t>
+            </w:r>
+          </w:p>
+        </w:tc>
+      </w:tr>
+      <w:tr>
+        <w:trPr>
+          <w:cantSplit/>
+        </w:trPr>
+        <w:tc>
+          <w:tcPr>
+            <w:tcW w:type="dxa" w:w="2525"/>
+            <w:tcBorders>
+              <w:top w:val="single" w:color="000000" w:sz="6"/>
+              <w:left w:val="single" w:color="000000" w:sz="6"/>
+              <w:bottom w:val="single" w:color="000000" w:sz="6"/>
+              <w:right w:val="single" w:color="000000" w:sz="6"/>
+            </w:tcBorders>
+            <w:tcMar>
+              <w:top w:type="dxa" w:w="70"/>
+              <w:left w:type="dxa" w:w="100"/>
+              <w:bottom w:type="dxa" w:w="70"/>
+              <w:right w:type="dxa" w:w="100"/>
+            </w:tcMar>
+            <w:vAlign w:val="center"/>
+          </w:tcPr>
+          <w:p>
+            <w:pPr>
+              <w:spacing w:after="0" w:line="240"/>
+              <w:jc w:val="left"/>
+            </w:pPr>
+            <w:r>
+              <w:rPr>
+                <w:rFonts w:ascii="Times New Roman" w:cs="Times New Roman" w:eastAsia="Times New Roman" w:hAnsi="Times New Roman"/>
+                <w:b w:val="false"/>
+                <w:bCs w:val="false"/>
+                <w:color w:val="000000"/>
+                <w:sz w:val="21"/>
+                <w:szCs w:val="21"/>
+              </w:rPr>
+              <w:t xml:space="preserve">POPE</w:t>
+            </w:r>
+          </w:p>
+        </w:tc>
+        <w:tc>
+          <w:tcPr>
+            <w:tcW w:type="dxa" w:w="2020"/>
+            <w:tcBorders>
+              <w:top w:val="single" w:color="000000" w:sz="6"/>
+              <w:left w:val="single" w:color="000000" w:sz="6"/>
+              <w:bottom w:val="single" w:color="000000" w:sz="6"/>
+              <w:right w:val="single" w:color="000000" w:sz="6"/>
+            </w:tcBorders>
+            <w:tcMar>
+              <w:top w:type="dxa" w:w="70"/>
+              <w:left w:type="dxa" w:w="100"/>
+              <w:bottom w:type="dxa" w:w="70"/>
+              <w:right w:type="dxa" w:w="100"/>
+            </w:tcMar>
+            <w:vAlign w:val="center"/>
+          </w:tcPr>
+          <w:p>
+            <w:pPr>
+              <w:spacing w:after="0" w:line="240"/>
+              <w:jc w:val="center"/>
+            </w:pPr>
+            <w:r>
+              <w:rPr>
+                <w:rFonts w:ascii="Times New Roman" w:cs="Times New Roman" w:eastAsia="Times New Roman" w:hAnsi="Times New Roman"/>
+                <w:b w:val="false"/>
+                <w:bCs w:val="false"/>
+                <w:color w:val="000000"/>
+                <w:sz w:val="21"/>
+                <w:szCs w:val="21"/>
+              </w:rPr>
+              <w:t xml:space="preserve">1.3</w:t>
+            </w:r>
+          </w:p>
+        </w:tc>
+        <w:tc>
+          <w:tcPr>
+            <w:tcW w:type="dxa" w:w="2272"/>
+            <w:tcBorders>
+              <w:top w:val="single" w:color="000000" w:sz="6"/>
+              <w:left w:val="single" w:color="000000" w:sz="6"/>
+              <w:bottom w:val="single" w:color="000000" w:sz="6"/>
+              <w:right w:val="single" w:color="000000" w:sz="6"/>
+            </w:tcBorders>
+            <w:tcMar>
+              <w:top w:type="dxa" w:w="70"/>
+              <w:left w:type="dxa" w:w="100"/>
+              <w:bottom w:type="dxa" w:w="70"/>
+              <w:right w:type="dxa" w:w="100"/>
+            </w:tcMar>
+            <w:vAlign w:val="center"/>
+          </w:tcPr>
+          <w:p>
+            <w:pPr>
+              <w:spacing w:after="0" w:line="240"/>
+              <w:jc w:val="center"/>
+            </w:pPr>
+            <w:r>
+              <w:rPr>
+                <w:rFonts w:ascii="Times New Roman" w:cs="Times New Roman" w:eastAsia="Times New Roman" w:hAnsi="Times New Roman"/>
+                <w:b w:val="false"/>
+                <w:bCs w:val="false"/>
+                <w:color w:val="000000"/>
+                <w:sz w:val="21"/>
+                <w:szCs w:val="21"/>
+              </w:rPr>
+              <w:t xml:space="preserve">0.1</w:t>
+            </w:r>
+          </w:p>
+        </w:tc>
+        <w:tc>
+          <w:tcPr>
+            <w:tcW w:type="dxa" w:w="2399"/>
+            <w:tcBorders>
+              <w:top w:val="single" w:color="000000" w:sz="6"/>
+              <w:left w:val="single" w:color="000000" w:sz="6"/>
+              <w:bottom w:val="single" w:color="000000" w:sz="6"/>
+              <w:right w:val="single" w:color="000000" w:sz="6"/>
+            </w:tcBorders>
+            <w:tcMar>
+              <w:top w:type="dxa" w:w="70"/>
+              <w:left w:type="dxa" w:w="100"/>
+              <w:bottom w:type="dxa" w:w="70"/>
+              <w:right w:type="dxa" w:w="100"/>
+            </w:tcMar>
+            <w:vAlign w:val="center"/>
+          </w:tcPr>
+          <w:p>
+            <w:pPr>
+              <w:spacing w:after="0" w:line="240"/>
+              <w:jc w:val="center"/>
+            </w:pPr>
+            <w:r>
+              <w:rPr>
+                <w:rFonts w:ascii="Times New Roman" w:cs="Times New Roman" w:eastAsia="Times New Roman" w:hAnsi="Times New Roman"/>
+                <w:b w:val="false"/>
+                <w:bCs w:val="false"/>
+                <w:color w:val="000000"/>
+                <w:sz w:val="21"/>
+                <w:szCs w:val="21"/>
+              </w:rPr>
+              <w:t xml:space="preserve">neither, both small</w:t>
+            </w:r>
+          </w:p>
+        </w:tc>
+      </w:tr>
+      <w:tr>
+        <w:trPr>
+          <w:cantSplit/>
+        </w:trPr>
+        <w:tc>
+          <w:tcPr>
+            <w:tcW w:type="dxa" w:w="2525"/>
+            <w:tcBorders>
+              <w:top w:val="single" w:color="000000" w:sz="6"/>
+              <w:left w:val="single" w:color="000000" w:sz="6"/>
+              <w:bottom w:val="single" w:color="000000" w:sz="6"/>
+              <w:right w:val="single" w:color="000000" w:sz="6"/>
+            </w:tcBorders>
+            <w:tcMar>
+              <w:top w:type="dxa" w:w="70"/>
+              <w:left w:type="dxa" w:w="100"/>
+              <w:bottom w:type="dxa" w:w="70"/>
+              <w:right w:type="dxa" w:w="100"/>
+            </w:tcMar>
+            <w:vAlign w:val="center"/>
+          </w:tcPr>
+          <w:p>
+            <w:pPr>
+              <w:spacing w:after="0" w:line="240"/>
+              <w:jc w:val="left"/>
+            </w:pPr>
+            <w:r>
+              <w:rPr>
+                <w:rFonts w:ascii="Times New Roman" w:cs="Times New Roman" w:eastAsia="Times New Roman" w:hAnsi="Times New Roman"/>
+                <w:b w:val="false"/>
+                <w:bCs w:val="false"/>
+                <w:color w:val="000000"/>
+                <w:sz w:val="21"/>
+                <w:szCs w:val="21"/>
+              </w:rPr>
+              <w:t xml:space="preserve">MMBench-EN</w:t>
+            </w:r>
+          </w:p>
+        </w:tc>
+        <w:tc>
+          <w:tcPr>
+            <w:tcW w:type="dxa" w:w="2020"/>
+            <w:tcBorders>
+              <w:top w:val="single" w:color="000000" w:sz="6"/>
+              <w:left w:val="single" w:color="000000" w:sz="6"/>
+              <w:bottom w:val="single" w:color="000000" w:sz="6"/>
+              <w:right w:val="single" w:color="000000" w:sz="6"/>
+            </w:tcBorders>
+            <w:tcMar>
+              <w:top w:type="dxa" w:w="70"/>
+              <w:left w:type="dxa" w:w="100"/>
+              <w:bottom w:type="dxa" w:w="70"/>
+              <w:right w:type="dxa" w:w="100"/>
+            </w:tcMar>
+            <w:vAlign w:val="center"/>
+          </w:tcPr>
+          <w:p>
+            <w:pPr>
+              <w:spacing w:after="0" w:line="240"/>
+              <w:jc w:val="center"/>
+            </w:pPr>
+            <w:r>
+              <w:rPr>
+                <w:rFonts w:ascii="Times New Roman" w:cs="Times New Roman" w:eastAsia="Times New Roman" w:hAnsi="Times New Roman"/>
+                <w:b w:val="false"/>
+                <w:bCs w:val="false"/>
+                <w:color w:val="000000"/>
+                <w:sz w:val="21"/>
+                <w:szCs w:val="21"/>
+              </w:rPr>
+              <w:t xml:space="preserve">4.7</w:t>
+            </w:r>
+          </w:p>
+        </w:tc>
+        <w:tc>
+          <w:tcPr>
+            <w:tcW w:type="dxa" w:w="2272"/>
+            <w:tcBorders>
+              <w:top w:val="single" w:color="000000" w:sz="6"/>
+              <w:left w:val="single" w:color="000000" w:sz="6"/>
+              <w:bottom w:val="single" w:color="000000" w:sz="6"/>
+              <w:right w:val="single" w:color="000000" w:sz="6"/>
+            </w:tcBorders>
+            <w:tcMar>
+              <w:top w:type="dxa" w:w="70"/>
+              <w:left w:type="dxa" w:w="100"/>
+              <w:bottom w:type="dxa" w:w="70"/>
+              <w:right w:type="dxa" w:w="100"/>
+            </w:tcMar>
+            <w:vAlign w:val="center"/>
+          </w:tcPr>
+          <w:p>
+            <w:pPr>
+              <w:spacing w:after="0" w:line="240"/>
+              <w:jc w:val="center"/>
+            </w:pPr>
+            <w:r>
+              <w:rPr>
+                <w:rFonts w:ascii="Times New Roman" w:cs="Times New Roman" w:eastAsia="Times New Roman" w:hAnsi="Times New Roman"/>
+                <w:b w:val="false"/>
+                <w:bCs w:val="false"/>
+                <w:color w:val="000000"/>
+                <w:sz w:val="21"/>
+                <w:szCs w:val="21"/>
+              </w:rPr>
+              <w:t xml:space="preserve">0.3</w:t>
+            </w:r>
+          </w:p>
+        </w:tc>
+        <w:tc>
+          <w:tcPr>
+            <w:tcW w:type="dxa" w:w="2399"/>
+            <w:tcBorders>
+              <w:top w:val="single" w:color="000000" w:sz="6"/>
+              <w:left w:val="single" w:color="000000" w:sz="6"/>
+              <w:bottom w:val="single" w:color="000000" w:sz="6"/>
+              <w:right w:val="single" w:color="000000" w:sz="6"/>
+            </w:tcBorders>
+            <w:tcMar>
+              <w:top w:type="dxa" w:w="70"/>
+              <w:left w:type="dxa" w:w="100"/>
+              <w:bottom w:type="dxa" w:w="70"/>
+              <w:right w:type="dxa" w:w="100"/>
+            </w:tcMar>
+            <w:vAlign w:val="center"/>
+          </w:tcPr>
+          <w:p>
+            <w:pPr>
+              <w:spacing w:after="0" w:line="240"/>
+              <w:jc w:val="center"/>
+            </w:pPr>
+            <w:r>
+              <w:rPr>
+                <w:rFonts w:ascii="Times New Roman" w:cs="Times New Roman" w:eastAsia="Times New Roman" w:hAnsi="Times New Roman"/>
+                <w:b w:val="false"/>
+                <w:bCs w:val="false"/>
+                <w:color w:val="000000"/>
+                <w:sz w:val="21"/>
+                <w:szCs w:val="21"/>
+              </w:rPr>
+              <w:t xml:space="preserve">neither, both small</w:t>
+            </w:r>
+          </w:p>
+        </w:tc>
+      </w:tr>
+      <w:tr>
+        <w:trPr>
+          <w:cantSplit/>
+        </w:trPr>
+        <w:tc>
+          <w:tcPr>
+            <w:tcW w:type="dxa" w:w="2525"/>
+            <w:tcBorders>
+              <w:top w:val="single" w:color="000000" w:sz="6"/>
+              <w:left w:val="single" w:color="000000" w:sz="6"/>
+              <w:bottom w:val="single" w:color="000000" w:sz="6"/>
+              <w:right w:val="single" w:color="000000" w:sz="6"/>
+            </w:tcBorders>
+            <w:tcMar>
+              <w:top w:type="dxa" w:w="70"/>
+              <w:left w:type="dxa" w:w="100"/>
+              <w:bottom w:type="dxa" w:w="70"/>
+              <w:right w:type="dxa" w:w="100"/>
+            </w:tcMar>
+            <w:vAlign w:val="center"/>
+          </w:tcPr>
+          <w:p>
+            <w:pPr>
+              <w:spacing w:after="0" w:line="240"/>
+              <w:jc w:val="left"/>
+            </w:pPr>
+            <w:r>
+              <w:rPr>
+                <w:rFonts w:ascii="Times New Roman" w:cs="Times New Roman" w:eastAsia="Times New Roman" w:hAnsi="Times New Roman"/>
+                <w:b w:val="false"/>
+                <w:bCs w:val="false"/>
+                <w:color w:val="000000"/>
+                <w:sz w:val="21"/>
+                <w:szCs w:val="21"/>
+              </w:rPr>
+              <w:t xml:space="preserve">ScienceQA-Image</w:t>
+            </w:r>
+          </w:p>
+        </w:tc>
+        <w:tc>
+          <w:tcPr>
+            <w:tcW w:type="dxa" w:w="2020"/>
+            <w:tcBorders>
+              <w:top w:val="single" w:color="000000" w:sz="6"/>
+              <w:left w:val="single" w:color="000000" w:sz="6"/>
+              <w:bottom w:val="single" w:color="000000" w:sz="6"/>
+              <w:right w:val="single" w:color="000000" w:sz="6"/>
+            </w:tcBorders>
+            <w:tcMar>
+              <w:top w:type="dxa" w:w="70"/>
+              <w:left w:type="dxa" w:w="100"/>
+              <w:bottom w:type="dxa" w:w="70"/>
+              <w:right w:type="dxa" w:w="100"/>
+            </w:tcMar>
+            <w:vAlign w:val="center"/>
+          </w:tcPr>
+          <w:p>
+            <w:pPr>
+              <w:spacing w:after="0" w:line="240"/>
+              <w:jc w:val="center"/>
+            </w:pPr>
+            <w:r>
+              <w:rPr>
+                <w:rFonts w:ascii="Times New Roman" w:cs="Times New Roman" w:eastAsia="Times New Roman" w:hAnsi="Times New Roman"/>
+                <w:b w:val="false"/>
+                <w:bCs w:val="false"/>
+                <w:color w:val="000000"/>
+                <w:sz w:val="21"/>
+                <w:szCs w:val="21"/>
+              </w:rPr>
+              <w:t xml:space="preserve">3.1</w:t>
+            </w:r>
+          </w:p>
+        </w:tc>
+        <w:tc>
+          <w:tcPr>
+            <w:tcW w:type="dxa" w:w="2272"/>
+            <w:tcBorders>
+              <w:top w:val="single" w:color="000000" w:sz="6"/>
+              <w:left w:val="single" w:color="000000" w:sz="6"/>
+              <w:bottom w:val="single" w:color="000000" w:sz="6"/>
+              <w:right w:val="single" w:color="000000" w:sz="6"/>
+            </w:tcBorders>
+            <w:tcMar>
+              <w:top w:type="dxa" w:w="70"/>
+              <w:left w:type="dxa" w:w="100"/>
+              <w:bottom w:type="dxa" w:w="70"/>
+              <w:right w:type="dxa" w:w="100"/>
+            </w:tcMar>
+            <w:vAlign w:val="center"/>
+          </w:tcPr>
+          <w:p>
+            <w:pPr>
+              <w:spacing w:after="0" w:line="240"/>
+              <w:jc w:val="center"/>
+            </w:pPr>
+            <w:r>
+              <w:rPr>
+                <w:rFonts w:ascii="Times New Roman" w:cs="Times New Roman" w:eastAsia="Times New Roman" w:hAnsi="Times New Roman"/>
+                <w:b w:val="false"/>
+                <w:bCs w:val="false"/>
+                <w:color w:val="000000"/>
+                <w:sz w:val="21"/>
+                <w:szCs w:val="21"/>
+              </w:rPr>
+              <w:t xml:space="preserve">0.1</w:t>
+            </w:r>
+          </w:p>
+        </w:tc>
+        <w:tc>
+          <w:tcPr>
+            <w:tcW w:type="dxa" w:w="2399"/>
+            <w:tcBorders>
+              <w:top w:val="single" w:color="000000" w:sz="6"/>
+              <w:left w:val="single" w:color="000000" w:sz="6"/>
+              <w:bottom w:val="single" w:color="000000" w:sz="6"/>
+              <w:right w:val="single" w:color="000000" w:sz="6"/>
+            </w:tcBorders>
+            <w:tcMar>
+              <w:top w:type="dxa" w:w="70"/>
+              <w:left w:type="dxa" w:w="100"/>
+              <w:bottom w:type="dxa" w:w="70"/>
+              <w:right w:type="dxa" w:w="100"/>
+            </w:tcMar>
+            <w:vAlign w:val="center"/>
+          </w:tcPr>
+          <w:p>
+            <w:pPr>
+              <w:spacing w:after="0" w:line="240"/>
+              <w:jc w:val="center"/>
+            </w:pPr>
+            <w:r>
+              <w:rPr>
+                <w:rFonts w:ascii="Times New Roman" w:cs="Times New Roman" w:eastAsia="Times New Roman" w:hAnsi="Times New Roman"/>
+                <w:b w:val="false"/>
+                <w:bCs w:val="false"/>
+                <w:color w:val="000000"/>
+                <w:sz w:val="21"/>
+                <w:szCs w:val="21"/>
+              </w:rPr>
+              <w:t xml:space="preserve">neither, both small</w:t>
+            </w:r>
+          </w:p>
+        </w:tc>
+      </w:tr>
+      <w:tr>
+        <w:trPr>
+          <w:cantSplit/>
+        </w:trPr>
+        <w:tc>
+          <w:tcPr>
+            <w:tcW w:type="dxa" w:w="2525"/>
+            <w:tcBorders>
+              <w:top w:val="single" w:color="000000" w:sz="6"/>
+              <w:left w:val="single" w:color="000000" w:sz="6"/>
+              <w:bottom w:val="single" w:color="000000" w:sz="6"/>
+              <w:right w:val="single" w:color="000000" w:sz="6"/>
+            </w:tcBorders>
+            <w:tcMar>
+              <w:top w:type="dxa" w:w="70"/>
+              <w:left w:type="dxa" w:w="100"/>
+              <w:bottom w:type="dxa" w:w="70"/>
+              <w:right w:type="dxa" w:w="100"/>
+            </w:tcMar>
+            <w:vAlign w:val="center"/>
+          </w:tcPr>
+          <w:p>
+            <w:pPr>
+              <w:spacing w:after="0" w:line="240"/>
+              <w:jc w:val="left"/>
+            </w:pPr>
+            <w:r>
+              <w:rPr>
+                <w:rFonts w:ascii="Times New Roman" w:cs="Times New Roman" w:eastAsia="Times New Roman" w:hAnsi="Times New Roman"/>
+                <w:b w:val="false"/>
+                <w:bCs w:val="false"/>
+                <w:color w:val="000000"/>
+                <w:sz w:val="21"/>
+                <w:szCs w:val="21"/>
+              </w:rPr>
+              <w:t xml:space="preserve">MME (perception)</w:t>
+            </w:r>
+          </w:p>
+        </w:tc>
+        <w:tc>
+          <w:tcPr>
+            <w:tcW w:type="dxa" w:w="2020"/>
+            <w:tcBorders>
+              <w:top w:val="single" w:color="000000" w:sz="6"/>
+              <w:left w:val="single" w:color="000000" w:sz="6"/>
+              <w:bottom w:val="single" w:color="000000" w:sz="6"/>
+              <w:right w:val="single" w:color="000000" w:sz="6"/>
+            </w:tcBorders>
+            <w:tcMar>
+              <w:top w:type="dxa" w:w="70"/>
+              <w:left w:type="dxa" w:w="100"/>
+              <w:bottom w:type="dxa" w:w="70"/>
+              <w:right w:type="dxa" w:w="100"/>
+            </w:tcMar>
+            <w:vAlign w:val="center"/>
+          </w:tcPr>
+          <w:p>
+            <w:pPr>
+              <w:spacing w:after="0" w:line="240"/>
+              <w:jc w:val="center"/>
+            </w:pPr>
+            <w:r>
+              <w:rPr>
+                <w:rFonts w:ascii="Times New Roman" w:cs="Times New Roman" w:eastAsia="Times New Roman" w:hAnsi="Times New Roman"/>
+                <w:b w:val="false"/>
+                <w:bCs w:val="false"/>
+                <w:color w:val="000000"/>
+                <w:sz w:val="21"/>
+                <w:szCs w:val="21"/>
+              </w:rPr>
+              <w:t xml:space="preserve">23.3</w:t>
+            </w:r>
+          </w:p>
+        </w:tc>
+        <w:tc>
+          <w:tcPr>
+            <w:tcW w:type="dxa" w:w="2272"/>
+            <w:tcBorders>
+              <w:top w:val="single" w:color="000000" w:sz="6"/>
+              <w:left w:val="single" w:color="000000" w:sz="6"/>
+              <w:bottom w:val="single" w:color="000000" w:sz="6"/>
+              <w:right w:val="single" w:color="000000" w:sz="6"/>
+            </w:tcBorders>
+            <w:tcMar>
+              <w:top w:type="dxa" w:w="70"/>
+              <w:left w:type="dxa" w:w="100"/>
+              <w:bottom w:type="dxa" w:w="70"/>
+              <w:right w:type="dxa" w:w="100"/>
+            </w:tcMar>
+            <w:vAlign w:val="center"/>
+          </w:tcPr>
+          <w:p>
+            <w:pPr>
+              <w:spacing w:after="0" w:line="240"/>
+              <w:jc w:val="center"/>
+            </w:pPr>
+            <w:r>
+              <w:rPr>
+                <w:rFonts w:ascii="Times New Roman" w:cs="Times New Roman" w:eastAsia="Times New Roman" w:hAnsi="Times New Roman"/>
+                <w:b w:val="false"/>
+                <w:bCs w:val="false"/>
+                <w:color w:val="000000"/>
+                <w:sz w:val="21"/>
+                <w:szCs w:val="21"/>
+              </w:rPr>
+              <w:t xml:space="preserve">7.5</w:t>
+            </w:r>
+          </w:p>
+        </w:tc>
+        <w:tc>
+          <w:tcPr>
+            <w:tcW w:type="dxa" w:w="2399"/>
+            <w:tcBorders>
+              <w:top w:val="single" w:color="000000" w:sz="6"/>
+              <w:left w:val="single" w:color="000000" w:sz="6"/>
+              <w:bottom w:val="single" w:color="000000" w:sz="6"/>
+              <w:right w:val="single" w:color="000000" w:sz="6"/>
+            </w:tcBorders>
+            <w:tcMar>
+              <w:top w:type="dxa" w:w="70"/>
+              <w:left w:type="dxa" w:w="100"/>
+              <w:bottom w:type="dxa" w:w="70"/>
+              <w:right w:type="dxa" w:w="100"/>
+            </w:tcMar>
+            <w:vAlign w:val="center"/>
+          </w:tcPr>
+          <w:p>
+            <w:pPr>
+              <w:spacing w:after="0" w:line="240"/>
+              <w:jc w:val="center"/>
+            </w:pPr>
+            <w:r>
+              <w:rPr>
+                <w:rFonts w:ascii="Times New Roman" w:cs="Times New Roman" w:eastAsia="Times New Roman" w:hAnsi="Times New Roman"/>
+                <w:b w:val="false"/>
+                <w:bCs w:val="false"/>
+                <w:color w:val="000000"/>
+                <w:sz w:val="21"/>
+                <w:szCs w:val="21"/>
+              </w:rPr>
+              <w:t xml:space="preserve">neither, see note</w:t>
+            </w:r>
+          </w:p>
+        </w:tc>
+      </w:tr>
+    </w:tbl>
+    <w:p>
+      <w:pPr>
+        <w:spacing w:after="45"/>
+      </w:pPr>
+      <w:r>
+        <w:rPr>
+          <w:sz w:val="2"/>
+          <w:szCs w:val="2"/>
+        </w:rPr>
+        <w:t xml:space="preserve"/>
+      </w:r>
+    </w:p>
+    <w:p>
+      <w:pPr>
+        <w:spacing w:after="140"/>
+        <w:jc w:val="center"/>
+      </w:pPr>
+      <w:r>
+        <w:rPr>
+          <w:rFonts w:ascii="Times New Roman" w:cs="Times New Roman" w:eastAsia="Times New Roman" w:hAnsi="Times New Roman"/>
+          <w:i/>
+          <w:iCs/>
+          <w:color w:val="444444"/>
+          <w:sz w:val="19"/>
+          <w:szCs w:val="19"/>
+        </w:rPr>
+        <w:t xml:space="preserve">Table 7. Points lost to each effect on Qwen2.5-VL-7B. The deletion dominates on TextVQA and DocVQA; on ChartQA the pruning itself is the larger problem. MME is scored out of roughly 2000 rather than 100, so its two figures are not comparable with the rest of the column; as a fraction of its own baseline they are 1.4 and 0.4 per cent. Where the deletion figure would be negative, meaning the released arm scored marginally higher, we give its magnitude.</w:t>
+      </w:r>
+    </w:p>
+    <w:p>
+      <w:pPr>
+        <w:spacing w:after="110" w:line="248"/>
+        <w:jc w:val="both"/>
+      </w:pPr>
+      <w:r>
+        <w:rPr>
+          <w:rFonts w:ascii="Times New Roman" w:cs="Times New Roman" w:eastAsia="Times New Roman" w:hAnsi="Times New Roman"/>
+          <w:sz w:val="24"/>
+          <w:szCs w:val="24"/>
+        </w:rPr>
+        <w:t xml:space="preserve">ChartQA is the row worth pausing on. There the deletion costs 16.4 points and the pruning costs 31.4, so the fault is not the main story on that benchmark. Any claim that the layer deletion explains the collapse holds for scene text and documents, and does not hold for charts. We had originally written the deletion as the dominant cause throughout, which this table shows to be too broad.</w:t>
       </w:r>
     </w:p>
     <w:p>
@@ -6028,7 +8941,7 @@
           <w:sz w:val="19"/>
           <w:szCs w:val="19"/>
         </w:rPr>
-        <w:t xml:space="preserve">Table 5. InternVL2-2B, graded pruning only, no deletion. Reading tasks lose roughly eight times as much as the standard suite reports.</w:t>
+        <w:t xml:space="preserve">Table 8. InternVL2-2B, graded pruning only, no deletion. Kept is the pruned score as a percentage of the corresponding baseline. Reading tasks lose roughly eight times as much as the standard suite reports.</w:t>
       </w:r>
     </w:p>
     <w:p>
@@ -6138,7 +9051,7 @@
           <w:sz w:val="24"/>
           <w:szCs w:val="24"/>
         </w:rPr>
-        <w:t xml:space="preserve">One caveat belongs with this table. Our InternVL selector implements the diversity component only; the attention component is omitted because InternLM2's FlashAttention-2 path does not expose attention scores. Attention is known to over-sample text, so these figures are an upper bound on what BTP itself would cost, not a like-for-like comparison. The direction and the asymmetry hold; the magnitude is inflated.</w:t>
+        <w:t xml:space="preserve">One caveat belongs with this table. Our InternVL selector implements the diversity component only; the attention component is omitted because InternLM2's FlashAttention-2 path does not expose attention scores. In a probe of our own, on a single image, attention-based picks landed on text 36.0 per cent of the time against a 28.8 per cent text share, which suggests attention favours text somewhat. On that basis these figures are likely an upper bound on what BTP itself would cost rather than a like-for-like comparison, though one image is not a firm result. The direction and the asymmetry hold; the magnitude may be inflated.</w:t>
       </w:r>
     </w:p>
     <w:p>
@@ -6330,7 +9243,7 @@
           <w:sz w:val="24"/>
           <w:szCs w:val="24"/>
         </w:rPr>
-        <w:t xml:space="preserve">Visual token pruning methods decide, somewhere in their code, a layer at which the model no longer needs to look at the image. That decision is usually a constant. Our measurements show the quantity behind it is real, sharp, and different in each architecture: three quarters of the way through InternVL2-2B, and a little over four fifths through Qwen2.5-VL. Nobody measures it, and the standard benchmark suite cannot detect getting it wrong, because not one of its six tasks asks the model to read.</w:t>
+        <w:t xml:space="preserve">Visual token pruning methods decide, somewhere in their code, a layer at which the model no longer needs to look at the image. That decision is usually a constant. Our measurements on two architectures indicate that this threshold can be sharp and architecture-dependent: about three quarters of the way through InternVL2-2B, and about four fifths through Qwen2.5-VL. We did not identify a study, in the literature reviewed for this report, that measures it explicitly. The benchmarks these methods are validated on did not detect it here, because not one of them asks the model to read.</w:t>
       </w:r>
     </w:p>
     <w:p>
@@ -6344,7 +9257,7 @@
           <w:sz w:val="24"/>
           <w:szCs w:val="24"/>
         </w:rPr>
-        <w:t xml:space="preserve">That is the useful lesson, and it is not about one line of code. Two practical recommendations follow.</w:t>
+        <w:t xml:space="preserve">Stated as three separate claims, at three different levels:</w:t>
       </w:r>
     </w:p>
     <w:p>
@@ -6365,7 +9278,7 @@
           <w:sz w:val="24"/>
           <w:szCs w:val="24"/>
         </w:rPr>
-        <w:t xml:space="preserve">Measure the threshold before choosing a pruning layer. </w:t>
+        <w:t xml:space="preserve">Implementation. </w:t>
       </w:r>
       <w:r>
         <w:rPr>
@@ -6373,7 +9286,108 @@
           <w:sz w:val="24"/>
           <w:szCs w:val="24"/>
         </w:rPr>
-        <w:t xml:space="preserve">The sweep is cheap. Ours took fourteen short jobs per model and needed no training, no calibration set and no changes beyond one integer.</w:t>
+        <w:t xml:space="preserve">In the released BTP code we examined, all remaining image tokens are deleted at a point that is damaging for Qwen2.5-VL, and the paper's own appendix specifies otherwise for that model.</w:t>
+      </w:r>
+    </w:p>
+    <w:p>
+      <w:pPr>
+        <w:pStyle w:val="ListParagraph"/>
+        <w:numPr>
+          <w:ilvl w:val="0"/>
+          <w:numId w:val="1"/>
+        </w:numPr>
+        <w:spacing w:after="60" w:line="264"/>
+        <w:jc w:val="left"/>
+      </w:pPr>
+      <w:r>
+        <w:rPr>
+          <w:rFonts w:ascii="Times New Roman" w:cs="Times New Roman" w:eastAsia="Times New Roman" w:hAnsi="Times New Roman"/>
+          <w:b/>
+          <w:bCs/>
+          <w:sz w:val="24"/>
+          <w:szCs w:val="24"/>
+        </w:rPr>
+        <w:t xml:space="preserve">Model. </w:t>
+      </w:r>
+      <w:r>
+        <w:rPr>
+          <w:rFonts w:ascii="Times New Roman" w:cs="Times New Roman" w:eastAsia="Times New Roman" w:hAnsi="Times New Roman"/>
+          <w:sz w:val="24"/>
+          <w:szCs w:val="24"/>
+        </w:rPr>
+        <w:t xml:space="preserve">The two models we tested show a sharp change in sensitivity to visual token access, at different decoder depths.</w:t>
+      </w:r>
+    </w:p>
+    <w:p>
+      <w:pPr>
+        <w:pStyle w:val="ListParagraph"/>
+        <w:numPr>
+          <w:ilvl w:val="0"/>
+          <w:numId w:val="1"/>
+        </w:numPr>
+        <w:spacing w:after="60" w:line="264"/>
+        <w:jc w:val="left"/>
+      </w:pPr>
+      <w:r>
+        <w:rPr>
+          <w:rFonts w:ascii="Times New Roman" w:cs="Times New Roman" w:eastAsia="Times New Roman" w:hAnsi="Times New Roman"/>
+          <w:b/>
+          <w:bCs/>
+          <w:sz w:val="24"/>
+          <w:szCs w:val="24"/>
+        </w:rPr>
+        <w:t xml:space="preserve">Evaluation. </w:t>
+      </w:r>
+      <w:r>
+        <w:rPr>
+          <w:rFonts w:ascii="Times New Roman" w:cs="Times New Roman" w:eastAsia="Times New Roman" w:hAnsi="Times New Roman"/>
+          <w:sz w:val="24"/>
+          <w:szCs w:val="24"/>
+        </w:rPr>
+        <w:t xml:space="preserve">Standard benchmark evaluation did not reveal the damage that visual token pruning does to text reading, in either the faulty case or the correct one.</w:t>
+      </w:r>
+    </w:p>
+    <w:p>
+      <w:pPr>
+        <w:spacing w:after="110" w:line="248"/>
+        <w:jc w:val="both"/>
+      </w:pPr>
+      <w:r>
+        <w:rPr>
+          <w:rFonts w:ascii="Times New Roman" w:cs="Times New Roman" w:eastAsia="Times New Roman" w:hAnsi="Times New Roman"/>
+          <w:sz w:val="24"/>
+          <w:szCs w:val="24"/>
+        </w:rPr>
+        <w:t xml:space="preserve">The third is the one that generalises furthest, and it does not depend on the first being true. Two practical recommendations follow.</w:t>
+      </w:r>
+    </w:p>
+    <w:p>
+      <w:pPr>
+        <w:pStyle w:val="ListParagraph"/>
+        <w:numPr>
+          <w:ilvl w:val="0"/>
+          <w:numId w:val="1"/>
+        </w:numPr>
+        <w:spacing w:after="60" w:line="264"/>
+        <w:jc w:val="left"/>
+      </w:pPr>
+      <w:r>
+        <w:rPr>
+          <w:rFonts w:ascii="Times New Roman" w:cs="Times New Roman" w:eastAsia="Times New Roman" w:hAnsi="Times New Roman"/>
+          <w:b/>
+          <w:bCs/>
+          <w:sz w:val="24"/>
+          <w:szCs w:val="24"/>
+        </w:rPr>
+        <w:t xml:space="preserve">Measure the threshold before choosing a pruning layer. </w:t>
+      </w:r>
+      <w:r>
+        <w:rPr>
+          <w:rFonts w:ascii="Times New Roman" w:cs="Times New Roman" w:eastAsia="Times New Roman" w:hAnsi="Times New Roman"/>
+          <w:sz w:val="24"/>
+          <w:szCs w:val="24"/>
+        </w:rPr>
+        <w:t xml:space="preserve">The sweep is cheap and the tool is written: a coarse pass plus bisection finds the threshold in about seven evaluations, using forward hooks, with no training, no calibration set and no changes to the model source.</w:t>
       </w:r>
     </w:p>
     <w:p>

</xml_diff>

<commit_message>
Phase 3: final report and deck after mentor review
Threshold described as task-specific. Shape claim scoped to two models.
Corrects the calibration point: BTP does calibrate its pruning layers from
64 samples per Section 4.3; the deletion depth is a separate uncalibrated
quantity. Conclusion split into implementation, model and evaluation
findings. Reproducibility pass fixed a stale commit id and a missing job.
</commit_message>
<xml_diff>
--- a/BTP-Reproduction/phase3-mechanism/report/BTP_Phase3_Report.docx
+++ b/BTP-Reproduction/phase3-mechanism/report/BTP_Phase3_Report.docx
@@ -16,7 +16,7 @@
           <w:sz w:val="34"/>
           <w:szCs w:val="34"/>
         </w:rPr>
-        <w:t xml:space="preserve">When can a vision language model stop looking at the image?</w:t>
+        <w:t xml:space="preserve">A Task-Specific Visual Token Access Threshold in Vision-Language Models</w:t>
       </w:r>
     </w:p>
     <w:p>
@@ -33,7 +33,7 @@
           <w:sz w:val="22"/>
           <w:szCs w:val="22"/>
         </w:rPr>
-        <w:t xml:space="preserve">Measuring the depth at which visual tokens stop mattering, and what token pruning does with that</w:t>
+        <w:t xml:space="preserve">Implications for token pruning</w:t>
       </w:r>
     </w:p>
     <w:p>
@@ -84,7 +84,7 @@
           <w:sz w:val="32"/>
           <w:szCs w:val="32"/>
         </w:rPr>
-        <w:t xml:space="preserve">1.  What we were chasing</w:t>
+        <w:t xml:space="preserve">1.  Objective and observation</w:t>
       </w:r>
     </w:p>
     <w:p>
@@ -112,7 +112,7 @@
           <w:sz w:val="24"/>
           <w:szCs w:val="24"/>
         </w:rPr>
-        <w:t xml:space="preserve">That gap is what Phase 3 set out to explain. The answer took four failed experiments to reach, and it turned out to sit in a place none of us were looking.</w:t>
+        <w:t xml:space="preserve">Phase 3 set out to explain that gap. Four experiments were run to distinguish between candidate causes. All four returned negative, and the results eventually moved the investigation from token selection to the handling of visual tokens after pruning.</w:t>
       </w:r>
     </w:p>
     <w:p>
@@ -175,7 +175,7 @@
                 <w:sz w:val="26"/>
                 <w:szCs w:val="26"/>
               </w:rPr>
-              <w:t xml:space="preserve">What we found</w:t>
+              <w:t xml:space="preserve">Summary of findings</w:t>
             </w:r>
           </w:p>
           <w:p>
@@ -189,7 +189,7 @@
                 <w:sz w:val="22"/>
                 <w:szCs w:val="22"/>
               </w:rPr>
-              <w:t xml:space="preserve">There is a depth past which deleting every visual token costs a model almost nothing, and before which it is ruinous. The change is abrupt. We measured it at 74.8 per cent of the way through InternVL2-2B and 80.3 per cent through Qwen2.5-VL-7B.</w:t>
+              <w:t xml:space="preserve">On TextVQA there is a depth beyond which deleting every visual token costs the model very little, and before which the loss is severe. The transition is abrupt. We measure it at 74.8 per cent of decoder depth in InternVL2-2B and 80.3 per cent in Qwen2.5-VL-7B. The threshold is task-specific: it is measured on one task and may sit elsewhere for others.</w:t>
             </w:r>
           </w:p>
           <w:p>
@@ -203,7 +203,7 @@
                 <w:sz w:val="22"/>
                 <w:szCs w:val="22"/>
               </w:rPr>
-              <w:t xml:space="preserve">BTP's released code deletes at a point that leaves Qwen 22 layers of image access. We measure the threshold at 22.5. One layer either side is worth about 47.7 percentage points on TextVQA.</w:t>
+              <w:t xml:space="preserve">The released BTP code deletes at a point that leaves Qwen 22 layers with image access, against a measured threshold of 22.5. Near that threshold one layer accounts for about 47.7 percentage points on TextVQA.</w:t>
             </w:r>
           </w:p>
           <w:p>
@@ -217,7 +217,7 @@
                 <w:sz w:val="22"/>
                 <w:szCs w:val="22"/>
               </w:rPr>
-              <w:t xml:space="preserve">Deletion is not the whole story. On ChartQA the ordinary pruning costs twice what the deletion does, so we keep the two apart throughout.</w:t>
+              <w:t xml:space="preserve">The deletion is not the only cost. On ChartQA the graded pruning costs roughly twice what the deletion does, so the two are reported separately throughout.</w:t>
             </w:r>
           </w:p>
           <w:p>
@@ -231,7 +231,7 @@
                 <w:sz w:val="22"/>
                 <w:szCs w:val="22"/>
               </w:rPr>
-              <w:t xml:space="preserve">None of this shows up on the benchmarks the paper reports. With the fault in place the code still scores 96.1 per cent of baseline on five of them.</w:t>
+              <w:t xml:space="preserve">Neither cost is visible on the benchmarks the paper reports. With the discrepancy present the code still retains 96.1 per cent of baseline across five of them.</w:t>
             </w:r>
           </w:p>
         </w:tc>
@@ -262,7 +262,70 @@
           <w:sz w:val="24"/>
           <w:szCs w:val="24"/>
         </w:rPr>
-        <w:t xml:space="preserve">We measured the thresholds on TextVQA only, on two models, and our InternVL pruning is not a complete reproduction of BTP. Section 6 says where that bites.</w:t>
+        <w:t xml:space="preserve">We measured the thresholds on TextVQA only, on two models, and our InternVL pruning is not a complete reproduction of BTP. Section 6 states where that matters.</w:t>
+      </w:r>
+    </w:p>
+    <w:p>
+      <w:pPr>
+        <w:spacing w:after="50" w:before="110"/>
+        <w:jc w:val="center"/>
+      </w:pPr>
+      <w:r>
+        <w:drawing>
+          <wp:inline distT="0" distB="0" distL="0" distR="0">
+            <wp:extent cx="4762500" cy="2247900"/>
+            <wp:effectExtent t="0" r="0" b="0" l="0"/>
+            <wp:docPr id="1" name="" descr="" title=""/>
+            <wp:cNvGraphicFramePr>
+              <a:graphicFrameLocks xmlns:a="http://schemas.openxmlformats.org/drawingml/2006/main" noChangeAspect="1"/>
+            </wp:cNvGraphicFramePr>
+            <a:graphic xmlns:a="http://schemas.openxmlformats.org/drawingml/2006/main">
+              <a:graphicData uri="http://schemas.openxmlformats.org/drawingml/2006/picture">
+                <pic:pic xmlns:pic="http://schemas.openxmlformats.org/drawingml/2006/picture">
+                  <pic:nvPicPr>
+                    <pic:cNvPr id="0" name="" descr=""/>
+                    <pic:cNvPicPr>
+                      <a:picLocks noChangeAspect="1" noChangeArrowheads="1"/>
+                    </pic:cNvPicPr>
+                  </pic:nvPicPr>
+                  <pic:blipFill>
+                    <a:blip r:embed="rId8" cstate="none"/>
+                    <a:srcRect/>
+                    <a:stretch>
+                      <a:fillRect/>
+                    </a:stretch>
+                  </pic:blipFill>
+                  <pic:spPr bwMode="auto">
+                    <a:xfrm>
+                      <a:off x="0" y="0"/>
+                      <a:ext cx="4762500" cy="2247900"/>
+                    </a:xfrm>
+                    <a:prstGeom prst="rect">
+                      <a:avLst/>
+                    </a:prstGeom>
+                  </pic:spPr>
+                </pic:pic>
+              </a:graphicData>
+            </a:graphic>
+          </wp:inline>
+        </w:drawing>
+      </w:r>
+    </w:p>
+    <w:p>
+      <w:pPr>
+        <w:spacing w:after="140"/>
+        <w:jc w:val="center"/>
+      </w:pPr>
+      <w:r>
+        <w:rPr>
+          <w:rFonts w:ascii="Times New Roman" w:cs="Times New Roman" w:eastAsia="Times New Roman" w:hAnsi="Times New Roman"/>
+          <w:i/>
+          <w:iCs/>
+          <w:color w:val="444444"/>
+          <w:sz w:val="19"/>
+          <w:szCs w:val="19"/>
+        </w:rPr>
+        <w:t xml:space="preserve">Figure 1. The investigation, in order. The upper row eliminated candidate causes; the control at 100 per cent retention redirected it downstream. The lower row is the work that followed from the code finding.</w:t>
       </w:r>
     </w:p>
     <w:p>
@@ -279,7 +342,7 @@
           <w:sz w:val="32"/>
           <w:szCs w:val="32"/>
         </w:rPr>
-        <w:t xml:space="preserve">2.  Four things that were not the cause</w:t>
+        <w:t xml:space="preserve">2.  Four alternative explanations tested</w:t>
       </w:r>
     </w:p>
     <w:p>
@@ -293,7 +356,7 @@
           <w:sz w:val="24"/>
           <w:szCs w:val="24"/>
         </w:rPr>
-        <w:t xml:space="preserve">We listed what could explain the collapse and tried to kill each one.</w:t>
+        <w:t xml:space="preserve">We enumerated the plausible causes and designed a test capable of eliminating each.</w:t>
       </w:r>
     </w:p>
     <w:tbl>
@@ -352,7 +415,7 @@
                 <w:sz w:val="21"/>
                 <w:szCs w:val="21"/>
               </w:rPr>
-              <w:t xml:space="preserve">What we thought</w:t>
+              <w:t xml:space="preserve">Initial hypothesis</w:t>
             </w:r>
           </w:p>
         </w:tc>
@@ -388,7 +451,7 @@
                 <w:sz w:val="21"/>
                 <w:szCs w:val="21"/>
               </w:rPr>
-              <w:t xml:space="preserve">What we did</w:t>
+              <w:t xml:space="preserve">Experimental test</w:t>
             </w:r>
           </w:p>
         </w:tc>
@@ -424,7 +487,7 @@
                 <w:sz w:val="21"/>
                 <w:szCs w:val="21"/>
               </w:rPr>
-              <w:t xml:space="preserve">What came back</w:t>
+              <w:t xml:space="preserve">Result and interpretation</w:t>
             </w:r>
           </w:p>
         </w:tc>
@@ -886,7 +949,7 @@
           <w:sz w:val="24"/>
           <w:szCs w:val="24"/>
         </w:rPr>
-        <w:t xml:space="preserve">Four unrelated interventions, one number. That should have been the clue and it was not, until we added a control at 100 per cent retention, where nothing is pruned at all. It scored 0.178. Keeping every token changed nothing, so whatever was destroying the image was happening after the pruning stages, not during them.</w:t>
+        <w:t xml:space="preserve">Four unrelated interventions produced the same number, which was itself the signal. The point became clear only after we added a control at 100 per cent retention, where nothing is pruned at all. It scored 0.178. Retaining every token changed nothing, so the loss was occurring after the pruning stages rather than during them.</w:t>
       </w:r>
     </w:p>
     <w:p>
@@ -903,7 +966,7 @@
           <w:sz w:val="32"/>
           <w:szCs w:val="32"/>
         </w:rPr>
-        <w:t xml:space="preserve">3.  The line, and what happens when you remove it</w:t>
+        <w:t xml:space="preserve">3.  The implementation discrepancy and its causal test</w:t>
       </w:r>
     </w:p>
     <w:p>
@@ -917,7 +980,7 @@
           <w:sz w:val="24"/>
           <w:szCs w:val="24"/>
         </w:rPr>
-        <w:t xml:space="preserve">We read through the released Qwen file for anything that touches the hidden-state sequence. One branch does this:</w:t>
+        <w:t xml:space="preserve">We inspected the released Qwen file for operations that alter the hidden-state sequence. One branch is responsible:</w:t>
       </w:r>
     </w:p>
     <w:p>
@@ -1063,7 +1126,7 @@
           <w:sz w:val="24"/>
           <w:szCs w:val="24"/>
         </w:rPr>
-        <w:t xml:space="preserve">System tokens and text tokens go into the concatenation. Image tokens do not. There is no </w:t>
+        <w:t xml:space="preserve">The concatenation includes system tokens and text tokens. It does not include image tokens. There is no </w:t>
       </w:r>
       <w:r>
         <w:rPr>
@@ -1079,7 +1142,7 @@
           <w:sz w:val="24"/>
           <w:szCs w:val="24"/>
         </w:rPr>
-        <w:t xml:space="preserve">, so everything that survived three stages of careful pruning is thrown away here regardless. Directly above it sits a commented-out version that would have kept some by attention score.</w:t>
+        <w:t xml:space="preserve">, so every token surviving the three pruning stages is removed at this point regardless. A commented-out variant immediately above would have retained a subset by attention score.</w:t>
       </w:r>
     </w:p>
     <w:p>
@@ -1093,7 +1156,7 @@
           <w:sz w:val="24"/>
           <w:szCs w:val="24"/>
         </w:rPr>
-        <w:t xml:space="preserve">Reading code is not evidence. We changed the one condition so the branch can never fire, left the 12.5 per cent pruning exactly as it was, and ran it again.</w:t>
+        <w:t xml:space="preserve">Code inspection alone is not evidence of cause. We disabled the single condition so the branch cannot fire, left the 12.5 per cent pruning unchanged, and re-ran the evaluation.</w:t>
       </w:r>
     </w:p>
     <w:tbl>
@@ -1603,7 +1666,7 @@
           <w:sz w:val="24"/>
           <w:szCs w:val="24"/>
         </w:rPr>
-        <w:t xml:space="preserve">One condition, and reading goes from 0.1725 to 0.7860. AI2D does not move, which matters, because it means we did not simply find a lever that lifts every score.</w:t>
+        <w:t xml:space="preserve">Changing one condition moves reading accuracy from 0.1725 to 0.7860. AI2D is unchanged, which matters: it shows the intervention is not simply a lever that raises every score.</w:t>
       </w:r>
     </w:p>
     <w:p>
@@ -1617,7 +1680,7 @@
           <w:sz w:val="24"/>
           <w:szCs w:val="24"/>
         </w:rPr>
-        <w:t xml:space="preserve">The paper is worth checking here. Appendix 7.3 specifies complete deletion for the LLaVA family. For Qwen2.5-VL it asks for the opposite: keep 12.5 per cent in the final stage, in the authors' words, to preserve model performance. The released code we looked at applies the LLaVA branch to Qwen anyway. That is a discrepancy in the released implementation. It says nothing about what the authors intended, and nothing at all about Qwen2.5-VL as a model.</w:t>
+        <w:t xml:space="preserve">The paper is worth checking here. Appendix 7.3 specifies complete deletion for the LLaVA family. For Qwen2.5-VL it asks for the opposite: keep 12.5 per cent in the final stage, in the authors' words, to preserve model performance. The released code we examined applies the LLaVA branch to Qwen regardless. We describe this as a discrepancy in the released implementation. It says nothing about what the authors intended, and nothing at all about Qwen2.5-VL as a model.</w:t>
       </w:r>
     </w:p>
     <w:p>
@@ -1634,7 +1697,7 @@
           <w:sz w:val="32"/>
           <w:szCs w:val="32"/>
         </w:rPr>
-        <w:t xml:space="preserve">4.  Is layer 23 special, or just early?</w:t>
+        <w:t xml:space="preserve">4.  Measuring a task-specific visual token access threshold</w:t>
       </w:r>
     </w:p>
     <w:p>
@@ -1648,7 +1711,7 @@
           <w:sz w:val="24"/>
           <w:szCs w:val="24"/>
         </w:rPr>
-        <w:t xml:space="preserve">Finding a bad constant is less interesting than finding out what makes it bad. So we moved the deletion across the whole decoder with the graded pruning switched off, changing nothing else, and did the same on InternVL2-2B. That model shares almost nothing with Qwen: a 24 layer InternLM2 backbone, ordinary 1D RoPE instead of M-RoPE, 448 pixel tiling instead of a merged patch grid.</w:t>
+        <w:t xml:space="preserve">A poorly chosen constant is less informative than the quantity that makes it poor. We therefore moved the deletion across the whole decoder with graded pruning disabled, changing nothing else, and repeated the procedure on InternVL2-2B. That model shares almost nothing with Qwen: a 24 layer InternLM2 backbone, ordinary 1D RoPE instead of M-RoPE, 448 pixel tiling instead of a merged patch grid.</w:t>
       </w:r>
     </w:p>
     <w:p>
@@ -1767,7 +1830,7 @@
                     </pic:cNvPicPr>
                   </pic:nvPicPr>
                   <pic:blipFill>
-                    <a:blip r:embed="rId8" cstate="none"/>
+                    <a:blip r:embed="rId9" cstate="none"/>
                     <a:srcRect/>
                     <a:stretch>
                       <a:fillRect/>
@@ -1803,7 +1866,7 @@
           <w:sz w:val="19"/>
           <w:szCs w:val="19"/>
         </w:rPr>
-        <w:t xml:space="preserve">Figure 1. Left, by layers with access. Right, by relative depth. Both models sit on a floor, then climb sharply.</w:t>
+        <w:t xml:space="preserve">Figure 2. Left, by layers with access. Right, by relative depth. Both models sit on a floor, then climb sharply.</w:t>
       </w:r>
     </w:p>
     <w:p>
@@ -1817,7 +1880,7 @@
           <w:sz w:val="24"/>
           <w:szCs w:val="24"/>
         </w:rPr>
-        <w:t xml:space="preserve">We take the threshold to be where accuracy crosses half the unpruned baseline, interpolated between the two measured layers either side. A different cutoff, say 90 per cent, moves both numbers, so treat these as a comparison between the models rather than absolutes.</w:t>
+        <w:t xml:space="preserve">We take the threshold to be where accuracy crosses half the unpruned baseline, interpolated between the two measured layers either side. The baselines for these sweeps are 0.8624 for Qwen and 0.7156 for InternVL, both TextVQA at limit 500. A different cutoff, say 90 per cent, moves both numbers, so treat these as a comparison between the models rather than absolutes.</w:t>
       </w:r>
     </w:p>
     <w:tbl>
@@ -2305,7 +2368,7 @@
           <w:sz w:val="24"/>
           <w:szCs w:val="24"/>
         </w:rPr>
-        <w:t xml:space="preserve">Two things follow. The shape is the same in both models, which makes this look like a property of the architecture rather than a quirk of one. And the depths differ, which means you cannot guess the number from the layer count.</w:t>
+        <w:t xml:space="preserve">Two observations follow. The curve has the same shape in both models. With two models that is a pattern worth testing further rather than a property of vision-language models in general. The depths differ, so the value cannot be inferred from the layer count alone.</w:t>
       </w:r>
     </w:p>
     <w:p>
@@ -2319,7 +2382,7 @@
           <w:sz w:val="24"/>
           <w:szCs w:val="24"/>
         </w:rPr>
-        <w:t xml:space="preserve">BTP's constant leaves Qwen 22 layers. We measure 22.5. At 22 layers the model keeps 27.2 per cent of baseline; at 23 it keeps 74.8. So the released value sits just under the edge, and one layer is worth roughly 47.7 percentage points.</w:t>
+        <w:t xml:space="preserve">BTP's constant leaves Qwen 22 layers. We measure 22.5. At 22 layers the model keeps 27.2 per cent of baseline; at 23 it keeps 74.8. The released value therefore sits just below the threshold, and one layer accounts for roughly 47.7 percentage points.</w:t>
       </w:r>
     </w:p>
     <w:p>
@@ -2346,7 +2409,7 @@
                     </pic:cNvPicPr>
                   </pic:nvPicPr>
                   <pic:blipFill>
-                    <a:blip r:embed="rId9" cstate="none"/>
+                    <a:blip r:embed="rId10" cstate="none"/>
                     <a:srcRect/>
                     <a:stretch>
                       <a:fillRect/>
@@ -2382,7 +2445,7 @@
           <w:sz w:val="19"/>
           <w:szCs w:val="19"/>
         </w:rPr>
-        <w:t xml:space="preserve">Figure 2. Either side of the threshold. The 47.7 comes from the unrounded scores; the rounded percentages shown differ by 47.6.</w:t>
+        <w:t xml:space="preserve">Figure 3. Either side of the threshold. The 47.7 comes from the unrounded scores; the rounded percentages shown differ by 47.6.</w:t>
       </w:r>
     </w:p>
     <w:p>
@@ -2396,7 +2459,7 @@
           <w:sz w:val="24"/>
           <w:szCs w:val="24"/>
         </w:rPr>
-        <w:t xml:space="preserve">A caveat about what this is. We measure what happens when the tokens are removed. We do not observe the model using them, so we describe sensitivity, not mechanism. Calling it the point where the model stops looking would be reading more into the curve than it contains.</w:t>
+        <w:t xml:space="preserve">One qualification about what is being measured. We observe the effect of removing the tokens, not the model's use of them, so this is a statement about sensitivity rather than mechanism. Describing it as the point where the model stops looking at the image would claim more than the curve supports.</w:t>
       </w:r>
     </w:p>
     <w:p>
@@ -2413,7 +2476,7 @@
           <w:sz w:val="32"/>
           <w:szCs w:val="32"/>
         </w:rPr>
-        <w:t xml:space="preserve">5.  Checking the measurement with a different instrument</w:t>
+        <w:t xml:space="preserve">5.  Validating the measurement with an independent instrument</w:t>
       </w:r>
     </w:p>
     <w:p>
@@ -2427,7 +2490,7 @@
           <w:sz w:val="24"/>
           <w:szCs w:val="24"/>
         </w:rPr>
-        <w:t xml:space="preserve">Both sweeps edit model source, separately for each architecture, which nobody else can reuse. So we rebuilt the measurement as a forward hook that removes the tokens during the pass and touches no source at all, then ran it on Qwen where we already knew the answer.</w:t>
+        <w:t xml:space="preserve">Both sweeps edit model source, separately for each architecture, which limits reuse. We therefore rebuilt the measurement as a forward hook that removes the tokens during the forward pass without altering any source, and ran it on Qwen, where the answer was already known.</w:t>
       </w:r>
     </w:p>
     <w:tbl>
@@ -3020,7 +3083,7 @@
           <w:sz w:val="24"/>
           <w:szCs w:val="24"/>
         </w:rPr>
-        <w:t xml:space="preserve">Same shape, a couple of points apart. That is reassuring about the measurement rather than about any particular way of making it, and we have only done the comparison on one model. The tool needs no training and no calibration set, and a coarse sweep plus bisection finds the threshold in about seven runs.</w:t>
+        <w:t xml:space="preserve">The two agree in shape and to within a few points. This supports the measurement itself rather than any particular way of making it, though the comparison has been run on one model only. The tool needs no training and no calibration set, and a coarse sweep plus bisection finds the threshold in about seven runs.</w:t>
       </w:r>
     </w:p>
     <w:p>
@@ -3034,7 +3097,7 @@
           <w:sz w:val="24"/>
           <w:szCs w:val="24"/>
         </w:rPr>
-        <w:t xml:space="preserve">One difference at the top of the curve we did not expect. InternVL comes all the way back, 101 per cent of baseline with 20 of its 24 layers. Qwen stops at 90.7 per cent even with 26 of 28. Something in Qwen still wants the image very late, for some fraction of examples. We cannot say which, or how many, from this experiment.</w:t>
+        <w:t xml:space="preserve">The two models differ at the top of the curve, which we had not anticipated. InternVL recovers fully, reaching 101 per cent of baseline with 20 of its 24 layers. Qwen plateaus at 90.7 per cent even with 26 of 28, which suggests visual information remains useful very late in its decoder for some subset of examples. This experiment does not identify that subset or its size.</w:t>
       </w:r>
     </w:p>
     <w:p>
@@ -3051,7 +3114,7 @@
           <w:sz w:val="32"/>
           <w:szCs w:val="32"/>
         </w:rPr>
-        <w:t xml:space="preserve">6.  Two costs, not one</w:t>
+        <w:t xml:space="preserve">6.  Separating pruning cost from deletion cost</w:t>
       </w:r>
     </w:p>
     <w:p>
@@ -5306,7 +5369,7 @@
           <w:sz w:val="24"/>
           <w:szCs w:val="24"/>
         </w:rPr>
-        <w:t xml:space="preserve">ChartQA is the row that stops you. There the deletion costs 16.4 points and the pruning costs 31.4, so the fault is not the main problem on that benchmark. We had been writing the deletion as the dominant cause everywhere. It is not.</w:t>
+        <w:t xml:space="preserve">ChartQA reverses the pattern. There the deletion costs 16.4 points and the pruning costs 31.4, so the discrepancy is not the dominant problem on that benchmark. An earlier version of this analysis treated the deletion as the main cause throughout, which these figures do not support.</w:t>
       </w:r>
     </w:p>
     <w:p>
@@ -5368,7 +5431,7 @@
           <w:sz w:val="28"/>
           <w:szCs w:val="28"/>
         </w:rPr>
-        <w:t xml:space="preserve">6.2  The same blind spot without any fault</w:t>
+        <w:t xml:space="preserve">6.2  The same blind spot without a discrepancy</w:t>
       </w:r>
     </w:p>
     <w:p>
@@ -5382,7 +5445,7 @@
           <w:sz w:val="24"/>
           <w:szCs w:val="24"/>
         </w:rPr>
-        <w:t xml:space="preserve">We then pruned InternVL2-2B to 12.5 per cent with no deletion at all, on an implementation where we found nothing of the kind.</w:t>
+        <w:t xml:space="preserve">We then pruned InternVL2-2B to 12.5 per cent with no deletion at all, on an implementation where we found no comparable discrepancy.</w:t>
       </w:r>
     </w:p>
     <w:tbl>
@@ -6623,7 +6686,7 @@
           <w:sz w:val="24"/>
           <w:szCs w:val="24"/>
         </w:rPr>
-        <w:t xml:space="preserve">The three reading tasks average 56.5 per cent of baseline. The three from the paper's suite that we ran here, GQA, POPE and MMBench, average 94.9. AI2D is at 97.6 but it is our control, not part of that suite. In points lost: 43.5 against 5.1, about 8.6 to one. No bug anywhere, correct pruning, and the standard benchmarks still report 95 per cent while the model has lost half its reading.</w:t>
+        <w:t xml:space="preserve">The three reading tasks average 56.5 per cent of baseline. The three from the paper's suite that we ran here, GQA, POPE and MMBench, average 94.9. AI2D is at 97.6 but it is our control, not part of that suite. In points lost: 43.5 against 5.1, about 8.6 to one. No discrepancy is present, the pruning behaves as designed, and the standard benchmarks still report 95 per cent while roughly half the reading ability has gone.</w:t>
       </w:r>
     </w:p>
     <w:p>
@@ -6656,7 +6719,7 @@
           <w:sz w:val="32"/>
           <w:szCs w:val="32"/>
         </w:rPr>
-        <w:t xml:space="preserve">7.  Where this leaves us</w:t>
+        <w:t xml:space="preserve">7.  Interpretation, limitations and next steps</w:t>
       </w:r>
     </w:p>
     <w:p>
@@ -6670,7 +6733,541 @@
           <w:sz w:val="24"/>
           <w:szCs w:val="24"/>
         </w:rPr>
-        <w:t xml:space="preserve">Three claims, at three levels, and they stand or fall separately.</w:t>
+        <w:t xml:space="preserve">Three findings, at three levels. They stand or fall separately and should not be quoted as one result.</w:t>
+      </w:r>
+    </w:p>
+    <w:tbl>
+      <w:tblPr>
+        <w:tblW w:type="dxa" w:w="9216"/>
+        <w:jc w:val="center"/>
+        <w:tblBorders>
+          <w:top w:val="single" w:color="000000" w:sz="6"/>
+          <w:left w:val="single" w:color="000000" w:sz="6"/>
+          <w:bottom w:val="single" w:color="000000" w:sz="6"/>
+          <w:right w:val="single" w:color="000000" w:sz="6"/>
+          <w:insideH w:val="single" w:color="000000" w:sz="6"/>
+          <w:insideV w:val="single" w:color="000000" w:sz="6"/>
+        </w:tblBorders>
+        <w:tblLayout w:type="fixed"/>
+      </w:tblPr>
+      <w:tblGrid>
+        <w:gridCol w:w="1975"/>
+        <w:gridCol w:w="4081"/>
+        <w:gridCol w:w="3160"/>
+      </w:tblGrid>
+      <w:tr>
+        <w:trPr>
+          <w:cantSplit/>
+          <w:tblHeader/>
+        </w:trPr>
+        <w:tc>
+          <w:tcPr>
+            <w:tcW w:type="dxa" w:w="1975"/>
+            <w:tcBorders>
+              <w:top w:val="single" w:color="000000" w:sz="6"/>
+              <w:left w:val="single" w:color="000000" w:sz="6"/>
+              <w:bottom w:val="single" w:color="000000" w:sz="6"/>
+              <w:right w:val="single" w:color="000000" w:sz="6"/>
+            </w:tcBorders>
+            <w:shd w:fill="D9E1F0" w:val="clear"/>
+            <w:tcMar>
+              <w:top w:type="dxa" w:w="70"/>
+              <w:left w:type="dxa" w:w="100"/>
+              <w:bottom w:type="dxa" w:w="70"/>
+              <w:right w:type="dxa" w:w="100"/>
+            </w:tcMar>
+            <w:vAlign w:val="center"/>
+          </w:tcPr>
+          <w:p>
+            <w:pPr>
+              <w:spacing w:after="0" w:line="240"/>
+              <w:jc w:val="left"/>
+            </w:pPr>
+            <w:r>
+              <w:rPr>
+                <w:rFonts w:ascii="Times New Roman" w:cs="Times New Roman" w:eastAsia="Times New Roman" w:hAnsi="Times New Roman"/>
+                <w:b/>
+                <w:bCs/>
+                <w:color w:val="000000"/>
+                <w:sz w:val="21"/>
+                <w:szCs w:val="21"/>
+              </w:rPr>
+              <w:t xml:space="preserve">Level</w:t>
+            </w:r>
+          </w:p>
+        </w:tc>
+        <w:tc>
+          <w:tcPr>
+            <w:tcW w:type="dxa" w:w="4081"/>
+            <w:tcBorders>
+              <w:top w:val="single" w:color="000000" w:sz="6"/>
+              <w:left w:val="single" w:color="000000" w:sz="6"/>
+              <w:bottom w:val="single" w:color="000000" w:sz="6"/>
+              <w:right w:val="single" w:color="000000" w:sz="6"/>
+            </w:tcBorders>
+            <w:shd w:fill="D9E1F0" w:val="clear"/>
+            <w:tcMar>
+              <w:top w:type="dxa" w:w="70"/>
+              <w:left w:type="dxa" w:w="100"/>
+              <w:bottom w:type="dxa" w:w="70"/>
+              <w:right w:type="dxa" w:w="100"/>
+            </w:tcMar>
+            <w:vAlign w:val="center"/>
+          </w:tcPr>
+          <w:p>
+            <w:pPr>
+              <w:spacing w:after="0" w:line="240"/>
+              <w:jc w:val="center"/>
+            </w:pPr>
+            <w:r>
+              <w:rPr>
+                <w:rFonts w:ascii="Times New Roman" w:cs="Times New Roman" w:eastAsia="Times New Roman" w:hAnsi="Times New Roman"/>
+                <w:b/>
+                <w:bCs/>
+                <w:color w:val="000000"/>
+                <w:sz w:val="21"/>
+                <w:szCs w:val="21"/>
+              </w:rPr>
+              <w:t xml:space="preserve">Finding</w:t>
+            </w:r>
+          </w:p>
+        </w:tc>
+        <w:tc>
+          <w:tcPr>
+            <w:tcW w:type="dxa" w:w="3160"/>
+            <w:tcBorders>
+              <w:top w:val="single" w:color="000000" w:sz="6"/>
+              <w:left w:val="single" w:color="000000" w:sz="6"/>
+              <w:bottom w:val="single" w:color="000000" w:sz="6"/>
+              <w:right w:val="single" w:color="000000" w:sz="6"/>
+            </w:tcBorders>
+            <w:shd w:fill="D9E1F0" w:val="clear"/>
+            <w:tcMar>
+              <w:top w:type="dxa" w:w="70"/>
+              <w:left w:type="dxa" w:w="100"/>
+              <w:bottom w:type="dxa" w:w="70"/>
+              <w:right w:type="dxa" w:w="100"/>
+            </w:tcMar>
+            <w:vAlign w:val="center"/>
+          </w:tcPr>
+          <w:p>
+            <w:pPr>
+              <w:spacing w:after="0" w:line="240"/>
+              <w:jc w:val="center"/>
+            </w:pPr>
+            <w:r>
+              <w:rPr>
+                <w:rFonts w:ascii="Times New Roman" w:cs="Times New Roman" w:eastAsia="Times New Roman" w:hAnsi="Times New Roman"/>
+                <w:b/>
+                <w:bCs/>
+                <w:color w:val="000000"/>
+                <w:sz w:val="21"/>
+                <w:szCs w:val="21"/>
+              </w:rPr>
+              <w:t xml:space="preserve">Scope</w:t>
+            </w:r>
+          </w:p>
+        </w:tc>
+      </w:tr>
+      <w:tr>
+        <w:trPr>
+          <w:cantSplit/>
+        </w:trPr>
+        <w:tc>
+          <w:tcPr>
+            <w:tcW w:type="dxa" w:w="1975"/>
+            <w:tcBorders>
+              <w:top w:val="single" w:color="000000" w:sz="6"/>
+              <w:left w:val="single" w:color="000000" w:sz="6"/>
+              <w:bottom w:val="single" w:color="000000" w:sz="6"/>
+              <w:right w:val="single" w:color="000000" w:sz="6"/>
+            </w:tcBorders>
+            <w:tcMar>
+              <w:top w:type="dxa" w:w="70"/>
+              <w:left w:type="dxa" w:w="100"/>
+              <w:bottom w:type="dxa" w:w="70"/>
+              <w:right w:type="dxa" w:w="100"/>
+            </w:tcMar>
+            <w:vAlign w:val="center"/>
+          </w:tcPr>
+          <w:p>
+            <w:pPr>
+              <w:spacing w:after="0" w:line="240"/>
+              <w:jc w:val="left"/>
+            </w:pPr>
+            <w:r>
+              <w:rPr>
+                <w:rFonts w:ascii="Times New Roman" w:cs="Times New Roman" w:eastAsia="Times New Roman" w:hAnsi="Times New Roman"/>
+                <w:color w:val="000000"/>
+                <w:sz w:val="21"/>
+                <w:szCs w:val="21"/>
+              </w:rPr>
+              <w:t xml:space="preserve">Implementation</w:t>
+            </w:r>
+          </w:p>
+        </w:tc>
+        <w:tc>
+          <w:tcPr>
+            <w:tcW w:type="dxa" w:w="4081"/>
+            <w:tcBorders>
+              <w:top w:val="single" w:color="000000" w:sz="6"/>
+              <w:left w:val="single" w:color="000000" w:sz="6"/>
+              <w:bottom w:val="single" w:color="000000" w:sz="6"/>
+              <w:right w:val="single" w:color="000000" w:sz="6"/>
+            </w:tcBorders>
+            <w:tcMar>
+              <w:top w:type="dxa" w:w="70"/>
+              <w:left w:type="dxa" w:w="100"/>
+              <w:bottom w:type="dxa" w:w="70"/>
+              <w:right w:type="dxa" w:w="100"/>
+            </w:tcMar>
+            <w:vAlign w:val="center"/>
+          </w:tcPr>
+          <w:p>
+            <w:pPr>
+              <w:spacing w:after="0" w:line="240"/>
+              <w:jc w:val="center"/>
+            </w:pPr>
+            <w:r>
+              <w:rPr>
+                <w:rFonts w:ascii="Times New Roman" w:cs="Times New Roman" w:eastAsia="Times New Roman" w:hAnsi="Times New Roman"/>
+                <w:color w:val="000000"/>
+                <w:sz w:val="21"/>
+                <w:szCs w:val="21"/>
+              </w:rPr>
+              <w:t xml:space="preserve">The released BTP code deletes all remaining image tokens just below the threshold we measured for Qwen2.5-VL, while the paper's Appendix 7.3 asks for retention on that model.</w:t>
+            </w:r>
+          </w:p>
+        </w:tc>
+        <w:tc>
+          <w:tcPr>
+            <w:tcW w:type="dxa" w:w="3160"/>
+            <w:tcBorders>
+              <w:top w:val="single" w:color="000000" w:sz="6"/>
+              <w:left w:val="single" w:color="000000" w:sz="6"/>
+              <w:bottom w:val="single" w:color="000000" w:sz="6"/>
+              <w:right w:val="single" w:color="000000" w:sz="6"/>
+            </w:tcBorders>
+            <w:tcMar>
+              <w:top w:type="dxa" w:w="70"/>
+              <w:left w:type="dxa" w:w="100"/>
+              <w:bottom w:type="dxa" w:w="70"/>
+              <w:right w:type="dxa" w:w="100"/>
+            </w:tcMar>
+            <w:vAlign w:val="center"/>
+          </w:tcPr>
+          <w:p>
+            <w:pPr>
+              <w:spacing w:after="0" w:line="240"/>
+              <w:jc w:val="center"/>
+            </w:pPr>
+            <w:r>
+              <w:rPr>
+                <w:rFonts w:ascii="Times New Roman" w:cs="Times New Roman" w:eastAsia="Times New Roman" w:hAnsi="Times New Roman"/>
+                <w:color w:val="000000"/>
+                <w:sz w:val="21"/>
+                <w:szCs w:val="21"/>
+              </w:rPr>
+              <w:t xml:space="preserve">The code at commit 9682db0. Says nothing about author intent, and nothing about Qwen2.5-VL as a model.</w:t>
+            </w:r>
+          </w:p>
+        </w:tc>
+      </w:tr>
+      <w:tr>
+        <w:trPr>
+          <w:cantSplit/>
+        </w:trPr>
+        <w:tc>
+          <w:tcPr>
+            <w:tcW w:type="dxa" w:w="1975"/>
+            <w:tcBorders>
+              <w:top w:val="single" w:color="000000" w:sz="6"/>
+              <w:left w:val="single" w:color="000000" w:sz="6"/>
+              <w:bottom w:val="single" w:color="000000" w:sz="6"/>
+              <w:right w:val="single" w:color="000000" w:sz="6"/>
+            </w:tcBorders>
+            <w:tcMar>
+              <w:top w:type="dxa" w:w="70"/>
+              <w:left w:type="dxa" w:w="100"/>
+              <w:bottom w:type="dxa" w:w="70"/>
+              <w:right w:type="dxa" w:w="100"/>
+            </w:tcMar>
+            <w:vAlign w:val="center"/>
+          </w:tcPr>
+          <w:p>
+            <w:pPr>
+              <w:spacing w:after="0" w:line="240"/>
+              <w:jc w:val="left"/>
+            </w:pPr>
+            <w:r>
+              <w:rPr>
+                <w:rFonts w:ascii="Times New Roman" w:cs="Times New Roman" w:eastAsia="Times New Roman" w:hAnsi="Times New Roman"/>
+                <w:color w:val="000000"/>
+                <w:sz w:val="21"/>
+                <w:szCs w:val="21"/>
+              </w:rPr>
+              <w:t xml:space="preserve">Model</w:t>
+            </w:r>
+          </w:p>
+        </w:tc>
+        <w:tc>
+          <w:tcPr>
+            <w:tcW w:type="dxa" w:w="4081"/>
+            <w:tcBorders>
+              <w:top w:val="single" w:color="000000" w:sz="6"/>
+              <w:left w:val="single" w:color="000000" w:sz="6"/>
+              <w:bottom w:val="single" w:color="000000" w:sz="6"/>
+              <w:right w:val="single" w:color="000000" w:sz="6"/>
+            </w:tcBorders>
+            <w:tcMar>
+              <w:top w:type="dxa" w:w="70"/>
+              <w:left w:type="dxa" w:w="100"/>
+              <w:bottom w:type="dxa" w:w="70"/>
+              <w:right w:type="dxa" w:w="100"/>
+            </w:tcMar>
+            <w:vAlign w:val="center"/>
+          </w:tcPr>
+          <w:p>
+            <w:pPr>
+              <w:spacing w:after="0" w:line="240"/>
+              <w:jc w:val="center"/>
+            </w:pPr>
+            <w:r>
+              <w:rPr>
+                <w:rFonts w:ascii="Times New Roman" w:cs="Times New Roman" w:eastAsia="Times New Roman" w:hAnsi="Times New Roman"/>
+                <w:color w:val="000000"/>
+                <w:sz w:val="21"/>
+                <w:szCs w:val="21"/>
+              </w:rPr>
+              <w:t xml:space="preserve">Visual token access has a measurable depth threshold, abrupt in both models tested, at 80.3 per cent of decoder depth in Qwen2.5-VL-7B and 74.8 per cent in InternVL2-2B.</w:t>
+            </w:r>
+          </w:p>
+        </w:tc>
+        <w:tc>
+          <w:tcPr>
+            <w:tcW w:type="dxa" w:w="3160"/>
+            <w:tcBorders>
+              <w:top w:val="single" w:color="000000" w:sz="6"/>
+              <w:left w:val="single" w:color="000000" w:sz="6"/>
+              <w:bottom w:val="single" w:color="000000" w:sz="6"/>
+              <w:right w:val="single" w:color="000000" w:sz="6"/>
+            </w:tcBorders>
+            <w:tcMar>
+              <w:top w:type="dxa" w:w="70"/>
+              <w:left w:type="dxa" w:w="100"/>
+              <w:bottom w:type="dxa" w:w="70"/>
+              <w:right w:type="dxa" w:w="100"/>
+            </w:tcMar>
+            <w:vAlign w:val="center"/>
+          </w:tcPr>
+          <w:p>
+            <w:pPr>
+              <w:spacing w:after="0" w:line="240"/>
+              <w:jc w:val="center"/>
+            </w:pPr>
+            <w:r>
+              <w:rPr>
+                <w:rFonts w:ascii="Times New Roman" w:cs="Times New Roman" w:eastAsia="Times New Roman" w:hAnsi="Times New Roman"/>
+                <w:color w:val="000000"/>
+                <w:sz w:val="21"/>
+                <w:szCs w:val="21"/>
+              </w:rPr>
+              <w:t xml:space="preserve">Two models, measured on TextVQA. Task-specific and not yet shown to hold for other tasks.</w:t>
+            </w:r>
+          </w:p>
+        </w:tc>
+      </w:tr>
+      <w:tr>
+        <w:trPr>
+          <w:cantSplit/>
+        </w:trPr>
+        <w:tc>
+          <w:tcPr>
+            <w:tcW w:type="dxa" w:w="1975"/>
+            <w:tcBorders>
+              <w:top w:val="single" w:color="000000" w:sz="6"/>
+              <w:left w:val="single" w:color="000000" w:sz="6"/>
+              <w:bottom w:val="single" w:color="000000" w:sz="6"/>
+              <w:right w:val="single" w:color="000000" w:sz="6"/>
+            </w:tcBorders>
+            <w:tcMar>
+              <w:top w:type="dxa" w:w="70"/>
+              <w:left w:type="dxa" w:w="100"/>
+              <w:bottom w:type="dxa" w:w="70"/>
+              <w:right w:type="dxa" w:w="100"/>
+            </w:tcMar>
+            <w:vAlign w:val="center"/>
+          </w:tcPr>
+          <w:p>
+            <w:pPr>
+              <w:spacing w:after="0" w:line="240"/>
+              <w:jc w:val="left"/>
+            </w:pPr>
+            <w:r>
+              <w:rPr>
+                <w:rFonts w:ascii="Times New Roman" w:cs="Times New Roman" w:eastAsia="Times New Roman" w:hAnsi="Times New Roman"/>
+                <w:color w:val="000000"/>
+                <w:sz w:val="21"/>
+                <w:szCs w:val="21"/>
+              </w:rPr>
+              <w:t xml:space="preserve">Evaluation</w:t>
+            </w:r>
+          </w:p>
+        </w:tc>
+        <w:tc>
+          <w:tcPr>
+            <w:tcW w:type="dxa" w:w="4081"/>
+            <w:tcBorders>
+              <w:top w:val="single" w:color="000000" w:sz="6"/>
+              <w:left w:val="single" w:color="000000" w:sz="6"/>
+              <w:bottom w:val="single" w:color="000000" w:sz="6"/>
+              <w:right w:val="single" w:color="000000" w:sz="6"/>
+            </w:tcBorders>
+            <w:tcMar>
+              <w:top w:type="dxa" w:w="70"/>
+              <w:left w:type="dxa" w:w="100"/>
+              <w:bottom w:type="dxa" w:w="70"/>
+              <w:right w:type="dxa" w:w="100"/>
+            </w:tcMar>
+            <w:vAlign w:val="center"/>
+          </w:tcPr>
+          <w:p>
+            <w:pPr>
+              <w:spacing w:after="0" w:line="240"/>
+              <w:jc w:val="center"/>
+            </w:pPr>
+            <w:r>
+              <w:rPr>
+                <w:rFonts w:ascii="Times New Roman" w:cs="Times New Roman" w:eastAsia="Times New Roman" w:hAnsi="Times New Roman"/>
+                <w:color w:val="000000"/>
+                <w:sz w:val="21"/>
+                <w:szCs w:val="21"/>
+              </w:rPr>
+              <w:t xml:space="preserve">The benchmark suite did not reveal the degradation in text reading, with the discrepancy present or absent.</w:t>
+            </w:r>
+          </w:p>
+        </w:tc>
+        <w:tc>
+          <w:tcPr>
+            <w:tcW w:type="dxa" w:w="3160"/>
+            <w:tcBorders>
+              <w:top w:val="single" w:color="000000" w:sz="6"/>
+              <w:left w:val="single" w:color="000000" w:sz="6"/>
+              <w:bottom w:val="single" w:color="000000" w:sz="6"/>
+              <w:right w:val="single" w:color="000000" w:sz="6"/>
+            </w:tcBorders>
+            <w:tcMar>
+              <w:top w:type="dxa" w:w="70"/>
+              <w:left w:type="dxa" w:w="100"/>
+              <w:bottom w:type="dxa" w:w="70"/>
+              <w:right w:type="dxa" w:w="100"/>
+            </w:tcMar>
+            <w:vAlign w:val="center"/>
+          </w:tcPr>
+          <w:p>
+            <w:pPr>
+              <w:spacing w:after="0" w:line="240"/>
+              <w:jc w:val="center"/>
+            </w:pPr>
+            <w:r>
+              <w:rPr>
+                <w:rFonts w:ascii="Times New Roman" w:cs="Times New Roman" w:eastAsia="Times New Roman" w:hAnsi="Times New Roman"/>
+                <w:color w:val="000000"/>
+                <w:sz w:val="21"/>
+                <w:szCs w:val="21"/>
+              </w:rPr>
+              <w:t xml:space="preserve">Five of the paper's six benchmarks, on two models. The one finding that does not depend on the other two.</w:t>
+            </w:r>
+          </w:p>
+        </w:tc>
+      </w:tr>
+    </w:tbl>
+    <w:p>
+      <w:pPr>
+        <w:spacing w:after="40"/>
+      </w:pPr>
+      <w:r>
+        <w:rPr>
+          <w:sz w:val="2"/>
+          <w:szCs w:val="2"/>
+        </w:rPr>
+        <w:t xml:space="preserve"/>
+      </w:r>
+    </w:p>
+    <w:p>
+      <w:pPr>
+        <w:spacing w:after="140"/>
+        <w:jc w:val="center"/>
+      </w:pPr>
+      <w:r>
+        <w:rPr>
+          <w:rFonts w:ascii="Times New Roman" w:cs="Times New Roman" w:eastAsia="Times New Roman" w:hAnsi="Times New Roman"/>
+          <w:i/>
+          <w:iCs/>
+          <w:color w:val="444444"/>
+          <w:sz w:val="19"/>
+          <w:szCs w:val="19"/>
+        </w:rPr>
+        <w:t xml:space="preserve">Table 7. The three findings kept separate.</w:t>
+      </w:r>
+    </w:p>
+    <w:p>
+      <w:pPr>
+        <w:spacing w:after="110" w:line="248"/>
+        <w:jc w:val="both"/>
+      </w:pPr>
+      <w:r>
+        <w:rPr>
+          <w:rFonts w:ascii="Times New Roman" w:cs="Times New Roman" w:eastAsia="Times New Roman" w:hAnsi="Times New Roman"/>
+          <w:sz w:val="24"/>
+          <w:szCs w:val="24"/>
+        </w:rPr>
+        <w:t xml:space="preserve">The evaluation finding generalises furthest and does not depend on the implementation one. On Qwen there is a discrepancy the benchmarks do not reveal. On InternVL there is no such discrepancy, and the benchmarks still do not reveal what pruning costs.</w:t>
+      </w:r>
+    </w:p>
+    <w:p>
+      <w:pPr>
+        <w:spacing w:after="110" w:line="248"/>
+        <w:jc w:val="both"/>
+      </w:pPr>
+      <w:r>
+        <w:rPr>
+          <w:rFonts w:ascii="Times New Roman" w:cs="Times New Roman" w:eastAsia="Times New Roman" w:hAnsi="Times New Roman"/>
+          <w:sz w:val="24"/>
+          <w:szCs w:val="24"/>
+        </w:rPr>
+        <w:t xml:space="preserve">The model-level result is the one we would build on. BTP does calibrate. Section 4.3 of the paper selects the three pruning layers using a fixed set of 64 samples, by locating where image-token representations shift. What we measure is a different quantity: the depth at which removing the remaining tokens entirely becomes safe. That depth does not appear to be calibrated anywhere, and in the released Qwen configuration it is a fixed value. Our two measurements differ by more than five percentage points of decoder depth, which is enough for such a value to fall on the wrong side of the threshold in one architecture while being harmless in another.</w:t>
+      </w:r>
+    </w:p>
+    <w:p>
+      <w:pPr>
+        <w:spacing w:after="110" w:line="248"/>
+        <w:jc w:val="both"/>
+      </w:pPr>
+      <w:r>
+        <w:rPr>
+          <w:rFonts w:ascii="Times New Roman" w:cs="Times New Roman" w:eastAsia="Times New Roman" w:hAnsi="Times New Roman"/>
+          <w:sz w:val="24"/>
+          <w:szCs w:val="24"/>
+        </w:rPr>
+        <w:t xml:space="preserve">The evaluation-level result is the one we would warn about. Both models lost far more on reading tasks than the standard suite reported, in one case with a discrepancy present and in the other without. A suite that contains no reading task cannot distinguish a method that preserves reading from one that destroys it.</w:t>
+      </w:r>
+    </w:p>
+    <w:p>
+      <w:pPr>
+        <w:pStyle w:val="Heading2"/>
+        <w:spacing w:after="90" w:before="170"/>
+      </w:pPr>
+      <w:r>
+        <w:rPr>
+          <w:rFonts w:ascii="Kalam" w:cs="Kalam" w:eastAsia="Kalam" w:hAnsi="Kalam"/>
+          <w:b/>
+          <w:bCs/>
+          <w:color w:val="1D6B6B"/>
+          <w:sz w:val="28"/>
+          <w:szCs w:val="28"/>
+        </w:rPr>
+        <w:t xml:space="preserve">7.1  Limitations</w:t>
       </w:r>
     </w:p>
     <w:p>
@@ -6686,20 +7283,10 @@
       <w:r>
         <w:rPr>
           <w:rFonts w:ascii="Times New Roman" w:cs="Times New Roman" w:eastAsia="Times New Roman" w:hAnsi="Times New Roman"/>
-          <w:b/>
-          <w:bCs/>
           <w:sz w:val="24"/>
           <w:szCs w:val="24"/>
         </w:rPr>
-        <w:t xml:space="preserve">Implementation. </w:t>
-      </w:r>
-      <w:r>
-        <w:rPr>
-          <w:rFonts w:ascii="Times New Roman" w:cs="Times New Roman" w:eastAsia="Times New Roman" w:hAnsi="Times New Roman"/>
-          <w:sz w:val="24"/>
-          <w:szCs w:val="24"/>
-        </w:rPr>
-        <w:t xml:space="preserve">The released BTP code we read deletes all remaining image tokens just below the threshold we measured for Qwen2.5-VL, while the paper's appendix asks for retention on that model.</w:t>
+        <w:t xml:space="preserve">Two architectures are two architectures. The shapes matched, which is not a general law.</w:t>
       </w:r>
     </w:p>
     <w:p>
@@ -6715,20 +7302,10 @@
       <w:r>
         <w:rPr>
           <w:rFonts w:ascii="Times New Roman" w:cs="Times New Roman" w:eastAsia="Times New Roman" w:hAnsi="Times New Roman"/>
-          <w:b/>
-          <w:bCs/>
           <w:sz w:val="24"/>
           <w:szCs w:val="24"/>
         </w:rPr>
-        <w:t xml:space="preserve">Model. </w:t>
-      </w:r>
-      <w:r>
-        <w:rPr>
-          <w:rFonts w:ascii="Times New Roman" w:cs="Times New Roman" w:eastAsia="Times New Roman" w:hAnsi="Times New Roman"/>
-          <w:sz w:val="24"/>
-          <w:szCs w:val="24"/>
-        </w:rPr>
-        <w:t xml:space="preserve">Visual token access has a measurable depth threshold in both models we tested, and the two differ.</w:t>
+        <w:t xml:space="preserve">The thresholds were measured on TextVQA. Given ChartQA's behaviour in Table 5, we would not assume the threshold lies in the same place for that task.</w:t>
       </w:r>
     </w:p>
     <w:p>
@@ -6744,51 +7321,10 @@
       <w:r>
         <w:rPr>
           <w:rFonts w:ascii="Times New Roman" w:cs="Times New Roman" w:eastAsia="Times New Roman" w:hAnsi="Times New Roman"/>
-          <w:b/>
-          <w:bCs/>
           <w:sz w:val="24"/>
           <w:szCs w:val="24"/>
         </w:rPr>
-        <w:t xml:space="preserve">Evaluation. </w:t>
-      </w:r>
-      <w:r>
-        <w:rPr>
-          <w:rFonts w:ascii="Times New Roman" w:cs="Times New Roman" w:eastAsia="Times New Roman" w:hAnsi="Times New Roman"/>
-          <w:sz w:val="24"/>
-          <w:szCs w:val="24"/>
-        </w:rPr>
-        <w:t xml:space="preserve">The suite we evaluated did not show the damage to text reading, with the fault or without it.</w:t>
-      </w:r>
-    </w:p>
-    <w:p>
-      <w:pPr>
-        <w:spacing w:after="110" w:line="248"/>
-        <w:jc w:val="both"/>
-      </w:pPr>
-      <w:r>
-        <w:rPr>
-          <w:rFonts w:ascii="Times New Roman" w:cs="Times New Roman" w:eastAsia="Times New Roman" w:hAnsi="Times New Roman"/>
-          <w:sz w:val="24"/>
-          <w:szCs w:val="24"/>
-        </w:rPr>
-        <w:t xml:space="preserve">The third is the one that travels furthest, and it does not need the first to be true. On Qwen there is a fault the benchmarks cannot see. On InternVL there is no fault and the benchmarks still cannot see what pruning costs.</w:t>
-      </w:r>
-    </w:p>
-    <w:p>
-      <w:pPr>
-        <w:pStyle w:val="Heading2"/>
-        <w:spacing w:after="90" w:before="170"/>
-      </w:pPr>
-      <w:r>
-        <w:rPr>
-          <w:rFonts w:ascii="Kalam" w:cs="Kalam" w:eastAsia="Kalam" w:hAnsi="Kalam"/>
-          <w:b/>
-          <w:bCs/>
-          <w:color w:val="1D6B6B"/>
-          <w:sz w:val="28"/>
-          <w:szCs w:val="28"/>
-        </w:rPr>
-        <w:t xml:space="preserve">7.1  What we would not claim</w:t>
+        <w:t xml:space="preserve">The InternVL implementation is ours, with the selector only partly built and the pruning layers transplanted from Qwen rather than calibrated.</w:t>
       </w:r>
     </w:p>
     <w:p>
@@ -6807,7 +7343,7 @@
           <w:sz w:val="24"/>
           <w:szCs w:val="24"/>
         </w:rPr>
-        <w:t xml:space="preserve">Two architectures is two architectures. The shape matched; that is not a law.</w:t>
+        <w:t xml:space="preserve">The OCR oracle ran at one budget. An unexplained slowdown ended the intended sweep, which was not resumed.</w:t>
       </w:r>
     </w:p>
     <w:p>
@@ -6826,7 +7362,7 @@
           <w:sz w:val="24"/>
           <w:szCs w:val="24"/>
         </w:rPr>
-        <w:t xml:space="preserve">The thresholds come from TextVQA. Given how ChartQA behaved in Table 5, we would not assume it sits in the same place there.</w:t>
+        <w:t xml:space="preserve">Everything here uses 500 sample subsets, matched across arms, so the comparisons hold but the absolute numbers are not the published full-dataset ones.</w:t>
       </w:r>
     </w:p>
     <w:p>
@@ -6842,63 +7378,6 @@
       <w:r>
         <w:rPr>
           <w:rFonts w:ascii="Times New Roman" w:cs="Times New Roman" w:eastAsia="Times New Roman" w:hAnsi="Times New Roman"/>
-          <w:sz w:val="24"/>
-          <w:szCs w:val="24"/>
-        </w:rPr>
-        <w:t xml:space="preserve">The InternVL implementation is ours, with the selector half built and the layers transplanted rather than calibrated.</w:t>
-      </w:r>
-    </w:p>
-    <w:p>
-      <w:pPr>
-        <w:pStyle w:val="ListParagraph"/>
-        <w:numPr>
-          <w:ilvl w:val="0"/>
-          <w:numId w:val="1"/>
-        </w:numPr>
-        <w:spacing w:after="60" w:line="264"/>
-        <w:jc w:val="left"/>
-      </w:pPr>
-      <w:r>
-        <w:rPr>
-          <w:rFonts w:ascii="Times New Roman" w:cs="Times New Roman" w:eastAsia="Times New Roman" w:hAnsi="Times New Roman"/>
-          <w:sz w:val="24"/>
-          <w:szCs w:val="24"/>
-        </w:rPr>
-        <w:t xml:space="preserve">The OCR oracle ran at one budget. An unexplained slowdown killed the sweep and we left it.</w:t>
-      </w:r>
-    </w:p>
-    <w:p>
-      <w:pPr>
-        <w:pStyle w:val="ListParagraph"/>
-        <w:numPr>
-          <w:ilvl w:val="0"/>
-          <w:numId w:val="1"/>
-        </w:numPr>
-        <w:spacing w:after="60" w:line="264"/>
-        <w:jc w:val="left"/>
-      </w:pPr>
-      <w:r>
-        <w:rPr>
-          <w:rFonts w:ascii="Times New Roman" w:cs="Times New Roman" w:eastAsia="Times New Roman" w:hAnsi="Times New Roman"/>
-          <w:sz w:val="24"/>
-          <w:szCs w:val="24"/>
-        </w:rPr>
-        <w:t xml:space="preserve">Everything here uses 500 sample subsets, matched across arms, so the comparisons hold but the absolute numbers are not the published full-dataset ones.</w:t>
-      </w:r>
-    </w:p>
-    <w:p>
-      <w:pPr>
-        <w:pStyle w:val="ListParagraph"/>
-        <w:numPr>
-          <w:ilvl w:val="0"/>
-          <w:numId w:val="1"/>
-        </w:numPr>
-        <w:spacing w:after="60" w:line="264"/>
-        <w:jc w:val="left"/>
-      </w:pPr>
-      <w:r>
-        <w:rPr>
-          <w:rFonts w:ascii="Times New Roman" w:cs="Times New Roman" w:eastAsia="Times New Roman" w:hAnsi="Times New Roman"/>
           <w:b/>
           <w:bCs/>
           <w:color w:val="8A5A00"/>
@@ -6930,7 +7409,7 @@
           <w:sz w:val="28"/>
           <w:szCs w:val="28"/>
         </w:rPr>
-        <w:t xml:space="preserve">7.2  What to do about it</w:t>
+        <w:t xml:space="preserve">7.2  Recommendations</w:t>
       </w:r>
     </w:p>
     <w:p>
@@ -6944,7 +7423,7 @@
           <w:sz w:val="24"/>
           <w:szCs w:val="24"/>
         </w:rPr>
-        <w:t xml:space="preserve">Measure the depth instead of picking it. The sweep is cheap, the tool is written and validated on one model, and it needs no training or calibration set. Seven runs gets you the number.</w:t>
+        <w:t xml:space="preserve">Measure the depth rather than selecting it. The sweep is inexpensive, the tool is written and validated on one model, and it requires no training and no calibration set. Approximately seven evaluations establish the value.</w:t>
       </w:r>
     </w:p>
     <w:p>
@@ -6958,7 +7437,7 @@
           <w:sz w:val="24"/>
           <w:szCs w:val="24"/>
         </w:rPr>
-        <w:t xml:space="preserve">And put one reading benchmark in the evaluation. Not because reading matters more than reasoning, but because it breaks first when visual evidence goes missing.</w:t>
+        <w:t xml:space="preserve">Include at least one reading benchmark in the evaluation. Not because reading matters more than reasoning, but because it degrades first when visual evidence is removed, which makes it the more informative early indicator.</w:t>
       </w:r>
     </w:p>
     <w:p>
@@ -6972,7 +7451,7 @@
           <w:sz w:val="24"/>
           <w:szCs w:val="24"/>
         </w:rPr>
-        <w:t xml:space="preserve">Next for us: thresholds on DocVQA and ChartQA, ChartQA first since pruning already costs more there than deletion does, then a third architecture, then the manuscript.</w:t>
+        <w:t xml:space="preserve">Next: thresholds on DocVQA and ChartQA, taking ChartQA first since pruning already costs more there than the deletion does, then a third architecture, then the manuscript.</w:t>
       </w:r>
     </w:p>
     <w:p>
@@ -6989,7 +7468,7 @@
           <w:sz w:val="28"/>
           <w:szCs w:val="28"/>
         </w:rPr>
-        <w:t xml:space="preserve">7.3  Where to check any of this</w:t>
+        <w:t xml:space="preserve">7.3  Reproducibility</w:t>
       </w:r>
     </w:p>
     <w:tbl>
@@ -7047,7 +7526,7 @@
                 <w:sz w:val="21"/>
                 <w:szCs w:val="21"/>
               </w:rPr>
-              <w:t xml:space="preserve"/>
+              <w:t xml:space="preserve">Artefact</w:t>
             </w:r>
           </w:p>
         </w:tc>
@@ -7083,7 +7562,7 @@
                 <w:sz w:val="21"/>
                 <w:szCs w:val="21"/>
               </w:rPr>
-              <w:t xml:space="preserve"/>
+              <w:t xml:space="preserve">Location</w:t>
             </w:r>
           </w:p>
         </w:tc>
@@ -7367,7 +7846,7 @@
                 <w:sz w:val="21"/>
                 <w:szCs w:val="21"/>
               </w:rPr>
-              <w:t xml:space="preserve">report/make_depth_figures.py and report/build_report.js, so every number comes out of a script</w:t>
+              <w:t xml:space="preserve">report/make_depth_figures.py, make_workflow_figure.py and build_report.js, so every number comes out of a script</w:t>
             </w:r>
           </w:p>
         </w:tc>
@@ -7438,7 +7917,7 @@
                 <w:sz w:val="21"/>
                 <w:szCs w:val="21"/>
               </w:rPr>
-              <w:t xml:space="preserve">milab-iitj-dev/btp-reproduction, not public yet, local commit 139af1c</w:t>
+              <w:t xml:space="preserve">github.com/milab-iitj-dev/btp-reproduction, commit 9214e75</w:t>
             </w:r>
           </w:p>
         </w:tc>
@@ -7509,7 +7988,7 @@
                 <w:sz w:val="21"/>
                 <w:szCs w:val="21"/>
               </w:rPr>
-              <w:t xml:space="preserve">411681, 412401, 414662, 416734-5, 416896-904, 417968, 418974-419012, 421205-421237</w:t>
+              <w:t xml:space="preserve">411681, 412401, 414662, 416734-5, 416896-904, 417968, 418974-419012, 421205-421237, 423959</w:t>
             </w:r>
           </w:p>
         </w:tc>
@@ -7586,6 +8065,35 @@
         </w:tc>
       </w:tr>
     </w:tbl>
+    <w:p>
+      <w:pPr>
+        <w:spacing w:after="40"/>
+      </w:pPr>
+      <w:r>
+        <w:rPr>
+          <w:sz w:val="2"/>
+          <w:szCs w:val="2"/>
+        </w:rPr>
+        <w:t xml:space="preserve"/>
+      </w:r>
+    </w:p>
+    <w:p>
+      <w:pPr>
+        <w:spacing w:after="140"/>
+        <w:jc w:val="center"/>
+      </w:pPr>
+      <w:r>
+        <w:rPr>
+          <w:rFonts w:ascii="Times New Roman" w:cs="Times New Roman" w:eastAsia="Times New Roman" w:hAnsi="Times New Roman"/>
+          <w:i/>
+          <w:iCs/>
+          <w:color w:val="444444"/>
+          <w:sz w:val="19"/>
+          <w:szCs w:val="19"/>
+        </w:rPr>
+        <w:t xml:space="preserve">Table 8. Where each part of the work can be checked.</w:t>
+      </w:r>
+    </w:p>
     <w:sectPr>
       <w:footerReference w:type="default" r:id="rId7"/>
       <w:pgSz w:w="11906" w:h="16838" w:orient="portrait"/>

</xml_diff>